<commit_message>
db(phase1): Development 공지 dev_notes 추가, 문의 폼 변경 반영 (34개 테이블)
- dev_notes: 메인 페이지 Development 공지 (관리자만 작성, SQLAdmin /admin)
- inquiries.name NULL 허용, privacy_agreed_at 추가
- 기존 DB용 변경 SQL: studionx/db/migrations/2026-10-02_contact_devnotes.sql (미실행)
- ERD·DB 가이드(md·docx) 갱신, DB.md에 남아 있던 옛 테이블 목록 삭제
- PRD 01 FR-111·112 수정, FR-114·115 추가 / 구현 계획 P1-21 추가

Co-Authored-By: Claude Opus 5.5 <noreply@anthropic.com>
</commit_message>
<xml_diff>
--- a/studionx/db/docs/StudioNx_DB_Guide.docx
+++ b/studionx/db/docs/StudioNx_DB_Guide.docx
@@ -314,7 +314,7 @@
                 <w:sz w:val="18"/>
                 <w:szCs w:val="18"/>
               </w:rPr>
-              <w:t xml:space="preserve">33개</w:t>
+              <w:t xml:space="preserve">34개</w:t>
             </w:r>
           </w:p>
         </w:tc>
@@ -977,7 +977,7 @@
                 <w:sz w:val="18"/>
                 <w:szCs w:val="18"/>
               </w:rPr>
-              <w:t xml:space="preserve">회원, 문의, 프로젝트, 프로젝트 멤버</w:t>
+              <w:t xml:space="preserve">회원, 문의, Development 공지, 프로젝트, 프로젝트 멤버</w:t>
             </w:r>
           </w:p>
         </w:tc>
@@ -1004,7 +1004,7 @@
                 <w:sz w:val="18"/>
                 <w:szCs w:val="18"/>
               </w:rPr>
-              <w:t xml:space="preserve">4</w:t>
+              <w:t xml:space="preserve">5</w:t>
             </w:r>
           </w:p>
         </w:tc>
@@ -1936,7 +1936,7 @@
         <w:rPr>
           <w:rFonts w:ascii="Malgun Gothic" w:cs="Malgun Gothic" w:eastAsia="Malgun Gothic" w:hAnsi="Malgun Gothic"/>
         </w:rPr>
-        <w:t xml:space="preserve">작성 시 확인한 것: 33개 테이블 중복 없음, 모든 외래키 대상이 먼저 생성됨, MySQL 문법 파싱 통과. (실제 DB 실행 검증은 아직 안 함)</w:t>
+        <w:t xml:space="preserve">작성 시 확인한 것: 34개 테이블 중복 없음, 모든 외래키 대상이 먼저 생성됨, MySQL 문법 파싱 통과. (실제 DB 실행 검증은 아직 안 함)</w:t>
       </w:r>
     </w:p>
     <w:p>
@@ -2206,7 +2206,7 @@
           <w:sz w:val="17"/>
           <w:szCs w:val="17"/>
         </w:rPr>
-        <w:t xml:space="preserve">-- 테이블 수 (전부 실행했다면 33)</w:t>
+        <w:t xml:space="preserve">-- 테이블 수 (전부 실행했다면 34)</w:t>
       </w:r>
     </w:p>
     <w:p>
@@ -2410,9 +2410,9 @@
         <w:tblLayout w:type="fixed"/>
       </w:tblPr>
       <w:tblGrid>
-        <w:gridCol w:w="1902"/>
-        <w:gridCol w:w="3804"/>
-        <w:gridCol w:w="3932"/>
+        <w:gridCol w:w="1816"/>
+        <w:gridCol w:w="4640"/>
+        <w:gridCol w:w="3182"/>
       </w:tblGrid>
       <w:tr>
         <w:trPr>
@@ -2421,7 +2421,7 @@
         </w:trPr>
         <w:tc>
           <w:tcPr>
-            <w:tcW w:type="dxa" w:w="1902"/>
+            <w:tcW w:type="dxa" w:w="1816"/>
             <w:tcBorders>
               <w:top w:val="single" w:color="BBBBBB" w:sz="4"/>
               <w:left w:val="single" w:color="BBBBBB" w:sz="4"/>
@@ -2451,7 +2451,7 @@
         </w:tc>
         <w:tc>
           <w:tcPr>
-            <w:tcW w:type="dxa" w:w="3804"/>
+            <w:tcW w:type="dxa" w:w="4640"/>
             <w:tcBorders>
               <w:top w:val="single" w:color="BBBBBB" w:sz="4"/>
               <w:left w:val="single" w:color="BBBBBB" w:sz="4"/>
@@ -2481,7 +2481,7 @@
         </w:tc>
         <w:tc>
           <w:tcPr>
-            <w:tcW w:type="dxa" w:w="3932"/>
+            <w:tcW w:type="dxa" w:w="3182"/>
             <w:tcBorders>
               <w:top w:val="single" w:color="BBBBBB" w:sz="4"/>
               <w:left w:val="single" w:color="BBBBBB" w:sz="4"/>
@@ -2517,7 +2517,7 @@
         </w:trPr>
         <w:tc>
           <w:tcPr>
-            <w:tcW w:type="dxa" w:w="1902"/>
+            <w:tcW w:type="dxa" w:w="1816"/>
             <w:tcBorders>
               <w:top w:val="single" w:color="BBBBBB" w:sz="4"/>
               <w:left w:val="single" w:color="BBBBBB" w:sz="4"/>
@@ -2545,7 +2545,7 @@
         </w:tc>
         <w:tc>
           <w:tcPr>
-            <w:tcW w:type="dxa" w:w="3804"/>
+            <w:tcW w:type="dxa" w:w="4640"/>
             <w:tcBorders>
               <w:top w:val="single" w:color="BBBBBB" w:sz="4"/>
               <w:left w:val="single" w:color="BBBBBB" w:sz="4"/>
@@ -2572,7 +2572,7 @@
         </w:tc>
         <w:tc>
           <w:tcPr>
-            <w:tcW w:type="dxa" w:w="3932"/>
+            <w:tcW w:type="dxa" w:w="3182"/>
             <w:tcBorders>
               <w:top w:val="single" w:color="BBBBBB" w:sz="4"/>
               <w:left w:val="single" w:color="BBBBBB" w:sz="4"/>
@@ -2605,7 +2605,7 @@
         </w:trPr>
         <w:tc>
           <w:tcPr>
-            <w:tcW w:type="dxa" w:w="1902"/>
+            <w:tcW w:type="dxa" w:w="1816"/>
             <w:tcBorders>
               <w:top w:val="single" w:color="BBBBBB" w:sz="4"/>
               <w:left w:val="single" w:color="BBBBBB" w:sz="4"/>
@@ -2633,34 +2633,34 @@
         </w:tc>
         <w:tc>
           <w:tcPr>
-            <w:tcW w:type="dxa" w:w="3804"/>
-            <w:tcBorders>
-              <w:top w:val="single" w:color="BBBBBB" w:sz="4"/>
-              <w:left w:val="single" w:color="BBBBBB" w:sz="4"/>
-              <w:bottom w:val="single" w:color="BBBBBB" w:sz="4"/>
-              <w:right w:val="single" w:color="BBBBBB" w:sz="4"/>
-            </w:tcBorders>
-            <w:tcMar>
-              <w:top w:type="dxa" w:w="50"/>
-              <w:left w:type="dxa" w:w="90"/>
-              <w:bottom w:type="dxa" w:w="50"/>
-              <w:right w:type="dxa" w:w="90"/>
-            </w:tcMar>
-          </w:tcPr>
-          <w:p>
-            <w:r>
-              <w:rPr>
-                <w:rFonts w:ascii="Malgun Gothic" w:cs="Malgun Gothic" w:eastAsia="Malgun Gothic" w:hAnsi="Malgun Gothic"/>
-                <w:sz w:val="18"/>
-                <w:szCs w:val="18"/>
-              </w:rPr>
-              <w:t xml:space="preserve">홈 화면 문의</w:t>
-            </w:r>
-          </w:p>
-        </w:tc>
-        <w:tc>
-          <w:tcPr>
-            <w:tcW w:type="dxa" w:w="3932"/>
+            <w:tcW w:type="dxa" w:w="4640"/>
+            <w:tcBorders>
+              <w:top w:val="single" w:color="BBBBBB" w:sz="4"/>
+              <w:left w:val="single" w:color="BBBBBB" w:sz="4"/>
+              <w:bottom w:val="single" w:color="BBBBBB" w:sz="4"/>
+              <w:right w:val="single" w:color="BBBBBB" w:sz="4"/>
+            </w:tcBorders>
+            <w:tcMar>
+              <w:top w:type="dxa" w:w="50"/>
+              <w:left w:type="dxa" w:w="90"/>
+              <w:bottom w:type="dxa" w:w="50"/>
+              <w:right w:type="dxa" w:w="90"/>
+            </w:tcMar>
+          </w:tcPr>
+          <w:p>
+            <w:r>
+              <w:rPr>
+                <w:rFonts w:ascii="Malgun Gothic" w:cs="Malgun Gothic" w:eastAsia="Malgun Gothic" w:hAnsi="Malgun Gothic"/>
+                <w:sz w:val="18"/>
+                <w:szCs w:val="18"/>
+              </w:rPr>
+              <w:t xml:space="preserve">홈 화면 문의 (이름 선택, 개인정보 동의 시각 필수)</w:t>
+            </w:r>
+          </w:p>
+        </w:tc>
+        <w:tc>
+          <w:tcPr>
+            <w:tcW w:type="dxa" w:w="3182"/>
             <w:tcBorders>
               <w:top w:val="single" w:color="BBBBBB" w:sz="4"/>
               <w:left w:val="single" w:color="BBBBBB" w:sz="4"/>
@@ -2693,7 +2693,7 @@
         </w:trPr>
         <w:tc>
           <w:tcPr>
-            <w:tcW w:type="dxa" w:w="1902"/>
+            <w:tcW w:type="dxa" w:w="1816"/>
             <w:tcBorders>
               <w:top w:val="single" w:color="BBBBBB" w:sz="4"/>
               <w:left w:val="single" w:color="BBBBBB" w:sz="4"/>
@@ -2715,61 +2715,61 @@
                 <w:sz w:val="18"/>
                 <w:szCs w:val="18"/>
               </w:rPr>
-              <w:t xml:space="preserve">projects</w:t>
-            </w:r>
-          </w:p>
-        </w:tc>
-        <w:tc>
-          <w:tcPr>
-            <w:tcW w:type="dxa" w:w="3804"/>
-            <w:tcBorders>
-              <w:top w:val="single" w:color="BBBBBB" w:sz="4"/>
-              <w:left w:val="single" w:color="BBBBBB" w:sz="4"/>
-              <w:bottom w:val="single" w:color="BBBBBB" w:sz="4"/>
-              <w:right w:val="single" w:color="BBBBBB" w:sz="4"/>
-            </w:tcBorders>
-            <w:tcMar>
-              <w:top w:type="dxa" w:w="50"/>
-              <w:left w:type="dxa" w:w="90"/>
-              <w:bottom w:type="dxa" w:w="50"/>
-              <w:right w:type="dxa" w:w="90"/>
-            </w:tcMar>
-          </w:tcPr>
-          <w:p>
-            <w:r>
-              <w:rPr>
-                <w:rFonts w:ascii="Malgun Gothic" w:cs="Malgun Gothic" w:eastAsia="Malgun Gothic" w:hAnsi="Malgun Gothic"/>
-                <w:sz w:val="18"/>
-                <w:szCs w:val="18"/>
-              </w:rPr>
-              <w:t xml:space="preserve">시퀀서 프로젝트</w:t>
-            </w:r>
-          </w:p>
-        </w:tc>
-        <w:tc>
-          <w:tcPr>
-            <w:tcW w:type="dxa" w:w="3932"/>
-            <w:tcBorders>
-              <w:top w:val="single" w:color="BBBBBB" w:sz="4"/>
-              <w:left w:val="single" w:color="BBBBBB" w:sz="4"/>
-              <w:bottom w:val="single" w:color="BBBBBB" w:sz="4"/>
-              <w:right w:val="single" w:color="BBBBBB" w:sz="4"/>
-            </w:tcBorders>
-            <w:tcMar>
-              <w:top w:type="dxa" w:w="50"/>
-              <w:left w:type="dxa" w:w="90"/>
-              <w:bottom w:type="dxa" w:w="50"/>
-              <w:right w:type="dxa" w:w="90"/>
-            </w:tcMar>
-          </w:tcPr>
-          <w:p>
-            <w:r>
-              <w:rPr>
-                <w:rFonts w:ascii="Malgun Gothic" w:cs="Malgun Gothic" w:eastAsia="Malgun Gothic" w:hAnsi="Malgun Gothic"/>
-                <w:sz w:val="18"/>
-                <w:szCs w:val="18"/>
-              </w:rPr>
-              <w:t xml:space="preserve">FK owner_id, template_id</w:t>
+              <w:t xml:space="preserve">dev_notes</w:t>
+            </w:r>
+          </w:p>
+        </w:tc>
+        <w:tc>
+          <w:tcPr>
+            <w:tcW w:type="dxa" w:w="4640"/>
+            <w:tcBorders>
+              <w:top w:val="single" w:color="BBBBBB" w:sz="4"/>
+              <w:left w:val="single" w:color="BBBBBB" w:sz="4"/>
+              <w:bottom w:val="single" w:color="BBBBBB" w:sz="4"/>
+              <w:right w:val="single" w:color="BBBBBB" w:sz="4"/>
+            </w:tcBorders>
+            <w:tcMar>
+              <w:top w:type="dxa" w:w="50"/>
+              <w:left w:type="dxa" w:w="90"/>
+              <w:bottom w:type="dxa" w:w="50"/>
+              <w:right w:type="dxa" w:w="90"/>
+            </w:tcMar>
+          </w:tcPr>
+          <w:p>
+            <w:r>
+              <w:rPr>
+                <w:rFonts w:ascii="Malgun Gothic" w:cs="Malgun Gothic" w:eastAsia="Malgun Gothic" w:hAnsi="Malgun Gothic"/>
+                <w:sz w:val="18"/>
+                <w:szCs w:val="18"/>
+              </w:rPr>
+              <w:t xml:space="preserve">메인 페이지 Development 공지 (관리자만 작성)</w:t>
+            </w:r>
+          </w:p>
+        </w:tc>
+        <w:tc>
+          <w:tcPr>
+            <w:tcW w:type="dxa" w:w="3182"/>
+            <w:tcBorders>
+              <w:top w:val="single" w:color="BBBBBB" w:sz="4"/>
+              <w:left w:val="single" w:color="BBBBBB" w:sz="4"/>
+              <w:bottom w:val="single" w:color="BBBBBB" w:sz="4"/>
+              <w:right w:val="single" w:color="BBBBBB" w:sz="4"/>
+            </w:tcBorders>
+            <w:tcMar>
+              <w:top w:type="dxa" w:w="50"/>
+              <w:left w:type="dxa" w:w="90"/>
+              <w:bottom w:type="dxa" w:w="50"/>
+              <w:right w:type="dxa" w:w="90"/>
+            </w:tcMar>
+          </w:tcPr>
+          <w:p>
+            <w:r>
+              <w:rPr>
+                <w:rFonts w:ascii="Malgun Gothic" w:cs="Malgun Gothic" w:eastAsia="Malgun Gothic" w:hAnsi="Malgun Gothic"/>
+                <w:sz w:val="18"/>
+                <w:szCs w:val="18"/>
+              </w:rPr>
+              <w:t xml:space="preserve">FK author_id</w:t>
             </w:r>
           </w:p>
         </w:tc>
@@ -2781,7 +2781,7 @@
         </w:trPr>
         <w:tc>
           <w:tcPr>
-            <w:tcW w:type="dxa" w:w="1902"/>
+            <w:tcW w:type="dxa" w:w="1816"/>
             <w:tcBorders>
               <w:top w:val="single" w:color="BBBBBB" w:sz="4"/>
               <w:left w:val="single" w:color="BBBBBB" w:sz="4"/>
@@ -2803,13 +2803,101 @@
                 <w:sz w:val="18"/>
                 <w:szCs w:val="18"/>
               </w:rPr>
+              <w:t xml:space="preserve">projects</w:t>
+            </w:r>
+          </w:p>
+        </w:tc>
+        <w:tc>
+          <w:tcPr>
+            <w:tcW w:type="dxa" w:w="4640"/>
+            <w:tcBorders>
+              <w:top w:val="single" w:color="BBBBBB" w:sz="4"/>
+              <w:left w:val="single" w:color="BBBBBB" w:sz="4"/>
+              <w:bottom w:val="single" w:color="BBBBBB" w:sz="4"/>
+              <w:right w:val="single" w:color="BBBBBB" w:sz="4"/>
+            </w:tcBorders>
+            <w:tcMar>
+              <w:top w:type="dxa" w:w="50"/>
+              <w:left w:type="dxa" w:w="90"/>
+              <w:bottom w:type="dxa" w:w="50"/>
+              <w:right w:type="dxa" w:w="90"/>
+            </w:tcMar>
+          </w:tcPr>
+          <w:p>
+            <w:r>
+              <w:rPr>
+                <w:rFonts w:ascii="Malgun Gothic" w:cs="Malgun Gothic" w:eastAsia="Malgun Gothic" w:hAnsi="Malgun Gothic"/>
+                <w:sz w:val="18"/>
+                <w:szCs w:val="18"/>
+              </w:rPr>
+              <w:t xml:space="preserve">시퀀서 프로젝트</w:t>
+            </w:r>
+          </w:p>
+        </w:tc>
+        <w:tc>
+          <w:tcPr>
+            <w:tcW w:type="dxa" w:w="3182"/>
+            <w:tcBorders>
+              <w:top w:val="single" w:color="BBBBBB" w:sz="4"/>
+              <w:left w:val="single" w:color="BBBBBB" w:sz="4"/>
+              <w:bottom w:val="single" w:color="BBBBBB" w:sz="4"/>
+              <w:right w:val="single" w:color="BBBBBB" w:sz="4"/>
+            </w:tcBorders>
+            <w:tcMar>
+              <w:top w:type="dxa" w:w="50"/>
+              <w:left w:type="dxa" w:w="90"/>
+              <w:bottom w:type="dxa" w:w="50"/>
+              <w:right w:type="dxa" w:w="90"/>
+            </w:tcMar>
+          </w:tcPr>
+          <w:p>
+            <w:r>
+              <w:rPr>
+                <w:rFonts w:ascii="Malgun Gothic" w:cs="Malgun Gothic" w:eastAsia="Malgun Gothic" w:hAnsi="Malgun Gothic"/>
+                <w:sz w:val="18"/>
+                <w:szCs w:val="18"/>
+              </w:rPr>
+              <w:t xml:space="preserve">FK owner_id, template_id</w:t>
+            </w:r>
+          </w:p>
+        </w:tc>
+      </w:tr>
+      <w:tr>
+        <w:trPr>
+          <w:cantSplit/>
+          <w:tblHeader w:val="off"/>
+        </w:trPr>
+        <w:tc>
+          <w:tcPr>
+            <w:tcW w:type="dxa" w:w="1816"/>
+            <w:tcBorders>
+              <w:top w:val="single" w:color="BBBBBB" w:sz="4"/>
+              <w:left w:val="single" w:color="BBBBBB" w:sz="4"/>
+              <w:bottom w:val="single" w:color="BBBBBB" w:sz="4"/>
+              <w:right w:val="single" w:color="BBBBBB" w:sz="4"/>
+            </w:tcBorders>
+            <w:tcMar>
+              <w:top w:type="dxa" w:w="50"/>
+              <w:left w:type="dxa" w:w="90"/>
+              <w:bottom w:type="dxa" w:w="50"/>
+              <w:right w:type="dxa" w:w="90"/>
+            </w:tcMar>
+          </w:tcPr>
+          <w:p>
+            <w:r>
+              <w:rPr>
+                <w:rFonts w:ascii="Consolas" w:cs="Consolas" w:eastAsia="Consolas" w:hAnsi="Consolas"/>
+                <w:color w:val="B4235A"/>
+                <w:sz w:val="18"/>
+                <w:szCs w:val="18"/>
+              </w:rPr>
               <w:t xml:space="preserve">project_members</w:t>
             </w:r>
           </w:p>
         </w:tc>
         <w:tc>
           <w:tcPr>
-            <w:tcW w:type="dxa" w:w="3804"/>
+            <w:tcW w:type="dxa" w:w="4640"/>
             <w:tcBorders>
               <w:top w:val="single" w:color="BBBBBB" w:sz="4"/>
               <w:left w:val="single" w:color="BBBBBB" w:sz="4"/>
@@ -2836,7 +2924,7 @@
         </w:tc>
         <w:tc>
           <w:tcPr>
-            <w:tcW w:type="dxa" w:w="3932"/>
+            <w:tcW w:type="dxa" w:w="3182"/>
             <w:tcBorders>
               <w:top w:val="single" w:color="BBBBBB" w:sz="4"/>
               <w:left w:val="single" w:color="BBBBBB" w:sz="4"/>
@@ -7209,6 +7297,268 @@
         </w:rPr>
         <w:t xml:space="preserve">)로 작성합니다. 운영 단계에서는 Alembic 같은 마이그레이션 도구 도입을 검토합니다.</w:t>
       </w:r>
+    </w:p>
+    <w:p>
+      <w:pPr>
+        <w:pStyle w:val="Heading2"/>
+      </w:pPr>
+      <w:r>
+        <w:rPr>
+          <w:rFonts w:ascii="Malgun Gothic" w:cs="Malgun Gothic" w:eastAsia="Malgun Gothic" w:hAnsi="Malgun Gothic"/>
+        </w:rPr>
+        <w:t xml:space="preserve">6.1 변경 기록 (migrations)</w:t>
+      </w:r>
+    </w:p>
+    <w:tbl>
+      <w:tblPr>
+        <w:tblW w:type="dxa" w:w="9638"/>
+        <w:tblBorders>
+          <w:top w:val="single" w:color="auto" w:sz="4"/>
+          <w:left w:val="single" w:color="auto" w:sz="4"/>
+          <w:bottom w:val="single" w:color="auto" w:sz="4"/>
+          <w:right w:val="single" w:color="auto" w:sz="4"/>
+          <w:insideH w:val="single" w:color="auto" w:sz="4"/>
+          <w:insideV w:val="single" w:color="auto" w:sz="4"/>
+        </w:tblBorders>
+        <w:tblLayout w:type="fixed"/>
+      </w:tblPr>
+      <w:tblGrid>
+        <w:gridCol w:w="3776"/>
+        <w:gridCol w:w="3840"/>
+        <w:gridCol w:w="2022"/>
+      </w:tblGrid>
+      <w:tr>
+        <w:trPr>
+          <w:cantSplit/>
+          <w:tblHeader/>
+        </w:trPr>
+        <w:tc>
+          <w:tcPr>
+            <w:tcW w:type="dxa" w:w="3776"/>
+            <w:tcBorders>
+              <w:top w:val="single" w:color="BBBBBB" w:sz="4"/>
+              <w:left w:val="single" w:color="BBBBBB" w:sz="4"/>
+              <w:bottom w:val="single" w:color="BBBBBB" w:sz="4"/>
+              <w:right w:val="single" w:color="BBBBBB" w:sz="4"/>
+            </w:tcBorders>
+            <w:shd w:fill="EEECFF" w:color="auto" w:val="clear"/>
+            <w:tcMar>
+              <w:top w:type="dxa" w:w="50"/>
+              <w:left w:type="dxa" w:w="90"/>
+              <w:bottom w:type="dxa" w:w="50"/>
+              <w:right w:type="dxa" w:w="90"/>
+            </w:tcMar>
+          </w:tcPr>
+          <w:p>
+            <w:r>
+              <w:rPr>
+                <w:rFonts w:ascii="Malgun Gothic" w:cs="Malgun Gothic" w:eastAsia="Malgun Gothic" w:hAnsi="Malgun Gothic"/>
+                <w:b/>
+                <w:bCs/>
+                <w:sz w:val="18"/>
+                <w:szCs w:val="18"/>
+              </w:rPr>
+              <w:t xml:space="preserve">파일</w:t>
+            </w:r>
+          </w:p>
+        </w:tc>
+        <w:tc>
+          <w:tcPr>
+            <w:tcW w:type="dxa" w:w="3840"/>
+            <w:tcBorders>
+              <w:top w:val="single" w:color="BBBBBB" w:sz="4"/>
+              <w:left w:val="single" w:color="BBBBBB" w:sz="4"/>
+              <w:bottom w:val="single" w:color="BBBBBB" w:sz="4"/>
+              <w:right w:val="single" w:color="BBBBBB" w:sz="4"/>
+            </w:tcBorders>
+            <w:shd w:fill="EEECFF" w:color="auto" w:val="clear"/>
+            <w:tcMar>
+              <w:top w:type="dxa" w:w="50"/>
+              <w:left w:type="dxa" w:w="90"/>
+              <w:bottom w:type="dxa" w:w="50"/>
+              <w:right w:type="dxa" w:w="90"/>
+            </w:tcMar>
+          </w:tcPr>
+          <w:p>
+            <w:r>
+              <w:rPr>
+                <w:rFonts w:ascii="Malgun Gothic" w:cs="Malgun Gothic" w:eastAsia="Malgun Gothic" w:hAnsi="Malgun Gothic"/>
+                <w:b/>
+                <w:bCs/>
+                <w:sz w:val="18"/>
+                <w:szCs w:val="18"/>
+              </w:rPr>
+              <w:t xml:space="preserve">내용</w:t>
+            </w:r>
+          </w:p>
+        </w:tc>
+        <w:tc>
+          <w:tcPr>
+            <w:tcW w:type="dxa" w:w="2022"/>
+            <w:tcBorders>
+              <w:top w:val="single" w:color="BBBBBB" w:sz="4"/>
+              <w:left w:val="single" w:color="BBBBBB" w:sz="4"/>
+              <w:bottom w:val="single" w:color="BBBBBB" w:sz="4"/>
+              <w:right w:val="single" w:color="BBBBBB" w:sz="4"/>
+            </w:tcBorders>
+            <w:shd w:fill="EEECFF" w:color="auto" w:val="clear"/>
+            <w:tcMar>
+              <w:top w:type="dxa" w:w="50"/>
+              <w:left w:type="dxa" w:w="90"/>
+              <w:bottom w:type="dxa" w:w="50"/>
+              <w:right w:type="dxa" w:w="90"/>
+            </w:tcMar>
+          </w:tcPr>
+          <w:p>
+            <w:r>
+              <w:rPr>
+                <w:rFonts w:ascii="Malgun Gothic" w:cs="Malgun Gothic" w:eastAsia="Malgun Gothic" w:hAnsi="Malgun Gothic"/>
+                <w:b/>
+                <w:bCs/>
+                <w:sz w:val="18"/>
+                <w:szCs w:val="18"/>
+              </w:rPr>
+              <w:t xml:space="preserve">실행 대상</w:t>
+            </w:r>
+          </w:p>
+        </w:tc>
+      </w:tr>
+      <w:tr>
+        <w:trPr>
+          <w:cantSplit/>
+          <w:tblHeader w:val="off"/>
+        </w:trPr>
+        <w:tc>
+          <w:tcPr>
+            <w:tcW w:type="dxa" w:w="3776"/>
+            <w:tcBorders>
+              <w:top w:val="single" w:color="BBBBBB" w:sz="4"/>
+              <w:left w:val="single" w:color="BBBBBB" w:sz="4"/>
+              <w:bottom w:val="single" w:color="BBBBBB" w:sz="4"/>
+              <w:right w:val="single" w:color="BBBBBB" w:sz="4"/>
+            </w:tcBorders>
+            <w:tcMar>
+              <w:top w:type="dxa" w:w="50"/>
+              <w:left w:type="dxa" w:w="90"/>
+              <w:bottom w:type="dxa" w:w="50"/>
+              <w:right w:type="dxa" w:w="90"/>
+            </w:tcMar>
+          </w:tcPr>
+          <w:p>
+            <w:r>
+              <w:rPr>
+                <w:rFonts w:ascii="Consolas" w:cs="Consolas" w:eastAsia="Consolas" w:hAnsi="Consolas"/>
+                <w:color w:val="B4235A"/>
+                <w:sz w:val="18"/>
+                <w:szCs w:val="18"/>
+              </w:rPr>
+              <w:t xml:space="preserve">migrations/2026-10-02_contact_devnotes.sql</w:t>
+            </w:r>
+          </w:p>
+        </w:tc>
+        <w:tc>
+          <w:tcPr>
+            <w:tcW w:type="dxa" w:w="3840"/>
+            <w:tcBorders>
+              <w:top w:val="single" w:color="BBBBBB" w:sz="4"/>
+              <w:left w:val="single" w:color="BBBBBB" w:sz="4"/>
+              <w:bottom w:val="single" w:color="BBBBBB" w:sz="4"/>
+              <w:right w:val="single" w:color="BBBBBB" w:sz="4"/>
+            </w:tcBorders>
+            <w:tcMar>
+              <w:top w:type="dxa" w:w="50"/>
+              <w:left w:type="dxa" w:w="90"/>
+              <w:bottom w:type="dxa" w:w="50"/>
+              <w:right w:type="dxa" w:w="90"/>
+            </w:tcMar>
+          </w:tcPr>
+          <w:p>
+            <w:r>
+              <w:rPr>
+                <w:rFonts w:ascii="Consolas" w:cs="Consolas" w:eastAsia="Consolas" w:hAnsi="Consolas"/>
+                <w:color w:val="B4235A"/>
+                <w:sz w:val="18"/>
+                <w:szCs w:val="18"/>
+              </w:rPr>
+              <w:t xml:space="preserve">inquiries.name</w:t>
+            </w:r>
+            <w:r>
+              <w:rPr>
+                <w:rFonts w:ascii="Malgun Gothic" w:cs="Malgun Gothic" w:eastAsia="Malgun Gothic" w:hAnsi="Malgun Gothic"/>
+                <w:sz w:val="18"/>
+                <w:szCs w:val="18"/>
+              </w:rPr>
+              <w:t xml:space="preserve"> NULL 허용 + </w:t>
+            </w:r>
+            <w:r>
+              <w:rPr>
+                <w:rFonts w:ascii="Consolas" w:cs="Consolas" w:eastAsia="Consolas" w:hAnsi="Consolas"/>
+                <w:color w:val="B4235A"/>
+                <w:sz w:val="18"/>
+                <w:szCs w:val="18"/>
+              </w:rPr>
+              <w:t xml:space="preserve">privacy_agreed_at</w:t>
+            </w:r>
+            <w:r>
+              <w:rPr>
+                <w:rFonts w:ascii="Malgun Gothic" w:cs="Malgun Gothic" w:eastAsia="Malgun Gothic" w:hAnsi="Malgun Gothic"/>
+                <w:sz w:val="18"/>
+                <w:szCs w:val="18"/>
+              </w:rPr>
+              <w:t xml:space="preserve"> 추가, </w:t>
+            </w:r>
+            <w:r>
+              <w:rPr>
+                <w:rFonts w:ascii="Consolas" w:cs="Consolas" w:eastAsia="Consolas" w:hAnsi="Consolas"/>
+                <w:color w:val="B4235A"/>
+                <w:sz w:val="18"/>
+                <w:szCs w:val="18"/>
+              </w:rPr>
+              <w:t xml:space="preserve">dev_notes</w:t>
+            </w:r>
+            <w:r>
+              <w:rPr>
+                <w:rFonts w:ascii="Malgun Gothic" w:cs="Malgun Gothic" w:eastAsia="Malgun Gothic" w:hAnsi="Malgun Gothic"/>
+                <w:sz w:val="18"/>
+                <w:szCs w:val="18"/>
+              </w:rPr>
+              <w:t xml:space="preserve"> 생성</w:t>
+            </w:r>
+          </w:p>
+        </w:tc>
+        <w:tc>
+          <w:tcPr>
+            <w:tcW w:type="dxa" w:w="2022"/>
+            <w:tcBorders>
+              <w:top w:val="single" w:color="BBBBBB" w:sz="4"/>
+              <w:left w:val="single" w:color="BBBBBB" w:sz="4"/>
+              <w:bottom w:val="single" w:color="BBBBBB" w:sz="4"/>
+              <w:right w:val="single" w:color="BBBBBB" w:sz="4"/>
+            </w:tcBorders>
+            <w:tcMar>
+              <w:top w:type="dxa" w:w="50"/>
+              <w:left w:type="dxa" w:w="90"/>
+              <w:bottom w:type="dxa" w:w="50"/>
+              <w:right w:type="dxa" w:w="90"/>
+            </w:tcMar>
+          </w:tcPr>
+          <w:p>
+            <w:r>
+              <w:rPr>
+                <w:rFonts w:ascii="Malgun Gothic" w:cs="Malgun Gothic" w:eastAsia="Malgun Gothic" w:hAnsi="Malgun Gothic"/>
+                <w:sz w:val="18"/>
+                <w:szCs w:val="18"/>
+              </w:rPr>
+              <w:t xml:space="preserve">2026-10-02 이전에 01~06을 실행한 DB</w:t>
+            </w:r>
+          </w:p>
+        </w:tc>
+      </w:tr>
+    </w:tbl>
+    <w:p>
+      <w:pPr>
+        <w:spacing w:after="60"/>
+      </w:pPr>
     </w:p>
     <w:sectPr>
       <w:headerReference w:type="default" r:id="rId10"/>

</xml_diff>

<commit_message>
docs(db): DB 가이드 PDF 갱신, PowerShell용 실행 명령으로 교체
- StudioNx_DB_Guide: 상태·날짜 갱신(34개 테이블 실행 완료), 변경 SQL 실행 절(§2.5) 추가, PDF 재생성
- mysql 실행 명령을 `<` 대신 `-e "source ..."`로 변경 (PowerShell 오류 대응) — 가이드, README, Git 매뉴얼, ai-notes 01
- 소프트 삭제 목록에 timeline_comments, dev_notes 추가 (DB.md, 가이드)

Co-Authored-By: Claude Opus 5.5 <noreply@anthropic.com>
</commit_message>
<xml_diff>
--- a/studionx/db/docs/StudioNx_DB_Guide.docx
+++ b/studionx/db/docs/StudioNx_DB_Guide.docx
@@ -27,8 +27,8 @@
         <w:tblLayout w:type="fixed"/>
       </w:tblPr>
       <w:tblGrid>
-        <w:gridCol w:w="1258"/>
-        <w:gridCol w:w="8380"/>
+        <w:gridCol w:w="1082"/>
+        <w:gridCol w:w="8556"/>
       </w:tblGrid>
       <w:tr>
         <w:trPr>
@@ -37,7 +37,7 @@
         </w:trPr>
         <w:tc>
           <w:tcPr>
-            <w:tcW w:type="dxa" w:w="1258"/>
+            <w:tcW w:type="dxa" w:w="1082"/>
             <w:tcBorders>
               <w:top w:val="single" w:color="BBBBBB" w:sz="4"/>
               <w:left w:val="single" w:color="BBBBBB" w:sz="4"/>
@@ -67,7 +67,7 @@
         </w:tc>
         <w:tc>
           <w:tcPr>
-            <w:tcW w:type="dxa" w:w="8380"/>
+            <w:tcW w:type="dxa" w:w="8556"/>
             <w:tcBorders>
               <w:top w:val="single" w:color="BBBBBB" w:sz="4"/>
               <w:left w:val="single" w:color="BBBBBB" w:sz="4"/>
@@ -103,7 +103,7 @@
         </w:trPr>
         <w:tc>
           <w:tcPr>
-            <w:tcW w:type="dxa" w:w="1258"/>
+            <w:tcW w:type="dxa" w:w="1082"/>
             <w:tcBorders>
               <w:top w:val="single" w:color="BBBBBB" w:sz="4"/>
               <w:left w:val="single" w:color="BBBBBB" w:sz="4"/>
@@ -130,7 +130,7 @@
         </w:tc>
         <w:tc>
           <w:tcPr>
-            <w:tcW w:type="dxa" w:w="8380"/>
+            <w:tcW w:type="dxa" w:w="8556"/>
             <w:tcBorders>
               <w:top w:val="single" w:color="BBBBBB" w:sz="4"/>
               <w:left w:val="single" w:color="BBBBBB" w:sz="4"/>
@@ -163,7 +163,7 @@
         </w:trPr>
         <w:tc>
           <w:tcPr>
-            <w:tcW w:type="dxa" w:w="1258"/>
+            <w:tcW w:type="dxa" w:w="1082"/>
             <w:tcBorders>
               <w:top w:val="single" w:color="BBBBBB" w:sz="4"/>
               <w:left w:val="single" w:color="BBBBBB" w:sz="4"/>
@@ -190,7 +190,7 @@
         </w:tc>
         <w:tc>
           <w:tcPr>
-            <w:tcW w:type="dxa" w:w="8380"/>
+            <w:tcW w:type="dxa" w:w="8556"/>
             <w:tcBorders>
               <w:top w:val="single" w:color="BBBBBB" w:sz="4"/>
               <w:left w:val="single" w:color="BBBBBB" w:sz="4"/>
@@ -266,7 +266,7 @@
         </w:trPr>
         <w:tc>
           <w:tcPr>
-            <w:tcW w:type="dxa" w:w="1258"/>
+            <w:tcW w:type="dxa" w:w="1082"/>
             <w:tcBorders>
               <w:top w:val="single" w:color="BBBBBB" w:sz="4"/>
               <w:left w:val="single" w:color="BBBBBB" w:sz="4"/>
@@ -293,7 +293,7 @@
         </w:tc>
         <w:tc>
           <w:tcPr>
-            <w:tcW w:type="dxa" w:w="8380"/>
+            <w:tcW w:type="dxa" w:w="8556"/>
             <w:tcBorders>
               <w:top w:val="single" w:color="BBBBBB" w:sz="4"/>
               <w:left w:val="single" w:color="BBBBBB" w:sz="4"/>
@@ -326,7 +326,7 @@
         </w:trPr>
         <w:tc>
           <w:tcPr>
-            <w:tcW w:type="dxa" w:w="1258"/>
+            <w:tcW w:type="dxa" w:w="1082"/>
             <w:tcBorders>
               <w:top w:val="single" w:color="BBBBBB" w:sz="4"/>
               <w:left w:val="single" w:color="BBBBBB" w:sz="4"/>
@@ -353,7 +353,7 @@
         </w:tc>
         <w:tc>
           <w:tcPr>
-            <w:tcW w:type="dxa" w:w="8380"/>
+            <w:tcW w:type="dxa" w:w="8556"/>
             <w:tcBorders>
               <w:top w:val="single" w:color="BBBBBB" w:sz="4"/>
               <w:left w:val="single" w:color="BBBBBB" w:sz="4"/>
@@ -412,7 +412,7 @@
         </w:trPr>
         <w:tc>
           <w:tcPr>
-            <w:tcW w:type="dxa" w:w="1258"/>
+            <w:tcW w:type="dxa" w:w="1082"/>
             <w:tcBorders>
               <w:top w:val="single" w:color="BBBBBB" w:sz="4"/>
               <w:left w:val="single" w:color="BBBBBB" w:sz="4"/>
@@ -439,28 +439,28 @@
         </w:tc>
         <w:tc>
           <w:tcPr>
-            <w:tcW w:type="dxa" w:w="8380"/>
-            <w:tcBorders>
-              <w:top w:val="single" w:color="BBBBBB" w:sz="4"/>
-              <w:left w:val="single" w:color="BBBBBB" w:sz="4"/>
-              <w:bottom w:val="single" w:color="BBBBBB" w:sz="4"/>
-              <w:right w:val="single" w:color="BBBBBB" w:sz="4"/>
-            </w:tcBorders>
-            <w:tcMar>
-              <w:top w:type="dxa" w:w="50"/>
-              <w:left w:type="dxa" w:w="90"/>
-              <w:bottom w:type="dxa" w:w="50"/>
-              <w:right w:type="dxa" w:w="90"/>
-            </w:tcMar>
-          </w:tcPr>
-          <w:p>
-            <w:r>
-              <w:rPr>
-                <w:rFonts w:ascii="Malgun Gothic" w:cs="Malgun Gothic" w:eastAsia="Malgun Gothic" w:hAnsi="Malgun Gothic"/>
-                <w:sz w:val="18"/>
-                <w:szCs w:val="18"/>
-              </w:rPr>
-              <w:t xml:space="preserve">2026-10-01</w:t>
+            <w:tcW w:type="dxa" w:w="8556"/>
+            <w:tcBorders>
+              <w:top w:val="single" w:color="BBBBBB" w:sz="4"/>
+              <w:left w:val="single" w:color="BBBBBB" w:sz="4"/>
+              <w:bottom w:val="single" w:color="BBBBBB" w:sz="4"/>
+              <w:right w:val="single" w:color="BBBBBB" w:sz="4"/>
+            </w:tcBorders>
+            <w:tcMar>
+              <w:top w:type="dxa" w:w="50"/>
+              <w:left w:type="dxa" w:w="90"/>
+              <w:bottom w:type="dxa" w:w="50"/>
+              <w:right w:type="dxa" w:w="90"/>
+            </w:tcMar>
+          </w:tcPr>
+          <w:p>
+            <w:r>
+              <w:rPr>
+                <w:rFonts w:ascii="Malgun Gothic" w:cs="Malgun Gothic" w:eastAsia="Malgun Gothic" w:hAnsi="Malgun Gothic"/>
+                <w:sz w:val="18"/>
+                <w:szCs w:val="18"/>
+              </w:rPr>
+              <w:t xml:space="preserve">2026-10-01 (최종 수정 2026-10-02)</w:t>
             </w:r>
           </w:p>
         </w:tc>
@@ -472,7 +472,7 @@
         </w:trPr>
         <w:tc>
           <w:tcPr>
-            <w:tcW w:type="dxa" w:w="1258"/>
+            <w:tcW w:type="dxa" w:w="1082"/>
             <w:tcBorders>
               <w:top w:val="single" w:color="BBBBBB" w:sz="4"/>
               <w:left w:val="single" w:color="BBBBBB" w:sz="4"/>
@@ -499,28 +499,36 @@
         </w:tc>
         <w:tc>
           <w:tcPr>
-            <w:tcW w:type="dxa" w:w="8380"/>
-            <w:tcBorders>
-              <w:top w:val="single" w:color="BBBBBB" w:sz="4"/>
-              <w:left w:val="single" w:color="BBBBBB" w:sz="4"/>
-              <w:bottom w:val="single" w:color="BBBBBB" w:sz="4"/>
-              <w:right w:val="single" w:color="BBBBBB" w:sz="4"/>
-            </w:tcBorders>
-            <w:tcMar>
-              <w:top w:type="dxa" w:w="50"/>
-              <w:left w:type="dxa" w:w="90"/>
-              <w:bottom w:type="dxa" w:w="50"/>
-              <w:right w:type="dxa" w:w="90"/>
-            </w:tcMar>
-          </w:tcPr>
-          <w:p>
-            <w:r>
-              <w:rPr>
-                <w:rFonts w:ascii="Malgun Gothic" w:cs="Malgun Gothic" w:eastAsia="Malgun Gothic" w:hAnsi="Malgun Gothic"/>
-                <w:sz w:val="18"/>
-                <w:szCs w:val="18"/>
-              </w:rPr>
-              <w:t xml:space="preserve">SQL 파일만 작성됨 — 아직 실행하지 않음</w:t>
+            <w:tcW w:type="dxa" w:w="8556"/>
+            <w:tcBorders>
+              <w:top w:val="single" w:color="BBBBBB" w:sz="4"/>
+              <w:left w:val="single" w:color="BBBBBB" w:sz="4"/>
+              <w:bottom w:val="single" w:color="BBBBBB" w:sz="4"/>
+              <w:right w:val="single" w:color="BBBBBB" w:sz="4"/>
+            </w:tcBorders>
+            <w:tcMar>
+              <w:top w:type="dxa" w:w="50"/>
+              <w:left w:type="dxa" w:w="90"/>
+              <w:bottom w:type="dxa" w:w="50"/>
+              <w:right w:type="dxa" w:w="90"/>
+            </w:tcMar>
+          </w:tcPr>
+          <w:p>
+            <w:r>
+              <w:rPr>
+                <w:rFonts w:ascii="Malgun Gothic" w:cs="Malgun Gothic" w:eastAsia="Malgun Gothic" w:hAnsi="Malgun Gothic"/>
+                <w:sz w:val="18"/>
+                <w:szCs w:val="18"/>
+              </w:rPr>
+              <w:t xml:space="preserve">로컬 DB에 01~06 실행 완료, 2026-10-02 변경 SQL(§2.5)까지 반영 → </w:t>
+            </w:r>
+            <w:r>
+              <w:rPr>
+                <w:rFonts w:ascii="Malgun Gothic" w:cs="Malgun Gothic" w:eastAsia="Malgun Gothic" w:hAnsi="Malgun Gothic"/>
+                <w:sz w:val="18"/>
+                <w:szCs w:val="18"/>
+              </w:rPr>
+              <w:t xml:space="preserve">34개 테이블 확인</w:t>
             </w:r>
           </w:p>
         </w:tc>
@@ -1936,7 +1944,7 @@
         <w:rPr>
           <w:rFonts w:ascii="Malgun Gothic" w:cs="Malgun Gothic" w:eastAsia="Malgun Gothic" w:hAnsi="Malgun Gothic"/>
         </w:rPr>
-        <w:t xml:space="preserve">작성 시 확인한 것: 34개 테이블 중복 없음, 모든 외래키 대상이 먼저 생성됨, MySQL 문법 파싱 통과. (실제 DB 실행 검증은 아직 안 함)</w:t>
+        <w:t xml:space="preserve">확인한 것: 34개 테이블 중복 없음, 모든 외래키 대상이 먼저 생성됨, MySQL 문법 파싱 통과, 로컬 MySQL 8.0에서 실제 실행.</w:t>
       </w:r>
     </w:p>
     <w:p>
@@ -1948,6 +1956,123 @@
           <w:rFonts w:ascii="Malgun Gothic" w:cs="Malgun Gothic" w:eastAsia="Malgun Gothic" w:hAnsi="Malgun Gothic"/>
         </w:rPr>
         <w:t xml:space="preserve">2. 실행 방법</w:t>
+      </w:r>
+    </w:p>
+    <w:p>
+      <w:r>
+        <w:rPr>
+          <w:rFonts w:ascii="Malgun Gothic" w:cs="Malgun Gothic" w:eastAsia="Malgun Gothic" w:hAnsi="Malgun Gothic"/>
+        </w:rPr>
+        <w:t xml:space="preserve">&gt; </w:t>
+      </w:r>
+      <w:r>
+        <w:rPr>
+          <w:rFonts w:ascii="Malgun Gothic" w:cs="Malgun Gothic" w:eastAsia="Malgun Gothic" w:hAnsi="Malgun Gothic"/>
+          <w:b/>
+          <w:bCs/>
+        </w:rPr>
+        <w:t xml:space="preserve">PowerShell에서는 `&lt;`를 쓸 수 없습니다</w:t>
+      </w:r>
+      <w:r>
+        <w:rPr>
+          <w:rFonts w:ascii="Malgun Gothic" w:cs="Malgun Gothic" w:eastAsia="Malgun Gothic" w:hAnsi="Malgun Gothic"/>
+        </w:rPr>
+        <w:t xml:space="preserve"> (</w:t>
+      </w:r>
+      <w:r>
+        <w:rPr>
+          <w:rFonts w:ascii="Consolas" w:cs="Consolas" w:eastAsia="Consolas" w:hAnsi="Consolas"/>
+          <w:color w:val="B4235A"/>
+        </w:rPr>
+        <w:t xml:space="preserve">The '&lt;' operator is reserved for future use.</w:t>
+      </w:r>
+      <w:r>
+        <w:rPr>
+          <w:rFonts w:ascii="Malgun Gothic" w:cs="Malgun Gothic" w:eastAsia="Malgun Gothic" w:hAnsi="Malgun Gothic"/>
+        </w:rPr>
+        <w:t xml:space="preserve"> 오류).</w:t>
+      </w:r>
+    </w:p>
+    <w:p>
+      <w:r>
+        <w:rPr>
+          <w:rFonts w:ascii="Malgun Gothic" w:cs="Malgun Gothic" w:eastAsia="Malgun Gothic" w:hAnsi="Malgun Gothic"/>
+        </w:rPr>
+        <w:t xml:space="preserve">&gt; 아래 명령은 MySQL의 </w:t>
+      </w:r>
+      <w:r>
+        <w:rPr>
+          <w:rFonts w:ascii="Consolas" w:cs="Consolas" w:eastAsia="Consolas" w:hAnsi="Consolas"/>
+          <w:color w:val="B4235A"/>
+        </w:rPr>
+        <w:t xml:space="preserve">source</w:t>
+      </w:r>
+      <w:r>
+        <w:rPr>
+          <w:rFonts w:ascii="Malgun Gothic" w:cs="Malgun Gothic" w:eastAsia="Malgun Gothic" w:hAnsi="Malgun Gothic"/>
+        </w:rPr>
+        <w:t xml:space="preserve"> 명령을 쓰는 방식이라 PowerShell, 명령 프롬프트(cmd), Git Bash 어디서나 됩니다. 비밀번호는 실행 후 입력합니다.</w:t>
+      </w:r>
+    </w:p>
+    <w:p>
+      <w:r>
+        <w:rPr>
+          <w:rFonts w:ascii="Malgun Gothic" w:cs="Malgun Gothic" w:eastAsia="Malgun Gothic" w:hAnsi="Malgun Gothic"/>
+        </w:rPr>
+        <w:t xml:space="preserve">&gt; 경로는 </w:t>
+      </w:r>
+      <w:r>
+        <w:rPr>
+          <w:rFonts w:ascii="Malgun Gothic" w:cs="Malgun Gothic" w:eastAsia="Malgun Gothic" w:hAnsi="Malgun Gothic"/>
+          <w:b/>
+          <w:bCs/>
+        </w:rPr>
+        <w:t xml:space="preserve">`studionx/` 폴더에서 실행하는 기준</w:t>
+      </w:r>
+      <w:r>
+        <w:rPr>
+          <w:rFonts w:ascii="Malgun Gothic" w:cs="Malgun Gothic" w:eastAsia="Malgun Gothic" w:hAnsi="Malgun Gothic"/>
+        </w:rPr>
+        <w:t xml:space="preserve">입니다. 저장소 맨 위(</w:t>
+      </w:r>
+      <w:r>
+        <w:rPr>
+          <w:rFonts w:ascii="Consolas" w:cs="Consolas" w:eastAsia="Consolas" w:hAnsi="Consolas"/>
+          <w:color w:val="B4235A"/>
+        </w:rPr>
+        <w:t xml:space="preserve">StudioNx/</w:t>
+      </w:r>
+      <w:r>
+        <w:rPr>
+          <w:rFonts w:ascii="Malgun Gothic" w:cs="Malgun Gothic" w:eastAsia="Malgun Gothic" w:hAnsi="Malgun Gothic"/>
+        </w:rPr>
+        <w:t xml:space="preserve">)에서 실행하면 </w:t>
+      </w:r>
+      <w:r>
+        <w:rPr>
+          <w:rFonts w:ascii="Consolas" w:cs="Consolas" w:eastAsia="Consolas" w:hAnsi="Consolas"/>
+          <w:color w:val="B4235A"/>
+        </w:rPr>
+        <w:t xml:space="preserve">db/</w:t>
+      </w:r>
+      <w:r>
+        <w:rPr>
+          <w:rFonts w:ascii="Malgun Gothic" w:cs="Malgun Gothic" w:eastAsia="Malgun Gothic" w:hAnsi="Malgun Gothic"/>
+        </w:rPr>
+        <w:t xml:space="preserve"> 앞에 </w:t>
+      </w:r>
+      <w:r>
+        <w:rPr>
+          <w:rFonts w:ascii="Consolas" w:cs="Consolas" w:eastAsia="Consolas" w:hAnsi="Consolas"/>
+          <w:color w:val="B4235A"/>
+        </w:rPr>
+        <w:t xml:space="preserve">studionx/</w:t>
+      </w:r>
+      <w:r>
+        <w:rPr>
+          <w:rFonts w:ascii="Malgun Gothic" w:cs="Malgun Gothic" w:eastAsia="Malgun Gothic" w:hAnsi="Malgun Gothic"/>
+        </w:rPr>
+        <w:t xml:space="preserve">를 붙입니다.</w:t>
       </w:r>
     </w:p>
     <w:p>
@@ -2064,7 +2189,7 @@
           <w:sz w:val="17"/>
           <w:szCs w:val="17"/>
         </w:rPr>
-        <w:t xml:space="preserve">mysql -u root -p &lt; db/00_create_database.sql</w:t>
+        <w:t xml:space="preserve">mysql -u root -p -e "source db/00_create_database.sql"</w:t>
       </w:r>
     </w:p>
     <w:p>
@@ -2105,7 +2230,7 @@
           <w:sz w:val="17"/>
           <w:szCs w:val="17"/>
         </w:rPr>
-        <w:t xml:space="preserve">mysql -u studionx_app -p studionx &lt; db/01_phase1_account.sql</w:t>
+        <w:t xml:space="preserve">mysql -u studionx_app -p studionx -e "source db/01_phase1_account.sql"</w:t>
       </w:r>
     </w:p>
     <w:p>
@@ -2120,7 +2245,7 @@
           <w:sz w:val="17"/>
           <w:szCs w:val="17"/>
         </w:rPr>
-        <w:t xml:space="preserve">mysql -u studionx_app -p studionx &lt; db/02_phase2_sequencer.sql</w:t>
+        <w:t xml:space="preserve">mysql -u studionx_app -p studionx -e "source db/02_phase2_sequencer.sql"</w:t>
       </w:r>
     </w:p>
     <w:p>
@@ -2135,7 +2260,7 @@
           <w:sz w:val="17"/>
           <w:szCs w:val="17"/>
         </w:rPr>
-        <w:t xml:space="preserve">mysql -u studionx_app -p studionx &lt; db/03_phase3_export.sql</w:t>
+        <w:t xml:space="preserve">mysql -u studionx_app -p studionx -e "source db/03_phase3_export.sql"</w:t>
       </w:r>
     </w:p>
     <w:p>
@@ -2150,7 +2275,7 @@
           <w:sz w:val="17"/>
           <w:szCs w:val="17"/>
         </w:rPr>
-        <w:t xml:space="preserve">mysql -u studionx_app -p studionx &lt; db/04_phase4_separation.sql</w:t>
+        <w:t xml:space="preserve">mysql -u studionx_app -p studionx -e "source db/04_phase4_separation.sql"</w:t>
       </w:r>
     </w:p>
     <w:p>
@@ -2165,7 +2290,7 @@
           <w:sz w:val="17"/>
           <w:szCs w:val="17"/>
         </w:rPr>
-        <w:t xml:space="preserve">mysql -u studionx_app -p studionx &lt; db/05_phase5_ai.sql</w:t>
+        <w:t xml:space="preserve">mysql -u studionx_app -p studionx -e "source db/05_phase5_ai.sql"</w:t>
       </w:r>
     </w:p>
     <w:p>
@@ -2180,7 +2305,7 @@
           <w:sz w:val="17"/>
           <w:szCs w:val="17"/>
         </w:rPr>
-        <w:t xml:space="preserve">mysql -u studionx_app -p studionx &lt; db/06_phase6_collaboration.sql</w:t>
+        <w:t xml:space="preserve">mysql -u studionx_app -p studionx -e "source db/06_phase6_collaboration.sql"</w:t>
       </w:r>
     </w:p>
     <w:p>
@@ -2356,7 +2481,7 @@
           <w:sz w:val="17"/>
           <w:szCs w:val="17"/>
         </w:rPr>
-        <w:t xml:space="preserve">mysql -u studionx_app -p studionx &lt; db/99_drop_all_tables.sql</w:t>
+        <w:t xml:space="preserve">mysql -u studionx_app -p studionx -e "source db/99_drop_all_tables.sql"</w:t>
       </w:r>
     </w:p>
     <w:p>
@@ -2365,6 +2490,76 @@
           <w:rFonts w:ascii="Malgun Gothic" w:cs="Malgun Gothic" w:eastAsia="Malgun Gothic" w:hAnsi="Malgun Gothic"/>
         </w:rPr>
         <w:t xml:space="preserve">모든 데이터가 지워집니다. 운영 DB에서는 절대 실행하지 마세요. 이후 01~06을 다시 실행하면 빈 스키마가 됩니다.</w:t>
+      </w:r>
+    </w:p>
+    <w:p>
+      <w:pPr>
+        <w:pStyle w:val="Heading2"/>
+      </w:pPr>
+      <w:r>
+        <w:rPr>
+          <w:rFonts w:ascii="Malgun Gothic" w:cs="Malgun Gothic" w:eastAsia="Malgun Gothic" w:hAnsi="Malgun Gothic"/>
+        </w:rPr>
+        <w:t xml:space="preserve">2.5 변경 SQL 실행 (이미 테이블이 있는 DB)</w:t>
+      </w:r>
+    </w:p>
+    <w:p>
+      <w:r>
+        <w:rPr>
+          <w:rFonts w:ascii="Malgun Gothic" w:cs="Malgun Gothic" w:eastAsia="Malgun Gothic" w:hAnsi="Malgun Gothic"/>
+        </w:rPr>
+        <w:t xml:space="preserve">01~06을 예전에 실행한 DB는 테이블을 다시 만들지 않고 </w:t>
+      </w:r>
+      <w:r>
+        <w:rPr>
+          <w:rFonts w:ascii="Consolas" w:cs="Consolas" w:eastAsia="Consolas" w:hAnsi="Consolas"/>
+          <w:color w:val="B4235A"/>
+        </w:rPr>
+        <w:t xml:space="preserve">db/migrations/</w:t>
+      </w:r>
+      <w:r>
+        <w:rPr>
+          <w:rFonts w:ascii="Malgun Gothic" w:cs="Malgun Gothic" w:eastAsia="Malgun Gothic" w:hAnsi="Malgun Gothic"/>
+        </w:rPr>
+        <w:t xml:space="preserve">의 변경 SQL만 실행합니다. 목록은 §6.1에 있습니다.</w:t>
+      </w:r>
+    </w:p>
+    <w:p>
+      <w:pPr>
+        <w:shd w:fill="F4F4F6" w:color="auto" w:val="clear"/>
+        <w:spacing w:after="120" w:before="60"/>
+        <w:ind w:left="120"/>
+      </w:pPr>
+      <w:r>
+        <w:rPr>
+          <w:rFonts w:ascii="Consolas" w:cs="Consolas" w:eastAsia="Consolas" w:hAnsi="Consolas"/>
+          <w:sz w:val="17"/>
+          <w:szCs w:val="17"/>
+        </w:rPr>
+        <w:t xml:space="preserve">mysql -u studionx_app -p studionx -e "source db/migrations/2026-10-02_contact_devnotes.sql"</w:t>
+      </w:r>
+    </w:p>
+    <w:p>
+      <w:r>
+        <w:rPr>
+          <w:rFonts w:ascii="Malgun Gothic" w:cs="Malgun Gothic" w:eastAsia="Malgun Gothic" w:hAnsi="Malgun Gothic"/>
+        </w:rPr>
+        <w:t xml:space="preserve">확인: §2.3의 테이블 수가 34이고, 아래 명령 결과로 한 줄이 나오면 정상입니다.</w:t>
+      </w:r>
+    </w:p>
+    <w:p>
+      <w:pPr>
+        <w:shd w:fill="F4F4F6" w:color="auto" w:val="clear"/>
+        <w:spacing w:after="120" w:before="60"/>
+        <w:ind w:left="120"/>
+      </w:pPr>
+      <w:r>
+        <w:rPr>
+          <w:rFonts w:ascii="Consolas" w:cs="Consolas" w:eastAsia="Consolas" w:hAnsi="Consolas"/>
+          <w:sz w:val="17"/>
+          <w:szCs w:val="17"/>
+        </w:rPr>
+        <w:t xml:space="preserve">mysql -u studionx_app -p studionx -e "SHOW COLUMNS FROM inquiries LIKE 'privacy_agreed_at';"</w:t>
       </w:r>
     </w:p>
     <w:p>
@@ -6168,6 +6363,19 @@
         <w:rPr>
           <w:rFonts w:ascii="Malgun Gothic" w:cs="Malgun Gothic" w:eastAsia="Malgun Gothic" w:hAnsi="Malgun Gothic"/>
         </w:rPr>
+        <w:t xml:space="preserve">, </w:t>
+      </w:r>
+      <w:r>
+        <w:rPr>
+          <w:rFonts w:ascii="Consolas" w:cs="Consolas" w:eastAsia="Consolas" w:hAnsi="Consolas"/>
+          <w:color w:val="B4235A"/>
+        </w:rPr>
+        <w:t xml:space="preserve">dev_notes</w:t>
+      </w:r>
+      <w:r>
+        <w:rPr>
+          <w:rFonts w:ascii="Malgun Gothic" w:cs="Malgun Gothic" w:eastAsia="Malgun Gothic" w:hAnsi="Malgun Gothic"/>
+        </w:rPr>
         <w:t xml:space="preserve">는 </w:t>
       </w:r>
       <w:r>
@@ -7323,9 +7531,9 @@
         <w:tblLayout w:type="fixed"/>
       </w:tblPr>
       <w:tblGrid>
-        <w:gridCol w:w="3776"/>
-        <w:gridCol w:w="3840"/>
-        <w:gridCol w:w="2022"/>
+        <w:gridCol w:w="3662"/>
+        <w:gridCol w:w="3282"/>
+        <w:gridCol w:w="2694"/>
       </w:tblGrid>
       <w:tr>
         <w:trPr>
@@ -7334,7 +7542,7 @@
         </w:trPr>
         <w:tc>
           <w:tcPr>
-            <w:tcW w:type="dxa" w:w="3776"/>
+            <w:tcW w:type="dxa" w:w="3662"/>
             <w:tcBorders>
               <w:top w:val="single" w:color="BBBBBB" w:sz="4"/>
               <w:left w:val="single" w:color="BBBBBB" w:sz="4"/>
@@ -7364,7 +7572,7 @@
         </w:tc>
         <w:tc>
           <w:tcPr>
-            <w:tcW w:type="dxa" w:w="3840"/>
+            <w:tcW w:type="dxa" w:w="3282"/>
             <w:tcBorders>
               <w:top w:val="single" w:color="BBBBBB" w:sz="4"/>
               <w:left w:val="single" w:color="BBBBBB" w:sz="4"/>
@@ -7394,7 +7602,7 @@
         </w:tc>
         <w:tc>
           <w:tcPr>
-            <w:tcW w:type="dxa" w:w="2022"/>
+            <w:tcW w:type="dxa" w:w="2694"/>
             <w:tcBorders>
               <w:top w:val="single" w:color="BBBBBB" w:sz="4"/>
               <w:left w:val="single" w:color="BBBBBB" w:sz="4"/>
@@ -7430,7 +7638,7 @@
         </w:trPr>
         <w:tc>
           <w:tcPr>
-            <w:tcW w:type="dxa" w:w="3776"/>
+            <w:tcW w:type="dxa" w:w="3662"/>
             <w:tcBorders>
               <w:top w:val="single" w:color="BBBBBB" w:sz="4"/>
               <w:left w:val="single" w:color="BBBBBB" w:sz="4"/>
@@ -7458,7 +7666,7 @@
         </w:tc>
         <w:tc>
           <w:tcPr>
-            <w:tcW w:type="dxa" w:w="3840"/>
+            <w:tcW w:type="dxa" w:w="3282"/>
             <w:tcBorders>
               <w:top w:val="single" w:color="BBBBBB" w:sz="4"/>
               <w:left w:val="single" w:color="BBBBBB" w:sz="4"/>
@@ -7528,28 +7736,28 @@
         </w:tc>
         <w:tc>
           <w:tcPr>
-            <w:tcW w:type="dxa" w:w="2022"/>
-            <w:tcBorders>
-              <w:top w:val="single" w:color="BBBBBB" w:sz="4"/>
-              <w:left w:val="single" w:color="BBBBBB" w:sz="4"/>
-              <w:bottom w:val="single" w:color="BBBBBB" w:sz="4"/>
-              <w:right w:val="single" w:color="BBBBBB" w:sz="4"/>
-            </w:tcBorders>
-            <w:tcMar>
-              <w:top w:type="dxa" w:w="50"/>
-              <w:left w:type="dxa" w:w="90"/>
-              <w:bottom w:type="dxa" w:w="50"/>
-              <w:right w:type="dxa" w:w="90"/>
-            </w:tcMar>
-          </w:tcPr>
-          <w:p>
-            <w:r>
-              <w:rPr>
-                <w:rFonts w:ascii="Malgun Gothic" w:cs="Malgun Gothic" w:eastAsia="Malgun Gothic" w:hAnsi="Malgun Gothic"/>
-                <w:sz w:val="18"/>
-                <w:szCs w:val="18"/>
-              </w:rPr>
-              <w:t xml:space="preserve">2026-10-02 이전에 01~06을 실행한 DB</w:t>
+            <w:tcW w:type="dxa" w:w="2694"/>
+            <w:tcBorders>
+              <w:top w:val="single" w:color="BBBBBB" w:sz="4"/>
+              <w:left w:val="single" w:color="BBBBBB" w:sz="4"/>
+              <w:bottom w:val="single" w:color="BBBBBB" w:sz="4"/>
+              <w:right w:val="single" w:color="BBBBBB" w:sz="4"/>
+            </w:tcBorders>
+            <w:tcMar>
+              <w:top w:type="dxa" w:w="50"/>
+              <w:left w:type="dxa" w:w="90"/>
+              <w:bottom w:type="dxa" w:w="50"/>
+              <w:right w:type="dxa" w:w="90"/>
+            </w:tcMar>
+          </w:tcPr>
+          <w:p>
+            <w:r>
+              <w:rPr>
+                <w:rFonts w:ascii="Malgun Gothic" w:cs="Malgun Gothic" w:eastAsia="Malgun Gothic" w:hAnsi="Malgun Gothic"/>
+                <w:sz w:val="18"/>
+                <w:szCs w:val="18"/>
+              </w:rPr>
+              <w:t xml:space="preserve">2026-10-02 이전에 01~06을 실행한 DB (로컬 DB 실행 완료)</w:t>
             </w:r>
           </w:p>
         </w:tc>

</xml_diff>

<commit_message>
db(phase1): 프로젝트 작업 세션 project_sessions 추가 (35개 테이블)
- 마이페이지 Recent Projects의 최근 7일 작업 시간용 (기록은 Phase 2 시퀀서)
- 컬럼: started_at, last_seen_at(마지막 신호), active_seconds(입력 없는 5분 초과 구간 제외)
- DB.md·ERD·SQL 01/99·변경 SQL(migrations/2026-10-03)·DB 가이드(md·docx·PDF) 갱신, 로컬 DB 실행 완료
- PRD 01 FR-128(표시), PRD 02 FR-257(기록)·heartbeat API, 통합본 PDF 재생성

Co-Authored-By: Claude Opus 5.5 <noreply@anthropic.com>
</commit_message>
<xml_diff>
--- a/studionx/db/docs/StudioNx_DB_Guide.docx
+++ b/studionx/db/docs/StudioNx_DB_Guide.docx
@@ -27,8 +27,8 @@
         <w:tblLayout w:type="fixed"/>
       </w:tblPr>
       <w:tblGrid>
-        <w:gridCol w:w="1082"/>
-        <w:gridCol w:w="8556"/>
+        <w:gridCol w:w="1073"/>
+        <w:gridCol w:w="8565"/>
       </w:tblGrid>
       <w:tr>
         <w:trPr>
@@ -37,7 +37,7 @@
         </w:trPr>
         <w:tc>
           <w:tcPr>
-            <w:tcW w:type="dxa" w:w="1082"/>
+            <w:tcW w:type="dxa" w:w="1073"/>
             <w:tcBorders>
               <w:top w:val="single" w:color="BBBBBB" w:sz="4"/>
               <w:left w:val="single" w:color="BBBBBB" w:sz="4"/>
@@ -67,7 +67,7 @@
         </w:tc>
         <w:tc>
           <w:tcPr>
-            <w:tcW w:type="dxa" w:w="8556"/>
+            <w:tcW w:type="dxa" w:w="8565"/>
             <w:tcBorders>
               <w:top w:val="single" w:color="BBBBBB" w:sz="4"/>
               <w:left w:val="single" w:color="BBBBBB" w:sz="4"/>
@@ -103,7 +103,7 @@
         </w:trPr>
         <w:tc>
           <w:tcPr>
-            <w:tcW w:type="dxa" w:w="1082"/>
+            <w:tcW w:type="dxa" w:w="1073"/>
             <w:tcBorders>
               <w:top w:val="single" w:color="BBBBBB" w:sz="4"/>
               <w:left w:val="single" w:color="BBBBBB" w:sz="4"/>
@@ -130,7 +130,7 @@
         </w:tc>
         <w:tc>
           <w:tcPr>
-            <w:tcW w:type="dxa" w:w="8556"/>
+            <w:tcW w:type="dxa" w:w="8565"/>
             <w:tcBorders>
               <w:top w:val="single" w:color="BBBBBB" w:sz="4"/>
               <w:left w:val="single" w:color="BBBBBB" w:sz="4"/>
@@ -163,7 +163,7 @@
         </w:trPr>
         <w:tc>
           <w:tcPr>
-            <w:tcW w:type="dxa" w:w="1082"/>
+            <w:tcW w:type="dxa" w:w="1073"/>
             <w:tcBorders>
               <w:top w:val="single" w:color="BBBBBB" w:sz="4"/>
               <w:left w:val="single" w:color="BBBBBB" w:sz="4"/>
@@ -190,7 +190,7 @@
         </w:tc>
         <w:tc>
           <w:tcPr>
-            <w:tcW w:type="dxa" w:w="8556"/>
+            <w:tcW w:type="dxa" w:w="8565"/>
             <w:tcBorders>
               <w:top w:val="single" w:color="BBBBBB" w:sz="4"/>
               <w:left w:val="single" w:color="BBBBBB" w:sz="4"/>
@@ -266,7 +266,7 @@
         </w:trPr>
         <w:tc>
           <w:tcPr>
-            <w:tcW w:type="dxa" w:w="1082"/>
+            <w:tcW w:type="dxa" w:w="1073"/>
             <w:tcBorders>
               <w:top w:val="single" w:color="BBBBBB" w:sz="4"/>
               <w:left w:val="single" w:color="BBBBBB" w:sz="4"/>
@@ -293,28 +293,28 @@
         </w:tc>
         <w:tc>
           <w:tcPr>
-            <w:tcW w:type="dxa" w:w="8556"/>
-            <w:tcBorders>
-              <w:top w:val="single" w:color="BBBBBB" w:sz="4"/>
-              <w:left w:val="single" w:color="BBBBBB" w:sz="4"/>
-              <w:bottom w:val="single" w:color="BBBBBB" w:sz="4"/>
-              <w:right w:val="single" w:color="BBBBBB" w:sz="4"/>
-            </w:tcBorders>
-            <w:tcMar>
-              <w:top w:type="dxa" w:w="50"/>
-              <w:left w:type="dxa" w:w="90"/>
-              <w:bottom w:type="dxa" w:w="50"/>
-              <w:right w:type="dxa" w:w="90"/>
-            </w:tcMar>
-          </w:tcPr>
-          <w:p>
-            <w:r>
-              <w:rPr>
-                <w:rFonts w:ascii="Malgun Gothic" w:cs="Malgun Gothic" w:eastAsia="Malgun Gothic" w:hAnsi="Malgun Gothic"/>
-                <w:sz w:val="18"/>
-                <w:szCs w:val="18"/>
-              </w:rPr>
-              <w:t xml:space="preserve">34개</w:t>
+            <w:tcW w:type="dxa" w:w="8565"/>
+            <w:tcBorders>
+              <w:top w:val="single" w:color="BBBBBB" w:sz="4"/>
+              <w:left w:val="single" w:color="BBBBBB" w:sz="4"/>
+              <w:bottom w:val="single" w:color="BBBBBB" w:sz="4"/>
+              <w:right w:val="single" w:color="BBBBBB" w:sz="4"/>
+            </w:tcBorders>
+            <w:tcMar>
+              <w:top w:type="dxa" w:w="50"/>
+              <w:left w:type="dxa" w:w="90"/>
+              <w:bottom w:type="dxa" w:w="50"/>
+              <w:right w:type="dxa" w:w="90"/>
+            </w:tcMar>
+          </w:tcPr>
+          <w:p>
+            <w:r>
+              <w:rPr>
+                <w:rFonts w:ascii="Malgun Gothic" w:cs="Malgun Gothic" w:eastAsia="Malgun Gothic" w:hAnsi="Malgun Gothic"/>
+                <w:sz w:val="18"/>
+                <w:szCs w:val="18"/>
+              </w:rPr>
+              <w:t xml:space="preserve">35개</w:t>
             </w:r>
           </w:p>
         </w:tc>
@@ -326,7 +326,7 @@
         </w:trPr>
         <w:tc>
           <w:tcPr>
-            <w:tcW w:type="dxa" w:w="1082"/>
+            <w:tcW w:type="dxa" w:w="1073"/>
             <w:tcBorders>
               <w:top w:val="single" w:color="BBBBBB" w:sz="4"/>
               <w:left w:val="single" w:color="BBBBBB" w:sz="4"/>
@@ -353,7 +353,7 @@
         </w:tc>
         <w:tc>
           <w:tcPr>
-            <w:tcW w:type="dxa" w:w="8556"/>
+            <w:tcW w:type="dxa" w:w="8565"/>
             <w:tcBorders>
               <w:top w:val="single" w:color="BBBBBB" w:sz="4"/>
               <w:left w:val="single" w:color="BBBBBB" w:sz="4"/>
@@ -412,7 +412,7 @@
         </w:trPr>
         <w:tc>
           <w:tcPr>
-            <w:tcW w:type="dxa" w:w="1082"/>
+            <w:tcW w:type="dxa" w:w="1073"/>
             <w:tcBorders>
               <w:top w:val="single" w:color="BBBBBB" w:sz="4"/>
               <w:left w:val="single" w:color="BBBBBB" w:sz="4"/>
@@ -439,28 +439,28 @@
         </w:tc>
         <w:tc>
           <w:tcPr>
-            <w:tcW w:type="dxa" w:w="8556"/>
-            <w:tcBorders>
-              <w:top w:val="single" w:color="BBBBBB" w:sz="4"/>
-              <w:left w:val="single" w:color="BBBBBB" w:sz="4"/>
-              <w:bottom w:val="single" w:color="BBBBBB" w:sz="4"/>
-              <w:right w:val="single" w:color="BBBBBB" w:sz="4"/>
-            </w:tcBorders>
-            <w:tcMar>
-              <w:top w:type="dxa" w:w="50"/>
-              <w:left w:type="dxa" w:w="90"/>
-              <w:bottom w:type="dxa" w:w="50"/>
-              <w:right w:type="dxa" w:w="90"/>
-            </w:tcMar>
-          </w:tcPr>
-          <w:p>
-            <w:r>
-              <w:rPr>
-                <w:rFonts w:ascii="Malgun Gothic" w:cs="Malgun Gothic" w:eastAsia="Malgun Gothic" w:hAnsi="Malgun Gothic"/>
-                <w:sz w:val="18"/>
-                <w:szCs w:val="18"/>
-              </w:rPr>
-              <w:t xml:space="preserve">2026-10-01 (최종 수정 2026-10-02)</w:t>
+            <w:tcW w:type="dxa" w:w="8565"/>
+            <w:tcBorders>
+              <w:top w:val="single" w:color="BBBBBB" w:sz="4"/>
+              <w:left w:val="single" w:color="BBBBBB" w:sz="4"/>
+              <w:bottom w:val="single" w:color="BBBBBB" w:sz="4"/>
+              <w:right w:val="single" w:color="BBBBBB" w:sz="4"/>
+            </w:tcBorders>
+            <w:tcMar>
+              <w:top w:type="dxa" w:w="50"/>
+              <w:left w:type="dxa" w:w="90"/>
+              <w:bottom w:type="dxa" w:w="50"/>
+              <w:right w:type="dxa" w:w="90"/>
+            </w:tcMar>
+          </w:tcPr>
+          <w:p>
+            <w:r>
+              <w:rPr>
+                <w:rFonts w:ascii="Malgun Gothic" w:cs="Malgun Gothic" w:eastAsia="Malgun Gothic" w:hAnsi="Malgun Gothic"/>
+                <w:sz w:val="18"/>
+                <w:szCs w:val="18"/>
+              </w:rPr>
+              <w:t xml:space="preserve">2026-10-01 (최종 수정 2026-10-03)</w:t>
             </w:r>
           </w:p>
         </w:tc>
@@ -472,7 +472,7 @@
         </w:trPr>
         <w:tc>
           <w:tcPr>
-            <w:tcW w:type="dxa" w:w="1082"/>
+            <w:tcW w:type="dxa" w:w="1073"/>
             <w:tcBorders>
               <w:top w:val="single" w:color="BBBBBB" w:sz="4"/>
               <w:left w:val="single" w:color="BBBBBB" w:sz="4"/>
@@ -499,36 +499,36 @@
         </w:tc>
         <w:tc>
           <w:tcPr>
-            <w:tcW w:type="dxa" w:w="8556"/>
-            <w:tcBorders>
-              <w:top w:val="single" w:color="BBBBBB" w:sz="4"/>
-              <w:left w:val="single" w:color="BBBBBB" w:sz="4"/>
-              <w:bottom w:val="single" w:color="BBBBBB" w:sz="4"/>
-              <w:right w:val="single" w:color="BBBBBB" w:sz="4"/>
-            </w:tcBorders>
-            <w:tcMar>
-              <w:top w:type="dxa" w:w="50"/>
-              <w:left w:type="dxa" w:w="90"/>
-              <w:bottom w:type="dxa" w:w="50"/>
-              <w:right w:type="dxa" w:w="90"/>
-            </w:tcMar>
-          </w:tcPr>
-          <w:p>
-            <w:r>
-              <w:rPr>
-                <w:rFonts w:ascii="Malgun Gothic" w:cs="Malgun Gothic" w:eastAsia="Malgun Gothic" w:hAnsi="Malgun Gothic"/>
-                <w:sz w:val="18"/>
-                <w:szCs w:val="18"/>
-              </w:rPr>
-              <w:t xml:space="preserve">로컬 DB에 01~06 실행 완료, 2026-10-02 변경 SQL(§2.5)까지 반영 → </w:t>
-            </w:r>
-            <w:r>
-              <w:rPr>
-                <w:rFonts w:ascii="Malgun Gothic" w:cs="Malgun Gothic" w:eastAsia="Malgun Gothic" w:hAnsi="Malgun Gothic"/>
-                <w:sz w:val="18"/>
-                <w:szCs w:val="18"/>
-              </w:rPr>
-              <w:t xml:space="preserve">34개 테이블 확인</w:t>
+            <w:tcW w:type="dxa" w:w="8565"/>
+            <w:tcBorders>
+              <w:top w:val="single" w:color="BBBBBB" w:sz="4"/>
+              <w:left w:val="single" w:color="BBBBBB" w:sz="4"/>
+              <w:bottom w:val="single" w:color="BBBBBB" w:sz="4"/>
+              <w:right w:val="single" w:color="BBBBBB" w:sz="4"/>
+            </w:tcBorders>
+            <w:tcMar>
+              <w:top w:type="dxa" w:w="50"/>
+              <w:left w:type="dxa" w:w="90"/>
+              <w:bottom w:type="dxa" w:w="50"/>
+              <w:right w:type="dxa" w:w="90"/>
+            </w:tcMar>
+          </w:tcPr>
+          <w:p>
+            <w:r>
+              <w:rPr>
+                <w:rFonts w:ascii="Malgun Gothic" w:cs="Malgun Gothic" w:eastAsia="Malgun Gothic" w:hAnsi="Malgun Gothic"/>
+                <w:sz w:val="18"/>
+                <w:szCs w:val="18"/>
+              </w:rPr>
+              <w:t xml:space="preserve">로컬 DB에 01~06 실행 완료, 2026-10-02 · 10-03 변경 SQL(§2.5)까지 반영 → </w:t>
+            </w:r>
+            <w:r>
+              <w:rPr>
+                <w:rFonts w:ascii="Malgun Gothic" w:cs="Malgun Gothic" w:eastAsia="Malgun Gothic" w:hAnsi="Malgun Gothic"/>
+                <w:sz w:val="18"/>
+                <w:szCs w:val="18"/>
+              </w:rPr>
+              <w:t xml:space="preserve">35개 테이블 확인</w:t>
             </w:r>
           </w:p>
         </w:tc>
@@ -1944,7 +1944,7 @@
         <w:rPr>
           <w:rFonts w:ascii="Malgun Gothic" w:cs="Malgun Gothic" w:eastAsia="Malgun Gothic" w:hAnsi="Malgun Gothic"/>
         </w:rPr>
-        <w:t xml:space="preserve">확인한 것: 34개 테이블 중복 없음, 모든 외래키 대상이 먼저 생성됨, MySQL 문법 파싱 통과, 로컬 MySQL 8.0에서 실제 실행.</w:t>
+        <w:t xml:space="preserve">확인한 것: 35개 테이블 중복 없음, 모든 외래키 대상이 먼저 생성됨, MySQL 문법 파싱 통과, 로컬 MySQL 8.0에서 실제 실행.</w:t>
       </w:r>
     </w:p>
     <w:p>
@@ -2331,7 +2331,7 @@
           <w:sz w:val="17"/>
           <w:szCs w:val="17"/>
         </w:rPr>
-        <w:t xml:space="preserve">-- 테이블 수 (전부 실행했다면 34)</w:t>
+        <w:t xml:space="preserve">-- 테이블 수 (전부 실행했다면 35)</w:t>
       </w:r>
     </w:p>
     <w:p>
@@ -2527,7 +2527,7 @@
     <w:p>
       <w:pPr>
         <w:shd w:fill="F4F4F6" w:color="auto" w:val="clear"/>
-        <w:spacing w:after="120" w:before="60"/>
+        <w:spacing w:after="0" w:before="60"/>
         <w:ind w:left="120"/>
       </w:pPr>
       <w:r>
@@ -2540,11 +2540,26 @@
       </w:r>
     </w:p>
     <w:p>
+      <w:pPr>
+        <w:shd w:fill="F4F4F6" w:color="auto" w:val="clear"/>
+        <w:spacing w:after="120" w:before="0"/>
+        <w:ind w:left="120"/>
+      </w:pPr>
+      <w:r>
+        <w:rPr>
+          <w:rFonts w:ascii="Consolas" w:cs="Consolas" w:eastAsia="Consolas" w:hAnsi="Consolas"/>
+          <w:sz w:val="17"/>
+          <w:szCs w:val="17"/>
+        </w:rPr>
+        <w:t xml:space="preserve">mysql -u studionx_app -p studionx -e "source db/migrations/2026-10-03_project_sessions.sql"</w:t>
+      </w:r>
+    </w:p>
+    <w:p>
       <w:r>
         <w:rPr>
           <w:rFonts w:ascii="Malgun Gothic" w:cs="Malgun Gothic" w:eastAsia="Malgun Gothic" w:hAnsi="Malgun Gothic"/>
         </w:rPr>
-        <w:t xml:space="preserve">확인: §2.3의 테이블 수가 34이고, 아래 명령 결과로 한 줄이 나오면 정상입니다.</w:t>
+        <w:t xml:space="preserve">확인: §2.3의 테이블 수가 35이고, 아래 명령 결과로 한 줄이 나오면 정상입니다.</w:t>
       </w:r>
     </w:p>
     <w:p>
@@ -2605,9 +2620,9 @@
         <w:tblLayout w:type="fixed"/>
       </w:tblPr>
       <w:tblGrid>
-        <w:gridCol w:w="1816"/>
-        <w:gridCol w:w="4640"/>
-        <w:gridCol w:w="3182"/>
+        <w:gridCol w:w="1836"/>
+        <w:gridCol w:w="5599"/>
+        <w:gridCol w:w="2203"/>
       </w:tblGrid>
       <w:tr>
         <w:trPr>
@@ -2616,7 +2631,7 @@
         </w:trPr>
         <w:tc>
           <w:tcPr>
-            <w:tcW w:type="dxa" w:w="1816"/>
+            <w:tcW w:type="dxa" w:w="1836"/>
             <w:tcBorders>
               <w:top w:val="single" w:color="BBBBBB" w:sz="4"/>
               <w:left w:val="single" w:color="BBBBBB" w:sz="4"/>
@@ -2646,7 +2661,7 @@
         </w:tc>
         <w:tc>
           <w:tcPr>
-            <w:tcW w:type="dxa" w:w="4640"/>
+            <w:tcW w:type="dxa" w:w="5599"/>
             <w:tcBorders>
               <w:top w:val="single" w:color="BBBBBB" w:sz="4"/>
               <w:left w:val="single" w:color="BBBBBB" w:sz="4"/>
@@ -2676,7 +2691,7 @@
         </w:tc>
         <w:tc>
           <w:tcPr>
-            <w:tcW w:type="dxa" w:w="3182"/>
+            <w:tcW w:type="dxa" w:w="2203"/>
             <w:tcBorders>
               <w:top w:val="single" w:color="BBBBBB" w:sz="4"/>
               <w:left w:val="single" w:color="BBBBBB" w:sz="4"/>
@@ -2712,7 +2727,7 @@
         </w:trPr>
         <w:tc>
           <w:tcPr>
-            <w:tcW w:type="dxa" w:w="1816"/>
+            <w:tcW w:type="dxa" w:w="1836"/>
             <w:tcBorders>
               <w:top w:val="single" w:color="BBBBBB" w:sz="4"/>
               <w:left w:val="single" w:color="BBBBBB" w:sz="4"/>
@@ -2740,7 +2755,7 @@
         </w:tc>
         <w:tc>
           <w:tcPr>
-            <w:tcW w:type="dxa" w:w="4640"/>
+            <w:tcW w:type="dxa" w:w="5599"/>
             <w:tcBorders>
               <w:top w:val="single" w:color="BBBBBB" w:sz="4"/>
               <w:left w:val="single" w:color="BBBBBB" w:sz="4"/>
@@ -2767,7 +2782,7 @@
         </w:tc>
         <w:tc>
           <w:tcPr>
-            <w:tcW w:type="dxa" w:w="3182"/>
+            <w:tcW w:type="dxa" w:w="2203"/>
             <w:tcBorders>
               <w:top w:val="single" w:color="BBBBBB" w:sz="4"/>
               <w:left w:val="single" w:color="BBBBBB" w:sz="4"/>
@@ -2800,7 +2815,7 @@
         </w:trPr>
         <w:tc>
           <w:tcPr>
-            <w:tcW w:type="dxa" w:w="1816"/>
+            <w:tcW w:type="dxa" w:w="1836"/>
             <w:tcBorders>
               <w:top w:val="single" w:color="BBBBBB" w:sz="4"/>
               <w:left w:val="single" w:color="BBBBBB" w:sz="4"/>
@@ -2828,7 +2843,7 @@
         </w:tc>
         <w:tc>
           <w:tcPr>
-            <w:tcW w:type="dxa" w:w="4640"/>
+            <w:tcW w:type="dxa" w:w="5599"/>
             <w:tcBorders>
               <w:top w:val="single" w:color="BBBBBB" w:sz="4"/>
               <w:left w:val="single" w:color="BBBBBB" w:sz="4"/>
@@ -2855,7 +2870,7 @@
         </w:tc>
         <w:tc>
           <w:tcPr>
-            <w:tcW w:type="dxa" w:w="3182"/>
+            <w:tcW w:type="dxa" w:w="2203"/>
             <w:tcBorders>
               <w:top w:val="single" w:color="BBBBBB" w:sz="4"/>
               <w:left w:val="single" w:color="BBBBBB" w:sz="4"/>
@@ -2888,7 +2903,7 @@
         </w:trPr>
         <w:tc>
           <w:tcPr>
-            <w:tcW w:type="dxa" w:w="1816"/>
+            <w:tcW w:type="dxa" w:w="1836"/>
             <w:tcBorders>
               <w:top w:val="single" w:color="BBBBBB" w:sz="4"/>
               <w:left w:val="single" w:color="BBBBBB" w:sz="4"/>
@@ -2916,7 +2931,7 @@
         </w:tc>
         <w:tc>
           <w:tcPr>
-            <w:tcW w:type="dxa" w:w="4640"/>
+            <w:tcW w:type="dxa" w:w="5599"/>
             <w:tcBorders>
               <w:top w:val="single" w:color="BBBBBB" w:sz="4"/>
               <w:left w:val="single" w:color="BBBBBB" w:sz="4"/>
@@ -2943,7 +2958,7 @@
         </w:tc>
         <w:tc>
           <w:tcPr>
-            <w:tcW w:type="dxa" w:w="3182"/>
+            <w:tcW w:type="dxa" w:w="2203"/>
             <w:tcBorders>
               <w:top w:val="single" w:color="BBBBBB" w:sz="4"/>
               <w:left w:val="single" w:color="BBBBBB" w:sz="4"/>
@@ -2976,7 +2991,7 @@
         </w:trPr>
         <w:tc>
           <w:tcPr>
-            <w:tcW w:type="dxa" w:w="1816"/>
+            <w:tcW w:type="dxa" w:w="1836"/>
             <w:tcBorders>
               <w:top w:val="single" w:color="BBBBBB" w:sz="4"/>
               <w:left w:val="single" w:color="BBBBBB" w:sz="4"/>
@@ -3004,7 +3019,7 @@
         </w:tc>
         <w:tc>
           <w:tcPr>
-            <w:tcW w:type="dxa" w:w="4640"/>
+            <w:tcW w:type="dxa" w:w="5599"/>
             <w:tcBorders>
               <w:top w:val="single" w:color="BBBBBB" w:sz="4"/>
               <w:left w:val="single" w:color="BBBBBB" w:sz="4"/>
@@ -3031,7 +3046,7 @@
         </w:tc>
         <w:tc>
           <w:tcPr>
-            <w:tcW w:type="dxa" w:w="3182"/>
+            <w:tcW w:type="dxa" w:w="2203"/>
             <w:tcBorders>
               <w:top w:val="single" w:color="BBBBBB" w:sz="4"/>
               <w:left w:val="single" w:color="BBBBBB" w:sz="4"/>
@@ -3064,7 +3079,7 @@
         </w:trPr>
         <w:tc>
           <w:tcPr>
-            <w:tcW w:type="dxa" w:w="1816"/>
+            <w:tcW w:type="dxa" w:w="1836"/>
             <w:tcBorders>
               <w:top w:val="single" w:color="BBBBBB" w:sz="4"/>
               <w:left w:val="single" w:color="BBBBBB" w:sz="4"/>
@@ -3092,7 +3107,7 @@
         </w:tc>
         <w:tc>
           <w:tcPr>
-            <w:tcW w:type="dxa" w:w="4640"/>
+            <w:tcW w:type="dxa" w:w="5599"/>
             <w:tcBorders>
               <w:top w:val="single" w:color="BBBBBB" w:sz="4"/>
               <w:left w:val="single" w:color="BBBBBB" w:sz="4"/>
@@ -3119,7 +3134,7 @@
         </w:tc>
         <w:tc>
           <w:tcPr>
-            <w:tcW w:type="dxa" w:w="3182"/>
+            <w:tcW w:type="dxa" w:w="2203"/>
             <w:tcBorders>
               <w:top w:val="single" w:color="BBBBBB" w:sz="4"/>
               <w:left w:val="single" w:color="BBBBBB" w:sz="4"/>
@@ -3141,6 +3156,94 @@
                 <w:szCs w:val="18"/>
               </w:rPr>
               <w:t xml:space="preserve">PK (project_id, user_id)</w:t>
+            </w:r>
+          </w:p>
+        </w:tc>
+      </w:tr>
+      <w:tr>
+        <w:trPr>
+          <w:cantSplit/>
+          <w:tblHeader w:val="off"/>
+        </w:trPr>
+        <w:tc>
+          <w:tcPr>
+            <w:tcW w:type="dxa" w:w="1836"/>
+            <w:tcBorders>
+              <w:top w:val="single" w:color="BBBBBB" w:sz="4"/>
+              <w:left w:val="single" w:color="BBBBBB" w:sz="4"/>
+              <w:bottom w:val="single" w:color="BBBBBB" w:sz="4"/>
+              <w:right w:val="single" w:color="BBBBBB" w:sz="4"/>
+            </w:tcBorders>
+            <w:tcMar>
+              <w:top w:type="dxa" w:w="50"/>
+              <w:left w:type="dxa" w:w="90"/>
+              <w:bottom w:type="dxa" w:w="50"/>
+              <w:right w:type="dxa" w:w="90"/>
+            </w:tcMar>
+          </w:tcPr>
+          <w:p>
+            <w:r>
+              <w:rPr>
+                <w:rFonts w:ascii="Consolas" w:cs="Consolas" w:eastAsia="Consolas" w:hAnsi="Consolas"/>
+                <w:color w:val="B4235A"/>
+                <w:sz w:val="18"/>
+                <w:szCs w:val="18"/>
+              </w:rPr>
+              <w:t xml:space="preserve">project_sessions</w:t>
+            </w:r>
+          </w:p>
+        </w:tc>
+        <w:tc>
+          <w:tcPr>
+            <w:tcW w:type="dxa" w:w="5599"/>
+            <w:tcBorders>
+              <w:top w:val="single" w:color="BBBBBB" w:sz="4"/>
+              <w:left w:val="single" w:color="BBBBBB" w:sz="4"/>
+              <w:bottom w:val="single" w:color="BBBBBB" w:sz="4"/>
+              <w:right w:val="single" w:color="BBBBBB" w:sz="4"/>
+            </w:tcBorders>
+            <w:tcMar>
+              <w:top w:type="dxa" w:w="50"/>
+              <w:left w:type="dxa" w:w="90"/>
+              <w:bottom w:type="dxa" w:w="50"/>
+              <w:right w:type="dxa" w:w="90"/>
+            </w:tcMar>
+          </w:tcPr>
+          <w:p>
+            <w:r>
+              <w:rPr>
+                <w:rFonts w:ascii="Malgun Gothic" w:cs="Malgun Gothic" w:eastAsia="Malgun Gothic" w:hAnsi="Malgun Gothic"/>
+                <w:sz w:val="18"/>
+                <w:szCs w:val="18"/>
+              </w:rPr>
+              <w:t xml:space="preserve">프로젝트 작업 세션 — 시퀀서(Phase 2)가 기록, 마이페이지가 최근 7일 작업 시간으로 표시</w:t>
+            </w:r>
+          </w:p>
+        </w:tc>
+        <w:tc>
+          <w:tcPr>
+            <w:tcW w:type="dxa" w:w="2203"/>
+            <w:tcBorders>
+              <w:top w:val="single" w:color="BBBBBB" w:sz="4"/>
+              <w:left w:val="single" w:color="BBBBBB" w:sz="4"/>
+              <w:bottom w:val="single" w:color="BBBBBB" w:sz="4"/>
+              <w:right w:val="single" w:color="BBBBBB" w:sz="4"/>
+            </w:tcBorders>
+            <w:tcMar>
+              <w:top w:type="dxa" w:w="50"/>
+              <w:left w:type="dxa" w:w="90"/>
+              <w:bottom w:type="dxa" w:w="50"/>
+              <w:right w:type="dxa" w:w="90"/>
+            </w:tcMar>
+          </w:tcPr>
+          <w:p>
+            <w:r>
+              <w:rPr>
+                <w:rFonts w:ascii="Malgun Gothic" w:cs="Malgun Gothic" w:eastAsia="Malgun Gothic" w:hAnsi="Malgun Gothic"/>
+                <w:sz w:val="18"/>
+                <w:szCs w:val="18"/>
+              </w:rPr>
+              <w:t xml:space="preserve">FK project_id, user_id</w:t>
             </w:r>
           </w:p>
         </w:tc>
@@ -6039,7 +6142,7 @@
       <w:r>
         <w:drawing>
           <wp:inline distT="0" distB="0" distL="0" distR="0">
-            <wp:extent cx="9610725" cy="3971925"/>
+            <wp:extent cx="9610725" cy="3743325"/>
             <wp:effectExtent t="0" r="0" b="0" l="0"/>
             <wp:docPr id="1" name="ERD" descr="Studio Nx ERD" title="ERD"/>
             <wp:cNvGraphicFramePr>
@@ -6064,7 +6167,7 @@
                   <pic:spPr bwMode="auto">
                     <a:xfrm>
                       <a:off x="0" y="0"/>
-                      <a:ext cx="9610725" cy="3971925"/>
+                      <a:ext cx="9610725" cy="3743325"/>
                     </a:xfrm>
                     <a:prstGeom prst="rect">
                       <a:avLst/>
@@ -7018,8 +7121,8 @@
         <w:tblLayout w:type="fixed"/>
       </w:tblPr>
       <w:tblGrid>
-        <w:gridCol w:w="2851"/>
-        <w:gridCol w:w="6787"/>
+        <w:gridCol w:w="2670"/>
+        <w:gridCol w:w="6968"/>
       </w:tblGrid>
       <w:tr>
         <w:trPr>
@@ -7028,7 +7131,7 @@
         </w:trPr>
         <w:tc>
           <w:tcPr>
-            <w:tcW w:type="dxa" w:w="2851"/>
+            <w:tcW w:type="dxa" w:w="2670"/>
             <w:tcBorders>
               <w:top w:val="single" w:color="BBBBBB" w:sz="4"/>
               <w:left w:val="single" w:color="BBBBBB" w:sz="4"/>
@@ -7058,7 +7161,7 @@
         </w:tc>
         <w:tc>
           <w:tcPr>
-            <w:tcW w:type="dxa" w:w="6787"/>
+            <w:tcW w:type="dxa" w:w="6968"/>
             <w:tcBorders>
               <w:top w:val="single" w:color="BBBBBB" w:sz="4"/>
               <w:left w:val="single" w:color="BBBBBB" w:sz="4"/>
@@ -7094,7 +7197,7 @@
         </w:trPr>
         <w:tc>
           <w:tcPr>
-            <w:tcW w:type="dxa" w:w="2851"/>
+            <w:tcW w:type="dxa" w:w="2670"/>
             <w:tcBorders>
               <w:top w:val="single" w:color="BBBBBB" w:sz="4"/>
               <w:left w:val="single" w:color="BBBBBB" w:sz="4"/>
@@ -7121,28 +7224,28 @@
         </w:tc>
         <w:tc>
           <w:tcPr>
-            <w:tcW w:type="dxa" w:w="6787"/>
-            <w:tcBorders>
-              <w:top w:val="single" w:color="BBBBBB" w:sz="4"/>
-              <w:left w:val="single" w:color="BBBBBB" w:sz="4"/>
-              <w:bottom w:val="single" w:color="BBBBBB" w:sz="4"/>
-              <w:right w:val="single" w:color="BBBBBB" w:sz="4"/>
-            </w:tcBorders>
-            <w:tcMar>
-              <w:top w:type="dxa" w:w="50"/>
-              <w:left w:type="dxa" w:w="90"/>
-              <w:bottom w:type="dxa" w:w="50"/>
-              <w:right w:type="dxa" w:w="90"/>
-            </w:tcMar>
-          </w:tcPr>
-          <w:p>
-            <w:r>
-              <w:rPr>
-                <w:rFonts w:ascii="Malgun Gothic" w:cs="Malgun Gothic" w:eastAsia="Malgun Gothic" w:hAnsi="Malgun Gothic"/>
-                <w:sz w:val="18"/>
-                <w:szCs w:val="18"/>
-              </w:rPr>
-              <w:t xml:space="preserve">트랙·클립·패턴·노트·디바이스·오토메이션·씬·멤버·초대·이력·채팅·코멘트·스냅샷·출력이 함께 삭제 (CASCADE)</w:t>
+            <w:tcW w:type="dxa" w:w="6968"/>
+            <w:tcBorders>
+              <w:top w:val="single" w:color="BBBBBB" w:sz="4"/>
+              <w:left w:val="single" w:color="BBBBBB" w:sz="4"/>
+              <w:bottom w:val="single" w:color="BBBBBB" w:sz="4"/>
+              <w:right w:val="single" w:color="BBBBBB" w:sz="4"/>
+            </w:tcBorders>
+            <w:tcMar>
+              <w:top w:type="dxa" w:w="50"/>
+              <w:left w:type="dxa" w:w="90"/>
+              <w:bottom w:type="dxa" w:w="50"/>
+              <w:right w:type="dxa" w:w="90"/>
+            </w:tcMar>
+          </w:tcPr>
+          <w:p>
+            <w:r>
+              <w:rPr>
+                <w:rFonts w:ascii="Malgun Gothic" w:cs="Malgun Gothic" w:eastAsia="Malgun Gothic" w:hAnsi="Malgun Gothic"/>
+                <w:sz w:val="18"/>
+                <w:szCs w:val="18"/>
+              </w:rPr>
+              <w:t xml:space="preserve">트랙·클립·패턴·노트·디바이스·오토메이션·씬·멤버·작업 세션·초대·이력·채팅·코멘트·스냅샷·출력이 함께 삭제 (CASCADE)</w:t>
             </w:r>
           </w:p>
         </w:tc>
@@ -7154,7 +7257,7 @@
         </w:trPr>
         <w:tc>
           <w:tcPr>
-            <w:tcW w:type="dxa" w:w="2851"/>
+            <w:tcW w:type="dxa" w:w="2670"/>
             <w:tcBorders>
               <w:top w:val="single" w:color="BBBBBB" w:sz="4"/>
               <w:left w:val="single" w:color="BBBBBB" w:sz="4"/>
@@ -7181,7 +7284,7 @@
         </w:tc>
         <w:tc>
           <w:tcPr>
-            <w:tcW w:type="dxa" w:w="6787"/>
+            <w:tcW w:type="dxa" w:w="6968"/>
             <w:tcBorders>
               <w:top w:val="single" w:color="BBBBBB" w:sz="4"/>
               <w:left w:val="single" w:color="BBBBBB" w:sz="4"/>
@@ -7223,7 +7326,7 @@
         </w:trPr>
         <w:tc>
           <w:tcPr>
-            <w:tcW w:type="dxa" w:w="2851"/>
+            <w:tcW w:type="dxa" w:w="2670"/>
             <w:tcBorders>
               <w:top w:val="single" w:color="BBBBBB" w:sz="4"/>
               <w:left w:val="single" w:color="BBBBBB" w:sz="4"/>
@@ -7250,7 +7353,7 @@
         </w:tc>
         <w:tc>
           <w:tcPr>
-            <w:tcW w:type="dxa" w:w="6787"/>
+            <w:tcW w:type="dxa" w:w="6968"/>
             <w:tcBorders>
               <w:top w:val="single" w:color="BBBBBB" w:sz="4"/>
               <w:left w:val="single" w:color="BBBBBB" w:sz="4"/>
@@ -7283,7 +7386,7 @@
         </w:trPr>
         <w:tc>
           <w:tcPr>
-            <w:tcW w:type="dxa" w:w="2851"/>
+            <w:tcW w:type="dxa" w:w="2670"/>
             <w:tcBorders>
               <w:top w:val="single" w:color="BBBBBB" w:sz="4"/>
               <w:left w:val="single" w:color="BBBBBB" w:sz="4"/>
@@ -7310,7 +7413,7 @@
         </w:tc>
         <w:tc>
           <w:tcPr>
-            <w:tcW w:type="dxa" w:w="6787"/>
+            <w:tcW w:type="dxa" w:w="6968"/>
             <w:tcBorders>
               <w:top w:val="single" w:color="BBBBBB" w:sz="4"/>
               <w:left w:val="single" w:color="BBBBBB" w:sz="4"/>
@@ -7758,6 +7861,103 @@
                 <w:szCs w:val="18"/>
               </w:rPr>
               <w:t xml:space="preserve">2026-10-02 이전에 01~06을 실행한 DB (로컬 DB 실행 완료)</w:t>
+            </w:r>
+          </w:p>
+        </w:tc>
+      </w:tr>
+      <w:tr>
+        <w:trPr>
+          <w:cantSplit/>
+          <w:tblHeader w:val="off"/>
+        </w:trPr>
+        <w:tc>
+          <w:tcPr>
+            <w:tcW w:type="dxa" w:w="3662"/>
+            <w:tcBorders>
+              <w:top w:val="single" w:color="BBBBBB" w:sz="4"/>
+              <w:left w:val="single" w:color="BBBBBB" w:sz="4"/>
+              <w:bottom w:val="single" w:color="BBBBBB" w:sz="4"/>
+              <w:right w:val="single" w:color="BBBBBB" w:sz="4"/>
+            </w:tcBorders>
+            <w:tcMar>
+              <w:top w:type="dxa" w:w="50"/>
+              <w:left w:type="dxa" w:w="90"/>
+              <w:bottom w:type="dxa" w:w="50"/>
+              <w:right w:type="dxa" w:w="90"/>
+            </w:tcMar>
+          </w:tcPr>
+          <w:p>
+            <w:r>
+              <w:rPr>
+                <w:rFonts w:ascii="Consolas" w:cs="Consolas" w:eastAsia="Consolas" w:hAnsi="Consolas"/>
+                <w:color w:val="B4235A"/>
+                <w:sz w:val="18"/>
+                <w:szCs w:val="18"/>
+              </w:rPr>
+              <w:t xml:space="preserve">migrations/2026-10-03_project_sessions.sql</w:t>
+            </w:r>
+          </w:p>
+        </w:tc>
+        <w:tc>
+          <w:tcPr>
+            <w:tcW w:type="dxa" w:w="3282"/>
+            <w:tcBorders>
+              <w:top w:val="single" w:color="BBBBBB" w:sz="4"/>
+              <w:left w:val="single" w:color="BBBBBB" w:sz="4"/>
+              <w:bottom w:val="single" w:color="BBBBBB" w:sz="4"/>
+              <w:right w:val="single" w:color="BBBBBB" w:sz="4"/>
+            </w:tcBorders>
+            <w:tcMar>
+              <w:top w:type="dxa" w:w="50"/>
+              <w:left w:type="dxa" w:w="90"/>
+              <w:bottom w:type="dxa" w:w="50"/>
+              <w:right w:type="dxa" w:w="90"/>
+            </w:tcMar>
+          </w:tcPr>
+          <w:p>
+            <w:r>
+              <w:rPr>
+                <w:rFonts w:ascii="Consolas" w:cs="Consolas" w:eastAsia="Consolas" w:hAnsi="Consolas"/>
+                <w:color w:val="B4235A"/>
+                <w:sz w:val="18"/>
+                <w:szCs w:val="18"/>
+              </w:rPr>
+              <w:t xml:space="preserve">project_sessions</w:t>
+            </w:r>
+            <w:r>
+              <w:rPr>
+                <w:rFonts w:ascii="Malgun Gothic" w:cs="Malgun Gothic" w:eastAsia="Malgun Gothic" w:hAnsi="Malgun Gothic"/>
+                <w:sz w:val="18"/>
+                <w:szCs w:val="18"/>
+              </w:rPr>
+              <w:t xml:space="preserve"> 생성 (마이페이지 작업 시간, P1-17)</w:t>
+            </w:r>
+          </w:p>
+        </w:tc>
+        <w:tc>
+          <w:tcPr>
+            <w:tcW w:type="dxa" w:w="2694"/>
+            <w:tcBorders>
+              <w:top w:val="single" w:color="BBBBBB" w:sz="4"/>
+              <w:left w:val="single" w:color="BBBBBB" w:sz="4"/>
+              <w:bottom w:val="single" w:color="BBBBBB" w:sz="4"/>
+              <w:right w:val="single" w:color="BBBBBB" w:sz="4"/>
+            </w:tcBorders>
+            <w:tcMar>
+              <w:top w:type="dxa" w:w="50"/>
+              <w:left w:type="dxa" w:w="90"/>
+              <w:bottom w:type="dxa" w:w="50"/>
+              <w:right w:type="dxa" w:w="90"/>
+            </w:tcMar>
+          </w:tcPr>
+          <w:p>
+            <w:r>
+              <w:rPr>
+                <w:rFonts w:ascii="Malgun Gothic" w:cs="Malgun Gothic" w:eastAsia="Malgun Gothic" w:hAnsi="Malgun Gothic"/>
+                <w:sz w:val="18"/>
+                <w:szCs w:val="18"/>
+              </w:rPr>
+              <w:t xml:space="preserve">2026-10-03 이전에 01을 실행한 DB (로컬 DB 실행 완료)</w:t>
             </w:r>
           </w:p>
         </w:tc>

</xml_diff>

<commit_message>
db(phase2): 템포·박자 지도 tempo_changes · meter_changes 추가 (37개 테이블)
- 곡 중간 BPM 변속(STEP/LINEAR)·박자 변경점. 시작 값은 projects.bpm / time_sig_*
- DB.md(표·정의·DDL·삭제 정책·tick 규칙·변경 이력), 02·99 SQL, 변경 SQL migrations/2026-10-05_tempo_meter_changes.sql
- ERD.png·erd.js·ERD.md, DB 가이드 md·PDF·docx (build.js 목록에 DB 가이드 추가), PRD·DB 통합본 PDF
- PRD 02 FR-202a 곡 중간 템포·박자 변경 + 완료 확인 항목
- 로컬 DB 실행 확인: 37개 테이블, CHECK 제약 동작

Co-Authored-By: Claude Opus 5.5 <noreply@anthropic.com>
</commit_message>
<xml_diff>
--- a/studionx/db/docs/StudioNx_DB_Guide.docx
+++ b/studionx/db/docs/StudioNx_DB_Guide.docx
@@ -314,7 +314,7 @@
                 <w:sz w:val="18"/>
                 <w:szCs w:val="18"/>
               </w:rPr>
-              <w:t xml:space="preserve">35개</w:t>
+              <w:t xml:space="preserve">37개</w:t>
             </w:r>
           </w:p>
         </w:tc>
@@ -528,7 +528,7 @@
                 <w:sz w:val="18"/>
                 <w:szCs w:val="18"/>
               </w:rPr>
-              <w:t xml:space="preserve">35개 테이블 확인</w:t>
+              <w:t xml:space="preserve">37개 테이블 확인</w:t>
             </w:r>
           </w:p>
         </w:tc>
@@ -564,11 +564,11 @@
         <w:tblLayout w:type="fixed"/>
       </w:tblPr>
       <w:tblGrid>
-        <w:gridCol w:w="668"/>
-        <w:gridCol w:w="2664"/>
-        <w:gridCol w:w="4142"/>
-        <w:gridCol w:w="680"/>
-        <w:gridCol w:w="1484"/>
+        <w:gridCol w:w="652"/>
+        <w:gridCol w:w="2602"/>
+        <w:gridCol w:w="4410"/>
+        <w:gridCol w:w="664"/>
+        <w:gridCol w:w="1310"/>
       </w:tblGrid>
       <w:tr>
         <w:trPr>
@@ -577,7 +577,7 @@
         </w:trPr>
         <w:tc>
           <w:tcPr>
-            <w:tcW w:type="dxa" w:w="668"/>
+            <w:tcW w:type="dxa" w:w="652"/>
             <w:tcBorders>
               <w:top w:val="single" w:color="BBBBBB" w:sz="4"/>
               <w:left w:val="single" w:color="BBBBBB" w:sz="4"/>
@@ -607,7 +607,7 @@
         </w:tc>
         <w:tc>
           <w:tcPr>
-            <w:tcW w:type="dxa" w:w="2664"/>
+            <w:tcW w:type="dxa" w:w="2602"/>
             <w:tcBorders>
               <w:top w:val="single" w:color="BBBBBB" w:sz="4"/>
               <w:left w:val="single" w:color="BBBBBB" w:sz="4"/>
@@ -637,7 +637,7 @@
         </w:tc>
         <w:tc>
           <w:tcPr>
-            <w:tcW w:type="dxa" w:w="4142"/>
+            <w:tcW w:type="dxa" w:w="4410"/>
             <w:tcBorders>
               <w:top w:val="single" w:color="BBBBBB" w:sz="4"/>
               <w:left w:val="single" w:color="BBBBBB" w:sz="4"/>
@@ -667,7 +667,7 @@
         </w:tc>
         <w:tc>
           <w:tcPr>
-            <w:tcW w:type="dxa" w:w="680"/>
+            <w:tcW w:type="dxa" w:w="664"/>
             <w:tcBorders>
               <w:top w:val="single" w:color="BBBBBB" w:sz="4"/>
               <w:left w:val="single" w:color="BBBBBB" w:sz="4"/>
@@ -697,7 +697,7 @@
         </w:tc>
         <w:tc>
           <w:tcPr>
-            <w:tcW w:type="dxa" w:w="1484"/>
+            <w:tcW w:type="dxa" w:w="1310"/>
             <w:tcBorders>
               <w:top w:val="single" w:color="BBBBBB" w:sz="4"/>
               <w:left w:val="single" w:color="BBBBBB" w:sz="4"/>
@@ -733,7 +733,7 @@
         </w:trPr>
         <w:tc>
           <w:tcPr>
-            <w:tcW w:type="dxa" w:w="668"/>
+            <w:tcW w:type="dxa" w:w="652"/>
             <w:tcBorders>
               <w:top w:val="single" w:color="BBBBBB" w:sz="4"/>
               <w:left w:val="single" w:color="BBBBBB" w:sz="4"/>
@@ -760,7 +760,7 @@
         </w:tc>
         <w:tc>
           <w:tcPr>
-            <w:tcW w:type="dxa" w:w="2664"/>
+            <w:tcW w:type="dxa" w:w="2602"/>
             <w:tcBorders>
               <w:top w:val="single" w:color="BBBBBB" w:sz="4"/>
               <w:left w:val="single" w:color="BBBBBB" w:sz="4"/>
@@ -788,7 +788,7 @@
         </w:tc>
         <w:tc>
           <w:tcPr>
-            <w:tcW w:type="dxa" w:w="4142"/>
+            <w:tcW w:type="dxa" w:w="4410"/>
             <w:tcBorders>
               <w:top w:val="single" w:color="BBBBBB" w:sz="4"/>
               <w:left w:val="single" w:color="BBBBBB" w:sz="4"/>
@@ -849,7 +849,7 @@
         </w:tc>
         <w:tc>
           <w:tcPr>
-            <w:tcW w:type="dxa" w:w="680"/>
+            <w:tcW w:type="dxa" w:w="664"/>
             <w:tcBorders>
               <w:top w:val="single" w:color="BBBBBB" w:sz="4"/>
               <w:left w:val="single" w:color="BBBBBB" w:sz="4"/>
@@ -876,7 +876,7 @@
         </w:tc>
         <w:tc>
           <w:tcPr>
-            <w:tcW w:type="dxa" w:w="1484"/>
+            <w:tcW w:type="dxa" w:w="1310"/>
             <w:tcBorders>
               <w:top w:val="single" w:color="BBBBBB" w:sz="4"/>
               <w:left w:val="single" w:color="BBBBBB" w:sz="4"/>
@@ -909,7 +909,7 @@
         </w:trPr>
         <w:tc>
           <w:tcPr>
-            <w:tcW w:type="dxa" w:w="668"/>
+            <w:tcW w:type="dxa" w:w="652"/>
             <w:tcBorders>
               <w:top w:val="single" w:color="BBBBBB" w:sz="4"/>
               <w:left w:val="single" w:color="BBBBBB" w:sz="4"/>
@@ -936,7 +936,7 @@
         </w:tc>
         <w:tc>
           <w:tcPr>
-            <w:tcW w:type="dxa" w:w="2664"/>
+            <w:tcW w:type="dxa" w:w="2602"/>
             <w:tcBorders>
               <w:top w:val="single" w:color="BBBBBB" w:sz="4"/>
               <w:left w:val="single" w:color="BBBBBB" w:sz="4"/>
@@ -964,7 +964,7 @@
         </w:tc>
         <w:tc>
           <w:tcPr>
-            <w:tcW w:type="dxa" w:w="4142"/>
+            <w:tcW w:type="dxa" w:w="4410"/>
             <w:tcBorders>
               <w:top w:val="single" w:color="BBBBBB" w:sz="4"/>
               <w:left w:val="single" w:color="BBBBBB" w:sz="4"/>
@@ -991,7 +991,7 @@
         </w:tc>
         <w:tc>
           <w:tcPr>
-            <w:tcW w:type="dxa" w:w="680"/>
+            <w:tcW w:type="dxa" w:w="664"/>
             <w:tcBorders>
               <w:top w:val="single" w:color="BBBBBB" w:sz="4"/>
               <w:left w:val="single" w:color="BBBBBB" w:sz="4"/>
@@ -1018,7 +1018,7 @@
         </w:tc>
         <w:tc>
           <w:tcPr>
-            <w:tcW w:type="dxa" w:w="1484"/>
+            <w:tcW w:type="dxa" w:w="1310"/>
             <w:tcBorders>
               <w:top w:val="single" w:color="BBBBBB" w:sz="4"/>
               <w:left w:val="single" w:color="BBBBBB" w:sz="4"/>
@@ -1051,7 +1051,7 @@
         </w:trPr>
         <w:tc>
           <w:tcPr>
-            <w:tcW w:type="dxa" w:w="668"/>
+            <w:tcW w:type="dxa" w:w="652"/>
             <w:tcBorders>
               <w:top w:val="single" w:color="BBBBBB" w:sz="4"/>
               <w:left w:val="single" w:color="BBBBBB" w:sz="4"/>
@@ -1078,7 +1078,7 @@
         </w:tc>
         <w:tc>
           <w:tcPr>
-            <w:tcW w:type="dxa" w:w="2664"/>
+            <w:tcW w:type="dxa" w:w="2602"/>
             <w:tcBorders>
               <w:top w:val="single" w:color="BBBBBB" w:sz="4"/>
               <w:left w:val="single" w:color="BBBBBB" w:sz="4"/>
@@ -1106,61 +1106,61 @@
         </w:tc>
         <w:tc>
           <w:tcPr>
-            <w:tcW w:type="dxa" w:w="4142"/>
-            <w:tcBorders>
-              <w:top w:val="single" w:color="BBBBBB" w:sz="4"/>
-              <w:left w:val="single" w:color="BBBBBB" w:sz="4"/>
-              <w:bottom w:val="single" w:color="BBBBBB" w:sz="4"/>
-              <w:right w:val="single" w:color="BBBBBB" w:sz="4"/>
-            </w:tcBorders>
-            <w:tcMar>
-              <w:top w:type="dxa" w:w="50"/>
-              <w:left w:type="dxa" w:w="90"/>
-              <w:bottom w:type="dxa" w:w="50"/>
-              <w:right w:type="dxa" w:w="90"/>
-            </w:tcMar>
-          </w:tcPr>
-          <w:p>
-            <w:r>
-              <w:rPr>
-                <w:rFonts w:ascii="Malgun Gothic" w:cs="Malgun Gothic" w:eastAsia="Malgun Gothic" w:hAnsi="Malgun Gothic"/>
-                <w:sz w:val="18"/>
-                <w:szCs w:val="18"/>
-              </w:rPr>
-              <w:t xml:space="preserve">샘플·태그·플러그인·트랙·디바이스·패턴·클립·노트·오토메이션·템플릿·UI 설정</w:t>
-            </w:r>
-          </w:p>
-        </w:tc>
-        <w:tc>
-          <w:tcPr>
-            <w:tcW w:type="dxa" w:w="680"/>
-            <w:tcBorders>
-              <w:top w:val="single" w:color="BBBBBB" w:sz="4"/>
-              <w:left w:val="single" w:color="BBBBBB" w:sz="4"/>
-              <w:bottom w:val="single" w:color="BBBBBB" w:sz="4"/>
-              <w:right w:val="single" w:color="BBBBBB" w:sz="4"/>
-            </w:tcBorders>
-            <w:tcMar>
-              <w:top w:type="dxa" w:w="50"/>
-              <w:left w:type="dxa" w:w="90"/>
-              <w:bottom w:type="dxa" w:w="50"/>
-              <w:right w:type="dxa" w:w="90"/>
-            </w:tcMar>
-          </w:tcPr>
-          <w:p>
-            <w:r>
-              <w:rPr>
-                <w:rFonts w:ascii="Malgun Gothic" w:cs="Malgun Gothic" w:eastAsia="Malgun Gothic" w:hAnsi="Malgun Gothic"/>
-                <w:sz w:val="18"/>
-                <w:szCs w:val="18"/>
-              </w:rPr>
-              <w:t xml:space="preserve">16</w:t>
-            </w:r>
-          </w:p>
-        </w:tc>
-        <w:tc>
-          <w:tcPr>
-            <w:tcW w:type="dxa" w:w="1484"/>
+            <w:tcW w:type="dxa" w:w="4410"/>
+            <w:tcBorders>
+              <w:top w:val="single" w:color="BBBBBB" w:sz="4"/>
+              <w:left w:val="single" w:color="BBBBBB" w:sz="4"/>
+              <w:bottom w:val="single" w:color="BBBBBB" w:sz="4"/>
+              <w:right w:val="single" w:color="BBBBBB" w:sz="4"/>
+            </w:tcBorders>
+            <w:tcMar>
+              <w:top w:type="dxa" w:w="50"/>
+              <w:left w:type="dxa" w:w="90"/>
+              <w:bottom w:type="dxa" w:w="50"/>
+              <w:right w:type="dxa" w:w="90"/>
+            </w:tcMar>
+          </w:tcPr>
+          <w:p>
+            <w:r>
+              <w:rPr>
+                <w:rFonts w:ascii="Malgun Gothic" w:cs="Malgun Gothic" w:eastAsia="Malgun Gothic" w:hAnsi="Malgun Gothic"/>
+                <w:sz w:val="18"/>
+                <w:szCs w:val="18"/>
+              </w:rPr>
+              <w:t xml:space="preserve">샘플·태그·플러그인·트랙·디바이스·패턴·클립·노트·오토메이션·템포/박자 지도·템플릿·UI 설정</w:t>
+            </w:r>
+          </w:p>
+        </w:tc>
+        <w:tc>
+          <w:tcPr>
+            <w:tcW w:type="dxa" w:w="664"/>
+            <w:tcBorders>
+              <w:top w:val="single" w:color="BBBBBB" w:sz="4"/>
+              <w:left w:val="single" w:color="BBBBBB" w:sz="4"/>
+              <w:bottom w:val="single" w:color="BBBBBB" w:sz="4"/>
+              <w:right w:val="single" w:color="BBBBBB" w:sz="4"/>
+            </w:tcBorders>
+            <w:tcMar>
+              <w:top w:type="dxa" w:w="50"/>
+              <w:left w:type="dxa" w:w="90"/>
+              <w:bottom w:type="dxa" w:w="50"/>
+              <w:right w:type="dxa" w:w="90"/>
+            </w:tcMar>
+          </w:tcPr>
+          <w:p>
+            <w:r>
+              <w:rPr>
+                <w:rFonts w:ascii="Malgun Gothic" w:cs="Malgun Gothic" w:eastAsia="Malgun Gothic" w:hAnsi="Malgun Gothic"/>
+                <w:sz w:val="18"/>
+                <w:szCs w:val="18"/>
+              </w:rPr>
+              <w:t xml:space="preserve">18</w:t>
+            </w:r>
+          </w:p>
+        </w:tc>
+        <w:tc>
+          <w:tcPr>
+            <w:tcW w:type="dxa" w:w="1310"/>
             <w:tcBorders>
               <w:top w:val="single" w:color="BBBBBB" w:sz="4"/>
               <w:left w:val="single" w:color="BBBBBB" w:sz="4"/>
@@ -1193,7 +1193,7 @@
         </w:trPr>
         <w:tc>
           <w:tcPr>
-            <w:tcW w:type="dxa" w:w="668"/>
+            <w:tcW w:type="dxa" w:w="652"/>
             <w:tcBorders>
               <w:top w:val="single" w:color="BBBBBB" w:sz="4"/>
               <w:left w:val="single" w:color="BBBBBB" w:sz="4"/>
@@ -1220,7 +1220,7 @@
         </w:tc>
         <w:tc>
           <w:tcPr>
-            <w:tcW w:type="dxa" w:w="2664"/>
+            <w:tcW w:type="dxa" w:w="2602"/>
             <w:tcBorders>
               <w:top w:val="single" w:color="BBBBBB" w:sz="4"/>
               <w:left w:val="single" w:color="BBBBBB" w:sz="4"/>
@@ -1248,7 +1248,7 @@
         </w:tc>
         <w:tc>
           <w:tcPr>
-            <w:tcW w:type="dxa" w:w="4142"/>
+            <w:tcW w:type="dxa" w:w="4410"/>
             <w:tcBorders>
               <w:top w:val="single" w:color="BBBBBB" w:sz="4"/>
               <w:left w:val="single" w:color="BBBBBB" w:sz="4"/>
@@ -1275,7 +1275,7 @@
         </w:tc>
         <w:tc>
           <w:tcPr>
-            <w:tcW w:type="dxa" w:w="680"/>
+            <w:tcW w:type="dxa" w:w="664"/>
             <w:tcBorders>
               <w:top w:val="single" w:color="BBBBBB" w:sz="4"/>
               <w:left w:val="single" w:color="BBBBBB" w:sz="4"/>
@@ -1302,7 +1302,7 @@
         </w:tc>
         <w:tc>
           <w:tcPr>
-            <w:tcW w:type="dxa" w:w="1484"/>
+            <w:tcW w:type="dxa" w:w="1310"/>
             <w:tcBorders>
               <w:top w:val="single" w:color="BBBBBB" w:sz="4"/>
               <w:left w:val="single" w:color="BBBBBB" w:sz="4"/>
@@ -1335,7 +1335,7 @@
         </w:trPr>
         <w:tc>
           <w:tcPr>
-            <w:tcW w:type="dxa" w:w="668"/>
+            <w:tcW w:type="dxa" w:w="652"/>
             <w:tcBorders>
               <w:top w:val="single" w:color="BBBBBB" w:sz="4"/>
               <w:left w:val="single" w:color="BBBBBB" w:sz="4"/>
@@ -1362,7 +1362,7 @@
         </w:tc>
         <w:tc>
           <w:tcPr>
-            <w:tcW w:type="dxa" w:w="2664"/>
+            <w:tcW w:type="dxa" w:w="2602"/>
             <w:tcBorders>
               <w:top w:val="single" w:color="BBBBBB" w:sz="4"/>
               <w:left w:val="single" w:color="BBBBBB" w:sz="4"/>
@@ -1390,7 +1390,7 @@
         </w:tc>
         <w:tc>
           <w:tcPr>
-            <w:tcW w:type="dxa" w:w="4142"/>
+            <w:tcW w:type="dxa" w:w="4410"/>
             <w:tcBorders>
               <w:top w:val="single" w:color="BBBBBB" w:sz="4"/>
               <w:left w:val="single" w:color="BBBBBB" w:sz="4"/>
@@ -1417,7 +1417,7 @@
         </w:tc>
         <w:tc>
           <w:tcPr>
-            <w:tcW w:type="dxa" w:w="680"/>
+            <w:tcW w:type="dxa" w:w="664"/>
             <w:tcBorders>
               <w:top w:val="single" w:color="BBBBBB" w:sz="4"/>
               <w:left w:val="single" w:color="BBBBBB" w:sz="4"/>
@@ -1444,7 +1444,7 @@
         </w:tc>
         <w:tc>
           <w:tcPr>
-            <w:tcW w:type="dxa" w:w="1484"/>
+            <w:tcW w:type="dxa" w:w="1310"/>
             <w:tcBorders>
               <w:top w:val="single" w:color="BBBBBB" w:sz="4"/>
               <w:left w:val="single" w:color="BBBBBB" w:sz="4"/>
@@ -1477,7 +1477,7 @@
         </w:trPr>
         <w:tc>
           <w:tcPr>
-            <w:tcW w:type="dxa" w:w="668"/>
+            <w:tcW w:type="dxa" w:w="652"/>
             <w:tcBorders>
               <w:top w:val="single" w:color="BBBBBB" w:sz="4"/>
               <w:left w:val="single" w:color="BBBBBB" w:sz="4"/>
@@ -1504,7 +1504,7 @@
         </w:tc>
         <w:tc>
           <w:tcPr>
-            <w:tcW w:type="dxa" w:w="2664"/>
+            <w:tcW w:type="dxa" w:w="2602"/>
             <w:tcBorders>
               <w:top w:val="single" w:color="BBBBBB" w:sz="4"/>
               <w:left w:val="single" w:color="BBBBBB" w:sz="4"/>
@@ -1532,7 +1532,7 @@
         </w:tc>
         <w:tc>
           <w:tcPr>
-            <w:tcW w:type="dxa" w:w="4142"/>
+            <w:tcW w:type="dxa" w:w="4410"/>
             <w:tcBorders>
               <w:top w:val="single" w:color="BBBBBB" w:sz="4"/>
               <w:left w:val="single" w:color="BBBBBB" w:sz="4"/>
@@ -1559,7 +1559,7 @@
         </w:tc>
         <w:tc>
           <w:tcPr>
-            <w:tcW w:type="dxa" w:w="680"/>
+            <w:tcW w:type="dxa" w:w="664"/>
             <w:tcBorders>
               <w:top w:val="single" w:color="BBBBBB" w:sz="4"/>
               <w:left w:val="single" w:color="BBBBBB" w:sz="4"/>
@@ -1586,7 +1586,7 @@
         </w:tc>
         <w:tc>
           <w:tcPr>
-            <w:tcW w:type="dxa" w:w="1484"/>
+            <w:tcW w:type="dxa" w:w="1310"/>
             <w:tcBorders>
               <w:top w:val="single" w:color="BBBBBB" w:sz="4"/>
               <w:left w:val="single" w:color="BBBBBB" w:sz="4"/>
@@ -1619,7 +1619,7 @@
         </w:trPr>
         <w:tc>
           <w:tcPr>
-            <w:tcW w:type="dxa" w:w="668"/>
+            <w:tcW w:type="dxa" w:w="652"/>
             <w:tcBorders>
               <w:top w:val="single" w:color="BBBBBB" w:sz="4"/>
               <w:left w:val="single" w:color="BBBBBB" w:sz="4"/>
@@ -1646,7 +1646,7 @@
         </w:tc>
         <w:tc>
           <w:tcPr>
-            <w:tcW w:type="dxa" w:w="2664"/>
+            <w:tcW w:type="dxa" w:w="2602"/>
             <w:tcBorders>
               <w:top w:val="single" w:color="BBBBBB" w:sz="4"/>
               <w:left w:val="single" w:color="BBBBBB" w:sz="4"/>
@@ -1674,7 +1674,7 @@
         </w:tc>
         <w:tc>
           <w:tcPr>
-            <w:tcW w:type="dxa" w:w="4142"/>
+            <w:tcW w:type="dxa" w:w="4410"/>
             <w:tcBorders>
               <w:top w:val="single" w:color="BBBBBB" w:sz="4"/>
               <w:left w:val="single" w:color="BBBBBB" w:sz="4"/>
@@ -1701,7 +1701,7 @@
         </w:tc>
         <w:tc>
           <w:tcPr>
-            <w:tcW w:type="dxa" w:w="680"/>
+            <w:tcW w:type="dxa" w:w="664"/>
             <w:tcBorders>
               <w:top w:val="single" w:color="BBBBBB" w:sz="4"/>
               <w:left w:val="single" w:color="BBBBBB" w:sz="4"/>
@@ -1728,7 +1728,7 @@
         </w:tc>
         <w:tc>
           <w:tcPr>
-            <w:tcW w:type="dxa" w:w="1484"/>
+            <w:tcW w:type="dxa" w:w="1310"/>
             <w:tcBorders>
               <w:top w:val="single" w:color="BBBBBB" w:sz="4"/>
               <w:left w:val="single" w:color="BBBBBB" w:sz="4"/>
@@ -1761,7 +1761,7 @@
         </w:trPr>
         <w:tc>
           <w:tcPr>
-            <w:tcW w:type="dxa" w:w="668"/>
+            <w:tcW w:type="dxa" w:w="652"/>
             <w:tcBorders>
               <w:top w:val="single" w:color="BBBBBB" w:sz="4"/>
               <w:left w:val="single" w:color="BBBBBB" w:sz="4"/>
@@ -1788,7 +1788,7 @@
         </w:tc>
         <w:tc>
           <w:tcPr>
-            <w:tcW w:type="dxa" w:w="2664"/>
+            <w:tcW w:type="dxa" w:w="2602"/>
             <w:tcBorders>
               <w:top w:val="single" w:color="BBBBBB" w:sz="4"/>
               <w:left w:val="single" w:color="BBBBBB" w:sz="4"/>
@@ -1816,7 +1816,7 @@
         </w:tc>
         <w:tc>
           <w:tcPr>
-            <w:tcW w:type="dxa" w:w="4142"/>
+            <w:tcW w:type="dxa" w:w="4410"/>
             <w:tcBorders>
               <w:top w:val="single" w:color="BBBBBB" w:sz="4"/>
               <w:left w:val="single" w:color="BBBBBB" w:sz="4"/>
@@ -1843,7 +1843,7 @@
         </w:tc>
         <w:tc>
           <w:tcPr>
-            <w:tcW w:type="dxa" w:w="680"/>
+            <w:tcW w:type="dxa" w:w="664"/>
             <w:tcBorders>
               <w:top w:val="single" w:color="BBBBBB" w:sz="4"/>
               <w:left w:val="single" w:color="BBBBBB" w:sz="4"/>
@@ -1870,7 +1870,7 @@
         </w:tc>
         <w:tc>
           <w:tcPr>
-            <w:tcW w:type="dxa" w:w="1484"/>
+            <w:tcW w:type="dxa" w:w="1310"/>
             <w:tcBorders>
               <w:top w:val="single" w:color="BBBBBB" w:sz="4"/>
               <w:left w:val="single" w:color="BBBBBB" w:sz="4"/>
@@ -1944,7 +1944,7 @@
         <w:rPr>
           <w:rFonts w:ascii="Malgun Gothic" w:cs="Malgun Gothic" w:eastAsia="Malgun Gothic" w:hAnsi="Malgun Gothic"/>
         </w:rPr>
-        <w:t xml:space="preserve">확인한 것: 35개 테이블 중복 없음, 모든 외래키 대상이 먼저 생성됨, MySQL 문법 파싱 통과, 로컬 MySQL 8.0에서 실제 실행.</w:t>
+        <w:t xml:space="preserve">확인한 것: 37개 테이블 중복 없음, 모든 외래키 대상이 먼저 생성됨, MySQL 문법 파싱 통과, 로컬 MySQL 8.0에서 실제 실행.</w:t>
       </w:r>
     </w:p>
     <w:p>
@@ -2557,6 +2557,21 @@
     <w:p>
       <w:pPr>
         <w:shd w:fill="F4F4F6" w:color="auto" w:val="clear"/>
+        <w:spacing w:after="0" w:before="0"/>
+        <w:ind w:left="120"/>
+      </w:pPr>
+      <w:r>
+        <w:rPr>
+          <w:rFonts w:ascii="Consolas" w:cs="Consolas" w:eastAsia="Consolas" w:hAnsi="Consolas"/>
+          <w:sz w:val="17"/>
+          <w:szCs w:val="17"/>
+        </w:rPr>
+        <w:t xml:space="preserve">mysql -u studionx_app -p studionx -e "source db/migrations/2026-10-05_users_privacy_consent.sql"</w:t>
+      </w:r>
+    </w:p>
+    <w:p>
+      <w:pPr>
+        <w:shd w:fill="F4F4F6" w:color="auto" w:val="clear"/>
         <w:spacing w:after="120" w:before="0"/>
         <w:ind w:left="120"/>
       </w:pPr>
@@ -2566,7 +2581,7 @@
           <w:sz w:val="17"/>
           <w:szCs w:val="17"/>
         </w:rPr>
-        <w:t xml:space="preserve">mysql -u studionx_app -p studionx -e "source db/migrations/2026-10-05_users_privacy_consent.sql"</w:t>
+        <w:t xml:space="preserve">mysql -u studionx_app -p studionx -e "source db/migrations/2026-10-05_tempo_meter_changes.sql"</w:t>
       </w:r>
     </w:p>
     <w:p>
@@ -3301,9 +3316,9 @@
         <w:tblLayout w:type="fixed"/>
       </w:tblPr>
       <w:tblGrid>
-        <w:gridCol w:w="2090"/>
-        <w:gridCol w:w="3613"/>
-        <w:gridCol w:w="3935"/>
+        <w:gridCol w:w="2062"/>
+        <w:gridCol w:w="4007"/>
+        <w:gridCol w:w="3569"/>
       </w:tblGrid>
       <w:tr>
         <w:trPr>
@@ -3312,7 +3327,7 @@
         </w:trPr>
         <w:tc>
           <w:tcPr>
-            <w:tcW w:type="dxa" w:w="2090"/>
+            <w:tcW w:type="dxa" w:w="2062"/>
             <w:tcBorders>
               <w:top w:val="single" w:color="BBBBBB" w:sz="4"/>
               <w:left w:val="single" w:color="BBBBBB" w:sz="4"/>
@@ -3342,7 +3357,7 @@
         </w:tc>
         <w:tc>
           <w:tcPr>
-            <w:tcW w:type="dxa" w:w="3613"/>
+            <w:tcW w:type="dxa" w:w="4007"/>
             <w:tcBorders>
               <w:top w:val="single" w:color="BBBBBB" w:sz="4"/>
               <w:left w:val="single" w:color="BBBBBB" w:sz="4"/>
@@ -3372,7 +3387,7 @@
         </w:tc>
         <w:tc>
           <w:tcPr>
-            <w:tcW w:type="dxa" w:w="3935"/>
+            <w:tcW w:type="dxa" w:w="3569"/>
             <w:tcBorders>
               <w:top w:val="single" w:color="BBBBBB" w:sz="4"/>
               <w:left w:val="single" w:color="BBBBBB" w:sz="4"/>
@@ -3408,7 +3423,7 @@
         </w:trPr>
         <w:tc>
           <w:tcPr>
-            <w:tcW w:type="dxa" w:w="2090"/>
+            <w:tcW w:type="dxa" w:w="2062"/>
             <w:tcBorders>
               <w:top w:val="single" w:color="BBBBBB" w:sz="4"/>
               <w:left w:val="single" w:color="BBBBBB" w:sz="4"/>
@@ -3436,7 +3451,7 @@
         </w:tc>
         <w:tc>
           <w:tcPr>
-            <w:tcW w:type="dxa" w:w="3613"/>
+            <w:tcW w:type="dxa" w:w="4007"/>
             <w:tcBorders>
               <w:top w:val="single" w:color="BBBBBB" w:sz="4"/>
               <w:left w:val="single" w:color="BBBBBB" w:sz="4"/>
@@ -3463,7 +3478,7 @@
         </w:tc>
         <w:tc>
           <w:tcPr>
-            <w:tcW w:type="dxa" w:w="3935"/>
+            <w:tcW w:type="dxa" w:w="3569"/>
             <w:tcBorders>
               <w:top w:val="single" w:color="BBBBBB" w:sz="4"/>
               <w:left w:val="single" w:color="BBBBBB" w:sz="4"/>
@@ -3496,7 +3511,7 @@
         </w:trPr>
         <w:tc>
           <w:tcPr>
-            <w:tcW w:type="dxa" w:w="2090"/>
+            <w:tcW w:type="dxa" w:w="2062"/>
             <w:tcBorders>
               <w:top w:val="single" w:color="BBBBBB" w:sz="4"/>
               <w:left w:val="single" w:color="BBBBBB" w:sz="4"/>
@@ -3524,7 +3539,7 @@
         </w:tc>
         <w:tc>
           <w:tcPr>
-            <w:tcW w:type="dxa" w:w="3613"/>
+            <w:tcW w:type="dxa" w:w="4007"/>
             <w:tcBorders>
               <w:top w:val="single" w:color="BBBBBB" w:sz="4"/>
               <w:left w:val="single" w:color="BBBBBB" w:sz="4"/>
@@ -3551,7 +3566,7 @@
         </w:tc>
         <w:tc>
           <w:tcPr>
-            <w:tcW w:type="dxa" w:w="3935"/>
+            <w:tcW w:type="dxa" w:w="3569"/>
             <w:tcBorders>
               <w:top w:val="single" w:color="BBBBBB" w:sz="4"/>
               <w:left w:val="single" w:color="BBBBBB" w:sz="4"/>
@@ -3584,7 +3599,7 @@
         </w:trPr>
         <w:tc>
           <w:tcPr>
-            <w:tcW w:type="dxa" w:w="2090"/>
+            <w:tcW w:type="dxa" w:w="2062"/>
             <w:tcBorders>
               <w:top w:val="single" w:color="BBBBBB" w:sz="4"/>
               <w:left w:val="single" w:color="BBBBBB" w:sz="4"/>
@@ -3612,7 +3627,7 @@
         </w:tc>
         <w:tc>
           <w:tcPr>
-            <w:tcW w:type="dxa" w:w="3613"/>
+            <w:tcW w:type="dxa" w:w="4007"/>
             <w:tcBorders>
               <w:top w:val="single" w:color="BBBBBB" w:sz="4"/>
               <w:left w:val="single" w:color="BBBBBB" w:sz="4"/>
@@ -3639,7 +3654,7 @@
         </w:tc>
         <w:tc>
           <w:tcPr>
-            <w:tcW w:type="dxa" w:w="3935"/>
+            <w:tcW w:type="dxa" w:w="3569"/>
             <w:tcBorders>
               <w:top w:val="single" w:color="BBBBBB" w:sz="4"/>
               <w:left w:val="single" w:color="BBBBBB" w:sz="4"/>
@@ -3672,7 +3687,7 @@
         </w:trPr>
         <w:tc>
           <w:tcPr>
-            <w:tcW w:type="dxa" w:w="2090"/>
+            <w:tcW w:type="dxa" w:w="2062"/>
             <w:tcBorders>
               <w:top w:val="single" w:color="BBBBBB" w:sz="4"/>
               <w:left w:val="single" w:color="BBBBBB" w:sz="4"/>
@@ -3700,7 +3715,7 @@
         </w:tc>
         <w:tc>
           <w:tcPr>
-            <w:tcW w:type="dxa" w:w="3613"/>
+            <w:tcW w:type="dxa" w:w="4007"/>
             <w:tcBorders>
               <w:top w:val="single" w:color="BBBBBB" w:sz="4"/>
               <w:left w:val="single" w:color="BBBBBB" w:sz="4"/>
@@ -3727,7 +3742,7 @@
         </w:tc>
         <w:tc>
           <w:tcPr>
-            <w:tcW w:type="dxa" w:w="3935"/>
+            <w:tcW w:type="dxa" w:w="3569"/>
             <w:tcBorders>
               <w:top w:val="single" w:color="BBBBBB" w:sz="4"/>
               <w:left w:val="single" w:color="BBBBBB" w:sz="4"/>
@@ -3760,7 +3775,7 @@
         </w:trPr>
         <w:tc>
           <w:tcPr>
-            <w:tcW w:type="dxa" w:w="2090"/>
+            <w:tcW w:type="dxa" w:w="2062"/>
             <w:tcBorders>
               <w:top w:val="single" w:color="BBBBBB" w:sz="4"/>
               <w:left w:val="single" w:color="BBBBBB" w:sz="4"/>
@@ -3788,7 +3803,7 @@
         </w:tc>
         <w:tc>
           <w:tcPr>
-            <w:tcW w:type="dxa" w:w="3613"/>
+            <w:tcW w:type="dxa" w:w="4007"/>
             <w:tcBorders>
               <w:top w:val="single" w:color="BBBBBB" w:sz="4"/>
               <w:left w:val="single" w:color="BBBBBB" w:sz="4"/>
@@ -3815,7 +3830,7 @@
         </w:tc>
         <w:tc>
           <w:tcPr>
-            <w:tcW w:type="dxa" w:w="3935"/>
+            <w:tcW w:type="dxa" w:w="3569"/>
             <w:tcBorders>
               <w:top w:val="single" w:color="BBBBBB" w:sz="4"/>
               <w:left w:val="single" w:color="BBBBBB" w:sz="4"/>
@@ -3848,7 +3863,7 @@
         </w:trPr>
         <w:tc>
           <w:tcPr>
-            <w:tcW w:type="dxa" w:w="2090"/>
+            <w:tcW w:type="dxa" w:w="2062"/>
             <w:tcBorders>
               <w:top w:val="single" w:color="BBBBBB" w:sz="4"/>
               <w:left w:val="single" w:color="BBBBBB" w:sz="4"/>
@@ -3876,7 +3891,7 @@
         </w:tc>
         <w:tc>
           <w:tcPr>
-            <w:tcW w:type="dxa" w:w="3613"/>
+            <w:tcW w:type="dxa" w:w="4007"/>
             <w:tcBorders>
               <w:top w:val="single" w:color="BBBBBB" w:sz="4"/>
               <w:left w:val="single" w:color="BBBBBB" w:sz="4"/>
@@ -3903,7 +3918,7 @@
         </w:tc>
         <w:tc>
           <w:tcPr>
-            <w:tcW w:type="dxa" w:w="3935"/>
+            <w:tcW w:type="dxa" w:w="3569"/>
             <w:tcBorders>
               <w:top w:val="single" w:color="BBBBBB" w:sz="4"/>
               <w:left w:val="single" w:color="BBBBBB" w:sz="4"/>
@@ -3936,7 +3951,7 @@
         </w:trPr>
         <w:tc>
           <w:tcPr>
-            <w:tcW w:type="dxa" w:w="2090"/>
+            <w:tcW w:type="dxa" w:w="2062"/>
             <w:tcBorders>
               <w:top w:val="single" w:color="BBBBBB" w:sz="4"/>
               <w:left w:val="single" w:color="BBBBBB" w:sz="4"/>
@@ -3964,7 +3979,7 @@
         </w:tc>
         <w:tc>
           <w:tcPr>
-            <w:tcW w:type="dxa" w:w="3613"/>
+            <w:tcW w:type="dxa" w:w="4007"/>
             <w:tcBorders>
               <w:top w:val="single" w:color="BBBBBB" w:sz="4"/>
               <w:left w:val="single" w:color="BBBBBB" w:sz="4"/>
@@ -3991,7 +4006,7 @@
         </w:tc>
         <w:tc>
           <w:tcPr>
-            <w:tcW w:type="dxa" w:w="3935"/>
+            <w:tcW w:type="dxa" w:w="3569"/>
             <w:tcBorders>
               <w:top w:val="single" w:color="BBBBBB" w:sz="4"/>
               <w:left w:val="single" w:color="BBBBBB" w:sz="4"/>
@@ -4024,7 +4039,7 @@
         </w:trPr>
         <w:tc>
           <w:tcPr>
-            <w:tcW w:type="dxa" w:w="2090"/>
+            <w:tcW w:type="dxa" w:w="2062"/>
             <w:tcBorders>
               <w:top w:val="single" w:color="BBBBBB" w:sz="4"/>
               <w:left w:val="single" w:color="BBBBBB" w:sz="4"/>
@@ -4052,7 +4067,7 @@
         </w:tc>
         <w:tc>
           <w:tcPr>
-            <w:tcW w:type="dxa" w:w="3613"/>
+            <w:tcW w:type="dxa" w:w="4007"/>
             <w:tcBorders>
               <w:top w:val="single" w:color="BBBBBB" w:sz="4"/>
               <w:left w:val="single" w:color="BBBBBB" w:sz="4"/>
@@ -4079,7 +4094,7 @@
         </w:tc>
         <w:tc>
           <w:tcPr>
-            <w:tcW w:type="dxa" w:w="3935"/>
+            <w:tcW w:type="dxa" w:w="3569"/>
             <w:tcBorders>
               <w:top w:val="single" w:color="BBBBBB" w:sz="4"/>
               <w:left w:val="single" w:color="BBBBBB" w:sz="4"/>
@@ -4112,7 +4127,7 @@
         </w:trPr>
         <w:tc>
           <w:tcPr>
-            <w:tcW w:type="dxa" w:w="2090"/>
+            <w:tcW w:type="dxa" w:w="2062"/>
             <w:tcBorders>
               <w:top w:val="single" w:color="BBBBBB" w:sz="4"/>
               <w:left w:val="single" w:color="BBBBBB" w:sz="4"/>
@@ -4140,7 +4155,7 @@
         </w:tc>
         <w:tc>
           <w:tcPr>
-            <w:tcW w:type="dxa" w:w="3613"/>
+            <w:tcW w:type="dxa" w:w="4007"/>
             <w:tcBorders>
               <w:top w:val="single" w:color="BBBBBB" w:sz="4"/>
               <w:left w:val="single" w:color="BBBBBB" w:sz="4"/>
@@ -4167,7 +4182,7 @@
         </w:tc>
         <w:tc>
           <w:tcPr>
-            <w:tcW w:type="dxa" w:w="3935"/>
+            <w:tcW w:type="dxa" w:w="3569"/>
             <w:tcBorders>
               <w:top w:val="single" w:color="BBBBBB" w:sz="4"/>
               <w:left w:val="single" w:color="BBBBBB" w:sz="4"/>
@@ -4200,7 +4215,7 @@
         </w:trPr>
         <w:tc>
           <w:tcPr>
-            <w:tcW w:type="dxa" w:w="2090"/>
+            <w:tcW w:type="dxa" w:w="2062"/>
             <w:tcBorders>
               <w:top w:val="single" w:color="BBBBBB" w:sz="4"/>
               <w:left w:val="single" w:color="BBBBBB" w:sz="4"/>
@@ -4228,7 +4243,7 @@
         </w:tc>
         <w:tc>
           <w:tcPr>
-            <w:tcW w:type="dxa" w:w="3613"/>
+            <w:tcW w:type="dxa" w:w="4007"/>
             <w:tcBorders>
               <w:top w:val="single" w:color="BBBBBB" w:sz="4"/>
               <w:left w:val="single" w:color="BBBBBB" w:sz="4"/>
@@ -4255,7 +4270,7 @@
         </w:tc>
         <w:tc>
           <w:tcPr>
-            <w:tcW w:type="dxa" w:w="3935"/>
+            <w:tcW w:type="dxa" w:w="3569"/>
             <w:tcBorders>
               <w:top w:val="single" w:color="BBBBBB" w:sz="4"/>
               <w:left w:val="single" w:color="BBBBBB" w:sz="4"/>
@@ -4288,7 +4303,7 @@
         </w:trPr>
         <w:tc>
           <w:tcPr>
-            <w:tcW w:type="dxa" w:w="2090"/>
+            <w:tcW w:type="dxa" w:w="2062"/>
             <w:tcBorders>
               <w:top w:val="single" w:color="BBBBBB" w:sz="4"/>
               <w:left w:val="single" w:color="BBBBBB" w:sz="4"/>
@@ -4316,7 +4331,7 @@
         </w:tc>
         <w:tc>
           <w:tcPr>
-            <w:tcW w:type="dxa" w:w="3613"/>
+            <w:tcW w:type="dxa" w:w="4007"/>
             <w:tcBorders>
               <w:top w:val="single" w:color="BBBBBB" w:sz="4"/>
               <w:left w:val="single" w:color="BBBBBB" w:sz="4"/>
@@ -4343,7 +4358,7 @@
         </w:tc>
         <w:tc>
           <w:tcPr>
-            <w:tcW w:type="dxa" w:w="3935"/>
+            <w:tcW w:type="dxa" w:w="3569"/>
             <w:tcBorders>
               <w:top w:val="single" w:color="BBBBBB" w:sz="4"/>
               <w:left w:val="single" w:color="BBBBBB" w:sz="4"/>
@@ -4376,7 +4391,7 @@
         </w:trPr>
         <w:tc>
           <w:tcPr>
-            <w:tcW w:type="dxa" w:w="2090"/>
+            <w:tcW w:type="dxa" w:w="2062"/>
             <w:tcBorders>
               <w:top w:val="single" w:color="BBBBBB" w:sz="4"/>
               <w:left w:val="single" w:color="BBBBBB" w:sz="4"/>
@@ -4404,7 +4419,7 @@
         </w:tc>
         <w:tc>
           <w:tcPr>
-            <w:tcW w:type="dxa" w:w="3613"/>
+            <w:tcW w:type="dxa" w:w="4007"/>
             <w:tcBorders>
               <w:top w:val="single" w:color="BBBBBB" w:sz="4"/>
               <w:left w:val="single" w:color="BBBBBB" w:sz="4"/>
@@ -4431,7 +4446,7 @@
         </w:tc>
         <w:tc>
           <w:tcPr>
-            <w:tcW w:type="dxa" w:w="3935"/>
+            <w:tcW w:type="dxa" w:w="3569"/>
             <w:tcBorders>
               <w:top w:val="single" w:color="BBBBBB" w:sz="4"/>
               <w:left w:val="single" w:color="BBBBBB" w:sz="4"/>
@@ -4464,7 +4479,7 @@
         </w:trPr>
         <w:tc>
           <w:tcPr>
-            <w:tcW w:type="dxa" w:w="2090"/>
+            <w:tcW w:type="dxa" w:w="2062"/>
             <w:tcBorders>
               <w:top w:val="single" w:color="BBBBBB" w:sz="4"/>
               <w:left w:val="single" w:color="BBBBBB" w:sz="4"/>
@@ -4492,7 +4507,7 @@
         </w:tc>
         <w:tc>
           <w:tcPr>
-            <w:tcW w:type="dxa" w:w="3613"/>
+            <w:tcW w:type="dxa" w:w="4007"/>
             <w:tcBorders>
               <w:top w:val="single" w:color="BBBBBB" w:sz="4"/>
               <w:left w:val="single" w:color="BBBBBB" w:sz="4"/>
@@ -4519,7 +4534,7 @@
         </w:tc>
         <w:tc>
           <w:tcPr>
-            <w:tcW w:type="dxa" w:w="3935"/>
+            <w:tcW w:type="dxa" w:w="3569"/>
             <w:tcBorders>
               <w:top w:val="single" w:color="BBBBBB" w:sz="4"/>
               <w:left w:val="single" w:color="BBBBBB" w:sz="4"/>
@@ -4552,7 +4567,7 @@
         </w:trPr>
         <w:tc>
           <w:tcPr>
-            <w:tcW w:type="dxa" w:w="2090"/>
+            <w:tcW w:type="dxa" w:w="2062"/>
             <w:tcBorders>
               <w:top w:val="single" w:color="BBBBBB" w:sz="4"/>
               <w:left w:val="single" w:color="BBBBBB" w:sz="4"/>
@@ -4580,7 +4595,7 @@
         </w:tc>
         <w:tc>
           <w:tcPr>
-            <w:tcW w:type="dxa" w:w="3613"/>
+            <w:tcW w:type="dxa" w:w="4007"/>
             <w:tcBorders>
               <w:top w:val="single" w:color="BBBBBB" w:sz="4"/>
               <w:left w:val="single" w:color="BBBBBB" w:sz="4"/>
@@ -4607,7 +4622,7 @@
         </w:tc>
         <w:tc>
           <w:tcPr>
-            <w:tcW w:type="dxa" w:w="3935"/>
+            <w:tcW w:type="dxa" w:w="3569"/>
             <w:tcBorders>
               <w:top w:val="single" w:color="BBBBBB" w:sz="4"/>
               <w:left w:val="single" w:color="BBBBBB" w:sz="4"/>
@@ -4640,7 +4655,7 @@
         </w:trPr>
         <w:tc>
           <w:tcPr>
-            <w:tcW w:type="dxa" w:w="2090"/>
+            <w:tcW w:type="dxa" w:w="2062"/>
             <w:tcBorders>
               <w:top w:val="single" w:color="BBBBBB" w:sz="4"/>
               <w:left w:val="single" w:color="BBBBBB" w:sz="4"/>
@@ -4662,61 +4677,78 @@
                 <w:sz w:val="18"/>
                 <w:szCs w:val="18"/>
               </w:rPr>
-              <w:t xml:space="preserve">project_templates</w:t>
-            </w:r>
-          </w:p>
-        </w:tc>
-        <w:tc>
-          <w:tcPr>
-            <w:tcW w:type="dxa" w:w="3613"/>
-            <w:tcBorders>
-              <w:top w:val="single" w:color="BBBBBB" w:sz="4"/>
-              <w:left w:val="single" w:color="BBBBBB" w:sz="4"/>
-              <w:bottom w:val="single" w:color="BBBBBB" w:sz="4"/>
-              <w:right w:val="single" w:color="BBBBBB" w:sz="4"/>
-            </w:tcBorders>
-            <w:tcMar>
-              <w:top w:type="dxa" w:w="50"/>
-              <w:left w:type="dxa" w:w="90"/>
-              <w:bottom w:type="dxa" w:w="50"/>
-              <w:right w:type="dxa" w:w="90"/>
-            </w:tcMar>
-          </w:tcPr>
-          <w:p>
-            <w:r>
-              <w:rPr>
-                <w:rFonts w:ascii="Malgun Gothic" w:cs="Malgun Gothic" w:eastAsia="Malgun Gothic" w:hAnsi="Malgun Gothic"/>
-                <w:sz w:val="18"/>
-                <w:szCs w:val="18"/>
-              </w:rPr>
-              <w:t xml:space="preserve">프로젝트 템플릿</w:t>
-            </w:r>
-          </w:p>
-        </w:tc>
-        <w:tc>
-          <w:tcPr>
-            <w:tcW w:type="dxa" w:w="3935"/>
-            <w:tcBorders>
-              <w:top w:val="single" w:color="BBBBBB" w:sz="4"/>
-              <w:left w:val="single" w:color="BBBBBB" w:sz="4"/>
-              <w:bottom w:val="single" w:color="BBBBBB" w:sz="4"/>
-              <w:right w:val="single" w:color="BBBBBB" w:sz="4"/>
-            </w:tcBorders>
-            <w:tcMar>
-              <w:top w:type="dxa" w:w="50"/>
-              <w:left w:type="dxa" w:w="90"/>
-              <w:bottom w:type="dxa" w:w="50"/>
-              <w:right w:type="dxa" w:w="90"/>
-            </w:tcMar>
-          </w:tcPr>
-          <w:p>
-            <w:r>
-              <w:rPr>
-                <w:rFonts w:ascii="Malgun Gothic" w:cs="Malgun Gothic" w:eastAsia="Malgun Gothic" w:hAnsi="Malgun Gothic"/>
-                <w:sz w:val="18"/>
-                <w:szCs w:val="18"/>
-              </w:rPr>
-              <w:t xml:space="preserve">FK owner_id, genre_tag_id</w:t>
+              <w:t xml:space="preserve">tempo_changes</w:t>
+            </w:r>
+          </w:p>
+        </w:tc>
+        <w:tc>
+          <w:tcPr>
+            <w:tcW w:type="dxa" w:w="4007"/>
+            <w:tcBorders>
+              <w:top w:val="single" w:color="BBBBBB" w:sz="4"/>
+              <w:left w:val="single" w:color="BBBBBB" w:sz="4"/>
+              <w:bottom w:val="single" w:color="BBBBBB" w:sz="4"/>
+              <w:right w:val="single" w:color="BBBBBB" w:sz="4"/>
+            </w:tcBorders>
+            <w:tcMar>
+              <w:top w:type="dxa" w:w="50"/>
+              <w:left w:type="dxa" w:w="90"/>
+              <w:bottom w:type="dxa" w:w="50"/>
+              <w:right w:type="dxa" w:w="90"/>
+            </w:tcMar>
+          </w:tcPr>
+          <w:p>
+            <w:r>
+              <w:rPr>
+                <w:rFonts w:ascii="Malgun Gothic" w:cs="Malgun Gothic" w:eastAsia="Malgun Gothic" w:hAnsi="Malgun Gothic"/>
+                <w:sz w:val="18"/>
+                <w:szCs w:val="18"/>
+              </w:rPr>
+              <w:t xml:space="preserve">곡 중간 템포 변경점 (시작 템포는 </w:t>
+            </w:r>
+            <w:r>
+              <w:rPr>
+                <w:rFonts w:ascii="Consolas" w:cs="Consolas" w:eastAsia="Consolas" w:hAnsi="Consolas"/>
+                <w:color w:val="B4235A"/>
+                <w:sz w:val="18"/>
+                <w:szCs w:val="18"/>
+              </w:rPr>
+              <w:t xml:space="preserve">projects.bpm</w:t>
+            </w:r>
+            <w:r>
+              <w:rPr>
+                <w:rFonts w:ascii="Malgun Gothic" w:cs="Malgun Gothic" w:eastAsia="Malgun Gothic" w:hAnsi="Malgun Gothic"/>
+                <w:sz w:val="18"/>
+                <w:szCs w:val="18"/>
+              </w:rPr>
+              <w:t xml:space="preserve">)</w:t>
+            </w:r>
+          </w:p>
+        </w:tc>
+        <w:tc>
+          <w:tcPr>
+            <w:tcW w:type="dxa" w:w="3569"/>
+            <w:tcBorders>
+              <w:top w:val="single" w:color="BBBBBB" w:sz="4"/>
+              <w:left w:val="single" w:color="BBBBBB" w:sz="4"/>
+              <w:bottom w:val="single" w:color="BBBBBB" w:sz="4"/>
+              <w:right w:val="single" w:color="BBBBBB" w:sz="4"/>
+            </w:tcBorders>
+            <w:tcMar>
+              <w:top w:type="dxa" w:w="50"/>
+              <w:left w:type="dxa" w:w="90"/>
+              <w:bottom w:type="dxa" w:w="50"/>
+              <w:right w:type="dxa" w:w="90"/>
+            </w:tcMar>
+          </w:tcPr>
+          <w:p>
+            <w:r>
+              <w:rPr>
+                <w:rFonts w:ascii="Malgun Gothic" w:cs="Malgun Gothic" w:eastAsia="Malgun Gothic" w:hAnsi="Malgun Gothic"/>
+                <w:sz w:val="18"/>
+                <w:szCs w:val="18"/>
+              </w:rPr>
+              <w:t xml:space="preserve">FK project_id, UQ (project_id, tick)</w:t>
             </w:r>
           </w:p>
         </w:tc>
@@ -4728,7 +4760,7 @@
         </w:trPr>
         <w:tc>
           <w:tcPr>
-            <w:tcW w:type="dxa" w:w="2090"/>
+            <w:tcW w:type="dxa" w:w="2062"/>
             <w:tcBorders>
               <w:top w:val="single" w:color="BBBBBB" w:sz="4"/>
               <w:left w:val="single" w:color="BBBBBB" w:sz="4"/>
@@ -4750,13 +4782,206 @@
                 <w:sz w:val="18"/>
                 <w:szCs w:val="18"/>
               </w:rPr>
+              <w:t xml:space="preserve">meter_changes</w:t>
+            </w:r>
+          </w:p>
+        </w:tc>
+        <w:tc>
+          <w:tcPr>
+            <w:tcW w:type="dxa" w:w="4007"/>
+            <w:tcBorders>
+              <w:top w:val="single" w:color="BBBBBB" w:sz="4"/>
+              <w:left w:val="single" w:color="BBBBBB" w:sz="4"/>
+              <w:bottom w:val="single" w:color="BBBBBB" w:sz="4"/>
+              <w:right w:val="single" w:color="BBBBBB" w:sz="4"/>
+            </w:tcBorders>
+            <w:tcMar>
+              <w:top w:type="dxa" w:w="50"/>
+              <w:left w:type="dxa" w:w="90"/>
+              <w:bottom w:type="dxa" w:w="50"/>
+              <w:right w:type="dxa" w:w="90"/>
+            </w:tcMar>
+          </w:tcPr>
+          <w:p>
+            <w:r>
+              <w:rPr>
+                <w:rFonts w:ascii="Malgun Gothic" w:cs="Malgun Gothic" w:eastAsia="Malgun Gothic" w:hAnsi="Malgun Gothic"/>
+                <w:sz w:val="18"/>
+                <w:szCs w:val="18"/>
+              </w:rPr>
+              <w:t xml:space="preserve">곡 중간 박자 변경점 (시작 박자는 </w:t>
+            </w:r>
+            <w:r>
+              <w:rPr>
+                <w:rFonts w:ascii="Consolas" w:cs="Consolas" w:eastAsia="Consolas" w:hAnsi="Consolas"/>
+                <w:color w:val="B4235A"/>
+                <w:sz w:val="18"/>
+                <w:szCs w:val="18"/>
+              </w:rPr>
+              <w:t xml:space="preserve">projects.time_sig_*</w:t>
+            </w:r>
+            <w:r>
+              <w:rPr>
+                <w:rFonts w:ascii="Malgun Gothic" w:cs="Malgun Gothic" w:eastAsia="Malgun Gothic" w:hAnsi="Malgun Gothic"/>
+                <w:sz w:val="18"/>
+                <w:szCs w:val="18"/>
+              </w:rPr>
+              <w:t xml:space="preserve">)</w:t>
+            </w:r>
+          </w:p>
+        </w:tc>
+        <w:tc>
+          <w:tcPr>
+            <w:tcW w:type="dxa" w:w="3569"/>
+            <w:tcBorders>
+              <w:top w:val="single" w:color="BBBBBB" w:sz="4"/>
+              <w:left w:val="single" w:color="BBBBBB" w:sz="4"/>
+              <w:bottom w:val="single" w:color="BBBBBB" w:sz="4"/>
+              <w:right w:val="single" w:color="BBBBBB" w:sz="4"/>
+            </w:tcBorders>
+            <w:tcMar>
+              <w:top w:type="dxa" w:w="50"/>
+              <w:left w:type="dxa" w:w="90"/>
+              <w:bottom w:type="dxa" w:w="50"/>
+              <w:right w:type="dxa" w:w="90"/>
+            </w:tcMar>
+          </w:tcPr>
+          <w:p>
+            <w:r>
+              <w:rPr>
+                <w:rFonts w:ascii="Malgun Gothic" w:cs="Malgun Gothic" w:eastAsia="Malgun Gothic" w:hAnsi="Malgun Gothic"/>
+                <w:sz w:val="18"/>
+                <w:szCs w:val="18"/>
+              </w:rPr>
+              <w:t xml:space="preserve">FK project_id, UQ (project_id, tick)</w:t>
+            </w:r>
+          </w:p>
+        </w:tc>
+      </w:tr>
+      <w:tr>
+        <w:trPr>
+          <w:cantSplit/>
+          <w:tblHeader w:val="off"/>
+        </w:trPr>
+        <w:tc>
+          <w:tcPr>
+            <w:tcW w:type="dxa" w:w="2062"/>
+            <w:tcBorders>
+              <w:top w:val="single" w:color="BBBBBB" w:sz="4"/>
+              <w:left w:val="single" w:color="BBBBBB" w:sz="4"/>
+              <w:bottom w:val="single" w:color="BBBBBB" w:sz="4"/>
+              <w:right w:val="single" w:color="BBBBBB" w:sz="4"/>
+            </w:tcBorders>
+            <w:tcMar>
+              <w:top w:type="dxa" w:w="50"/>
+              <w:left w:type="dxa" w:w="90"/>
+              <w:bottom w:type="dxa" w:w="50"/>
+              <w:right w:type="dxa" w:w="90"/>
+            </w:tcMar>
+          </w:tcPr>
+          <w:p>
+            <w:r>
+              <w:rPr>
+                <w:rFonts w:ascii="Consolas" w:cs="Consolas" w:eastAsia="Consolas" w:hAnsi="Consolas"/>
+                <w:color w:val="B4235A"/>
+                <w:sz w:val="18"/>
+                <w:szCs w:val="18"/>
+              </w:rPr>
+              <w:t xml:space="preserve">project_templates</w:t>
+            </w:r>
+          </w:p>
+        </w:tc>
+        <w:tc>
+          <w:tcPr>
+            <w:tcW w:type="dxa" w:w="4007"/>
+            <w:tcBorders>
+              <w:top w:val="single" w:color="BBBBBB" w:sz="4"/>
+              <w:left w:val="single" w:color="BBBBBB" w:sz="4"/>
+              <w:bottom w:val="single" w:color="BBBBBB" w:sz="4"/>
+              <w:right w:val="single" w:color="BBBBBB" w:sz="4"/>
+            </w:tcBorders>
+            <w:tcMar>
+              <w:top w:type="dxa" w:w="50"/>
+              <w:left w:type="dxa" w:w="90"/>
+              <w:bottom w:type="dxa" w:w="50"/>
+              <w:right w:type="dxa" w:w="90"/>
+            </w:tcMar>
+          </w:tcPr>
+          <w:p>
+            <w:r>
+              <w:rPr>
+                <w:rFonts w:ascii="Malgun Gothic" w:cs="Malgun Gothic" w:eastAsia="Malgun Gothic" w:hAnsi="Malgun Gothic"/>
+                <w:sz w:val="18"/>
+                <w:szCs w:val="18"/>
+              </w:rPr>
+              <w:t xml:space="preserve">프로젝트 템플릿</w:t>
+            </w:r>
+          </w:p>
+        </w:tc>
+        <w:tc>
+          <w:tcPr>
+            <w:tcW w:type="dxa" w:w="3569"/>
+            <w:tcBorders>
+              <w:top w:val="single" w:color="BBBBBB" w:sz="4"/>
+              <w:left w:val="single" w:color="BBBBBB" w:sz="4"/>
+              <w:bottom w:val="single" w:color="BBBBBB" w:sz="4"/>
+              <w:right w:val="single" w:color="BBBBBB" w:sz="4"/>
+            </w:tcBorders>
+            <w:tcMar>
+              <w:top w:type="dxa" w:w="50"/>
+              <w:left w:type="dxa" w:w="90"/>
+              <w:bottom w:type="dxa" w:w="50"/>
+              <w:right w:type="dxa" w:w="90"/>
+            </w:tcMar>
+          </w:tcPr>
+          <w:p>
+            <w:r>
+              <w:rPr>
+                <w:rFonts w:ascii="Malgun Gothic" w:cs="Malgun Gothic" w:eastAsia="Malgun Gothic" w:hAnsi="Malgun Gothic"/>
+                <w:sz w:val="18"/>
+                <w:szCs w:val="18"/>
+              </w:rPr>
+              <w:t xml:space="preserve">FK owner_id, genre_tag_id</w:t>
+            </w:r>
+          </w:p>
+        </w:tc>
+      </w:tr>
+      <w:tr>
+        <w:trPr>
+          <w:cantSplit/>
+          <w:tblHeader w:val="off"/>
+        </w:trPr>
+        <w:tc>
+          <w:tcPr>
+            <w:tcW w:type="dxa" w:w="2062"/>
+            <w:tcBorders>
+              <w:top w:val="single" w:color="BBBBBB" w:sz="4"/>
+              <w:left w:val="single" w:color="BBBBBB" w:sz="4"/>
+              <w:bottom w:val="single" w:color="BBBBBB" w:sz="4"/>
+              <w:right w:val="single" w:color="BBBBBB" w:sz="4"/>
+            </w:tcBorders>
+            <w:tcMar>
+              <w:top w:type="dxa" w:w="50"/>
+              <w:left w:type="dxa" w:w="90"/>
+              <w:bottom w:type="dxa" w:w="50"/>
+              <w:right w:type="dxa" w:w="90"/>
+            </w:tcMar>
+          </w:tcPr>
+          <w:p>
+            <w:r>
+              <w:rPr>
+                <w:rFonts w:ascii="Consolas" w:cs="Consolas" w:eastAsia="Consolas" w:hAnsi="Consolas"/>
+                <w:color w:val="B4235A"/>
+                <w:sz w:val="18"/>
+                <w:szCs w:val="18"/>
+              </w:rPr>
               <w:t xml:space="preserve">user_settings</w:t>
             </w:r>
           </w:p>
         </w:tc>
         <w:tc>
           <w:tcPr>
-            <w:tcW w:type="dxa" w:w="3613"/>
+            <w:tcW w:type="dxa" w:w="4007"/>
             <w:tcBorders>
               <w:top w:val="single" w:color="BBBBBB" w:sz="4"/>
               <w:left w:val="single" w:color="BBBBBB" w:sz="4"/>
@@ -4783,7 +5008,7 @@
         </w:tc>
         <w:tc>
           <w:tcPr>
-            <w:tcW w:type="dxa" w:w="3935"/>
+            <w:tcW w:type="dxa" w:w="3569"/>
             <w:tcBorders>
               <w:top w:val="single" w:color="BBBBBB" w:sz="4"/>
               <w:left w:val="single" w:color="BBBBBB" w:sz="4"/>
@@ -6157,7 +6382,7 @@
       <w:r>
         <w:drawing>
           <wp:inline distT="0" distB="0" distL="0" distR="0">
-            <wp:extent cx="9610725" cy="3743325"/>
+            <wp:extent cx="9610725" cy="3362325"/>
             <wp:effectExtent t="0" r="0" b="0" l="0"/>
             <wp:docPr id="1" name="ERD" descr="Studio Nx ERD" title="ERD"/>
             <wp:cNvGraphicFramePr>
@@ -6182,7 +6407,7 @@
                   <pic:spPr bwMode="auto">
                     <a:xfrm>
                       <a:off x="0" y="0"/>
-                      <a:ext cx="9610725" cy="3743325"/>
+                      <a:ext cx="9610725" cy="3362325"/>
                     </a:xfrm>
                     <a:prstGeom prst="rect">
                       <a:avLst/>
@@ -6632,9 +6857,9 @@
         <w:tblLayout w:type="fixed"/>
       </w:tblPr>
       <w:tblGrid>
-        <w:gridCol w:w="1956"/>
-        <w:gridCol w:w="2749"/>
-        <w:gridCol w:w="4933"/>
+        <w:gridCol w:w="1936"/>
+        <w:gridCol w:w="3173"/>
+        <w:gridCol w:w="4529"/>
       </w:tblGrid>
       <w:tr>
         <w:trPr>
@@ -6643,7 +6868,7 @@
         </w:trPr>
         <w:tc>
           <w:tcPr>
-            <w:tcW w:type="dxa" w:w="1956"/>
+            <w:tcW w:type="dxa" w:w="1936"/>
             <w:tcBorders>
               <w:top w:val="single" w:color="BBBBBB" w:sz="4"/>
               <w:left w:val="single" w:color="BBBBBB" w:sz="4"/>
@@ -6673,7 +6898,7 @@
         </w:tc>
         <w:tc>
           <w:tcPr>
-            <w:tcW w:type="dxa" w:w="2749"/>
+            <w:tcW w:type="dxa" w:w="3173"/>
             <w:tcBorders>
               <w:top w:val="single" w:color="BBBBBB" w:sz="4"/>
               <w:left w:val="single" w:color="BBBBBB" w:sz="4"/>
@@ -6703,7 +6928,7 @@
         </w:tc>
         <w:tc>
           <w:tcPr>
-            <w:tcW w:type="dxa" w:w="4933"/>
+            <w:tcW w:type="dxa" w:w="4529"/>
             <w:tcBorders>
               <w:top w:val="single" w:color="BBBBBB" w:sz="4"/>
               <w:left w:val="single" w:color="BBBBBB" w:sz="4"/>
@@ -6739,7 +6964,7 @@
         </w:trPr>
         <w:tc>
           <w:tcPr>
-            <w:tcW w:type="dxa" w:w="1956"/>
+            <w:tcW w:type="dxa" w:w="1936"/>
             <w:tcBorders>
               <w:top w:val="single" w:color="BBBBBB" w:sz="4"/>
               <w:left w:val="single" w:color="BBBBBB" w:sz="4"/>
@@ -6767,7 +6992,7 @@
         </w:tc>
         <w:tc>
           <w:tcPr>
-            <w:tcW w:type="dxa" w:w="2749"/>
+            <w:tcW w:type="dxa" w:w="3173"/>
             <w:tcBorders>
               <w:top w:val="single" w:color="BBBBBB" w:sz="4"/>
               <w:left w:val="single" w:color="BBBBBB" w:sz="4"/>
@@ -6795,7 +7020,7 @@
         </w:tc>
         <w:tc>
           <w:tcPr>
-            <w:tcW w:type="dxa" w:w="4933"/>
+            <w:tcW w:type="dxa" w:w="4529"/>
             <w:tcBorders>
               <w:top w:val="single" w:color="BBBBBB" w:sz="4"/>
               <w:left w:val="single" w:color="BBBBBB" w:sz="4"/>
@@ -6828,7 +7053,7 @@
         </w:trPr>
         <w:tc>
           <w:tcPr>
-            <w:tcW w:type="dxa" w:w="1956"/>
+            <w:tcW w:type="dxa" w:w="1936"/>
             <w:tcBorders>
               <w:top w:val="single" w:color="BBBBBB" w:sz="4"/>
               <w:left w:val="single" w:color="BBBBBB" w:sz="4"/>
@@ -6856,7 +7081,7 @@
         </w:tc>
         <w:tc>
           <w:tcPr>
-            <w:tcW w:type="dxa" w:w="2749"/>
+            <w:tcW w:type="dxa" w:w="3173"/>
             <w:tcBorders>
               <w:top w:val="single" w:color="BBBBBB" w:sz="4"/>
               <w:left w:val="single" w:color="BBBBBB" w:sz="4"/>
@@ -6901,7 +7126,7 @@
         </w:tc>
         <w:tc>
           <w:tcPr>
-            <w:tcW w:type="dxa" w:w="4933"/>
+            <w:tcW w:type="dxa" w:w="4529"/>
             <w:tcBorders>
               <w:top w:val="single" w:color="BBBBBB" w:sz="4"/>
               <w:left w:val="single" w:color="BBBBBB" w:sz="4"/>
@@ -6934,7 +7159,7 @@
         </w:trPr>
         <w:tc>
           <w:tcPr>
-            <w:tcW w:type="dxa" w:w="1956"/>
+            <w:tcW w:type="dxa" w:w="1936"/>
             <w:tcBorders>
               <w:top w:val="single" w:color="BBBBBB" w:sz="4"/>
               <w:left w:val="single" w:color="BBBBBB" w:sz="4"/>
@@ -6962,7 +7187,7 @@
         </w:tc>
         <w:tc>
           <w:tcPr>
-            <w:tcW w:type="dxa" w:w="2749"/>
+            <w:tcW w:type="dxa" w:w="3173"/>
             <w:tcBorders>
               <w:top w:val="single" w:color="BBBBBB" w:sz="4"/>
               <w:left w:val="single" w:color="BBBBBB" w:sz="4"/>
@@ -6990,7 +7215,7 @@
         </w:tc>
         <w:tc>
           <w:tcPr>
-            <w:tcW w:type="dxa" w:w="4933"/>
+            <w:tcW w:type="dxa" w:w="4529"/>
             <w:tcBorders>
               <w:top w:val="single" w:color="BBBBBB" w:sz="4"/>
               <w:left w:val="single" w:color="BBBBBB" w:sz="4"/>
@@ -7023,7 +7248,7 @@
         </w:trPr>
         <w:tc>
           <w:tcPr>
-            <w:tcW w:type="dxa" w:w="1956"/>
+            <w:tcW w:type="dxa" w:w="1936"/>
             <w:tcBorders>
               <w:top w:val="single" w:color="BBBBBB" w:sz="4"/>
               <w:left w:val="single" w:color="BBBBBB" w:sz="4"/>
@@ -7045,13 +7270,13 @@
                 <w:sz w:val="18"/>
                 <w:szCs w:val="18"/>
               </w:rPr>
-              <w:t xml:space="preserve">reference_tracks</w:t>
-            </w:r>
-          </w:p>
-        </w:tc>
-        <w:tc>
-          <w:tcPr>
-            <w:tcW w:type="dxa" w:w="2749"/>
+              <w:t xml:space="preserve">tempo_changes</w:t>
+            </w:r>
+          </w:p>
+        </w:tc>
+        <w:tc>
+          <w:tcPr>
+            <w:tcW w:type="dxa" w:w="3173"/>
             <w:tcBorders>
               <w:top w:val="single" w:color="BBBBBB" w:sz="4"/>
               <w:left w:val="single" w:color="BBBBBB" w:sz="4"/>
@@ -7073,13 +7298,259 @@
                 <w:sz w:val="18"/>
                 <w:szCs w:val="18"/>
               </w:rPr>
+              <w:t xml:space="preserve">chk_tempo_bpm</w:t>
+            </w:r>
+            <w:r>
+              <w:rPr>
+                <w:rFonts w:ascii="Malgun Gothic" w:cs="Malgun Gothic" w:eastAsia="Malgun Gothic" w:hAnsi="Malgun Gothic"/>
+                <w:sz w:val="18"/>
+                <w:szCs w:val="18"/>
+              </w:rPr>
+              <w:t xml:space="preserve">, </w:t>
+            </w:r>
+            <w:r>
+              <w:rPr>
+                <w:rFonts w:ascii="Consolas" w:cs="Consolas" w:eastAsia="Consolas" w:hAnsi="Consolas"/>
+                <w:color w:val="B4235A"/>
+                <w:sz w:val="18"/>
+                <w:szCs w:val="18"/>
+              </w:rPr>
+              <w:t xml:space="preserve">chk_tempo_tick</w:t>
+            </w:r>
+          </w:p>
+        </w:tc>
+        <w:tc>
+          <w:tcPr>
+            <w:tcW w:type="dxa" w:w="4529"/>
+            <w:tcBorders>
+              <w:top w:val="single" w:color="BBBBBB" w:sz="4"/>
+              <w:left w:val="single" w:color="BBBBBB" w:sz="4"/>
+              <w:bottom w:val="single" w:color="BBBBBB" w:sz="4"/>
+              <w:right w:val="single" w:color="BBBBBB" w:sz="4"/>
+            </w:tcBorders>
+            <w:tcMar>
+              <w:top w:type="dxa" w:w="50"/>
+              <w:left w:type="dxa" w:w="90"/>
+              <w:bottom w:type="dxa" w:w="50"/>
+              <w:right w:type="dxa" w:w="90"/>
+            </w:tcMar>
+          </w:tcPr>
+          <w:p>
+            <w:r>
+              <w:rPr>
+                <w:rFonts w:ascii="Malgun Gothic" w:cs="Malgun Gothic" w:eastAsia="Malgun Gothic" w:hAnsi="Malgun Gothic"/>
+                <w:sz w:val="18"/>
+                <w:szCs w:val="18"/>
+              </w:rPr>
+              <w:t xml:space="preserve">템포 20 ~ 300, 위치 &gt; 0 (0 위치는 </w:t>
+            </w:r>
+            <w:r>
+              <w:rPr>
+                <w:rFonts w:ascii="Consolas" w:cs="Consolas" w:eastAsia="Consolas" w:hAnsi="Consolas"/>
+                <w:color w:val="B4235A"/>
+                <w:sz w:val="18"/>
+                <w:szCs w:val="18"/>
+              </w:rPr>
+              <w:t xml:space="preserve">projects.bpm</w:t>
+            </w:r>
+            <w:r>
+              <w:rPr>
+                <w:rFonts w:ascii="Malgun Gothic" w:cs="Malgun Gothic" w:eastAsia="Malgun Gothic" w:hAnsi="Malgun Gothic"/>
+                <w:sz w:val="18"/>
+                <w:szCs w:val="18"/>
+              </w:rPr>
+              <w:t xml:space="preserve">)</w:t>
+            </w:r>
+          </w:p>
+        </w:tc>
+      </w:tr>
+      <w:tr>
+        <w:trPr>
+          <w:cantSplit/>
+          <w:tblHeader w:val="off"/>
+        </w:trPr>
+        <w:tc>
+          <w:tcPr>
+            <w:tcW w:type="dxa" w:w="1936"/>
+            <w:tcBorders>
+              <w:top w:val="single" w:color="BBBBBB" w:sz="4"/>
+              <w:left w:val="single" w:color="BBBBBB" w:sz="4"/>
+              <w:bottom w:val="single" w:color="BBBBBB" w:sz="4"/>
+              <w:right w:val="single" w:color="BBBBBB" w:sz="4"/>
+            </w:tcBorders>
+            <w:tcMar>
+              <w:top w:type="dxa" w:w="50"/>
+              <w:left w:type="dxa" w:w="90"/>
+              <w:bottom w:type="dxa" w:w="50"/>
+              <w:right w:type="dxa" w:w="90"/>
+            </w:tcMar>
+          </w:tcPr>
+          <w:p>
+            <w:r>
+              <w:rPr>
+                <w:rFonts w:ascii="Consolas" w:cs="Consolas" w:eastAsia="Consolas" w:hAnsi="Consolas"/>
+                <w:color w:val="B4235A"/>
+                <w:sz w:val="18"/>
+                <w:szCs w:val="18"/>
+              </w:rPr>
+              <w:t xml:space="preserve">meter_changes</w:t>
+            </w:r>
+          </w:p>
+        </w:tc>
+        <w:tc>
+          <w:tcPr>
+            <w:tcW w:type="dxa" w:w="3173"/>
+            <w:tcBorders>
+              <w:top w:val="single" w:color="BBBBBB" w:sz="4"/>
+              <w:left w:val="single" w:color="BBBBBB" w:sz="4"/>
+              <w:bottom w:val="single" w:color="BBBBBB" w:sz="4"/>
+              <w:right w:val="single" w:color="BBBBBB" w:sz="4"/>
+            </w:tcBorders>
+            <w:tcMar>
+              <w:top w:type="dxa" w:w="50"/>
+              <w:left w:type="dxa" w:w="90"/>
+              <w:bottom w:type="dxa" w:w="50"/>
+              <w:right w:type="dxa" w:w="90"/>
+            </w:tcMar>
+          </w:tcPr>
+          <w:p>
+            <w:r>
+              <w:rPr>
+                <w:rFonts w:ascii="Consolas" w:cs="Consolas" w:eastAsia="Consolas" w:hAnsi="Consolas"/>
+                <w:color w:val="B4235A"/>
+                <w:sz w:val="18"/>
+                <w:szCs w:val="18"/>
+              </w:rPr>
+              <w:t xml:space="preserve">chk_meter_num</w:t>
+            </w:r>
+            <w:r>
+              <w:rPr>
+                <w:rFonts w:ascii="Malgun Gothic" w:cs="Malgun Gothic" w:eastAsia="Malgun Gothic" w:hAnsi="Malgun Gothic"/>
+                <w:sz w:val="18"/>
+                <w:szCs w:val="18"/>
+              </w:rPr>
+              <w:t xml:space="preserve">, </w:t>
+            </w:r>
+            <w:r>
+              <w:rPr>
+                <w:rFonts w:ascii="Consolas" w:cs="Consolas" w:eastAsia="Consolas" w:hAnsi="Consolas"/>
+                <w:color w:val="B4235A"/>
+                <w:sz w:val="18"/>
+                <w:szCs w:val="18"/>
+              </w:rPr>
+              <w:t xml:space="preserve">chk_meter_den</w:t>
+            </w:r>
+            <w:r>
+              <w:rPr>
+                <w:rFonts w:ascii="Malgun Gothic" w:cs="Malgun Gothic" w:eastAsia="Malgun Gothic" w:hAnsi="Malgun Gothic"/>
+                <w:sz w:val="18"/>
+                <w:szCs w:val="18"/>
+              </w:rPr>
+              <w:t xml:space="preserve">, </w:t>
+            </w:r>
+            <w:r>
+              <w:rPr>
+                <w:rFonts w:ascii="Consolas" w:cs="Consolas" w:eastAsia="Consolas" w:hAnsi="Consolas"/>
+                <w:color w:val="B4235A"/>
+                <w:sz w:val="18"/>
+                <w:szCs w:val="18"/>
+              </w:rPr>
+              <w:t xml:space="preserve">chk_meter_tick</w:t>
+            </w:r>
+          </w:p>
+        </w:tc>
+        <w:tc>
+          <w:tcPr>
+            <w:tcW w:type="dxa" w:w="4529"/>
+            <w:tcBorders>
+              <w:top w:val="single" w:color="BBBBBB" w:sz="4"/>
+              <w:left w:val="single" w:color="BBBBBB" w:sz="4"/>
+              <w:bottom w:val="single" w:color="BBBBBB" w:sz="4"/>
+              <w:right w:val="single" w:color="BBBBBB" w:sz="4"/>
+            </w:tcBorders>
+            <w:tcMar>
+              <w:top w:type="dxa" w:w="50"/>
+              <w:left w:type="dxa" w:w="90"/>
+              <w:bottom w:type="dxa" w:w="50"/>
+              <w:right w:type="dxa" w:w="90"/>
+            </w:tcMar>
+          </w:tcPr>
+          <w:p>
+            <w:r>
+              <w:rPr>
+                <w:rFonts w:ascii="Malgun Gothic" w:cs="Malgun Gothic" w:eastAsia="Malgun Gothic" w:hAnsi="Malgun Gothic"/>
+                <w:sz w:val="18"/>
+                <w:szCs w:val="18"/>
+              </w:rPr>
+              <w:t xml:space="preserve">분자 1 ~ 32, 분모 1·2·4·8·16·32, 위치 &gt; 0</w:t>
+            </w:r>
+          </w:p>
+        </w:tc>
+      </w:tr>
+      <w:tr>
+        <w:trPr>
+          <w:cantSplit/>
+          <w:tblHeader w:val="off"/>
+        </w:trPr>
+        <w:tc>
+          <w:tcPr>
+            <w:tcW w:type="dxa" w:w="1936"/>
+            <w:tcBorders>
+              <w:top w:val="single" w:color="BBBBBB" w:sz="4"/>
+              <w:left w:val="single" w:color="BBBBBB" w:sz="4"/>
+              <w:bottom w:val="single" w:color="BBBBBB" w:sz="4"/>
+              <w:right w:val="single" w:color="BBBBBB" w:sz="4"/>
+            </w:tcBorders>
+            <w:tcMar>
+              <w:top w:type="dxa" w:w="50"/>
+              <w:left w:type="dxa" w:w="90"/>
+              <w:bottom w:type="dxa" w:w="50"/>
+              <w:right w:type="dxa" w:w="90"/>
+            </w:tcMar>
+          </w:tcPr>
+          <w:p>
+            <w:r>
+              <w:rPr>
+                <w:rFonts w:ascii="Consolas" w:cs="Consolas" w:eastAsia="Consolas" w:hAnsi="Consolas"/>
+                <w:color w:val="B4235A"/>
+                <w:sz w:val="18"/>
+                <w:szCs w:val="18"/>
+              </w:rPr>
+              <w:t xml:space="preserve">reference_tracks</w:t>
+            </w:r>
+          </w:p>
+        </w:tc>
+        <w:tc>
+          <w:tcPr>
+            <w:tcW w:type="dxa" w:w="3173"/>
+            <w:tcBorders>
+              <w:top w:val="single" w:color="BBBBBB" w:sz="4"/>
+              <w:left w:val="single" w:color="BBBBBB" w:sz="4"/>
+              <w:bottom w:val="single" w:color="BBBBBB" w:sz="4"/>
+              <w:right w:val="single" w:color="BBBBBB" w:sz="4"/>
+            </w:tcBorders>
+            <w:tcMar>
+              <w:top w:type="dxa" w:w="50"/>
+              <w:left w:type="dxa" w:w="90"/>
+              <w:bottom w:type="dxa" w:w="50"/>
+              <w:right w:type="dxa" w:w="90"/>
+            </w:tcMar>
+          </w:tcPr>
+          <w:p>
+            <w:r>
+              <w:rPr>
+                <w:rFonts w:ascii="Consolas" w:cs="Consolas" w:eastAsia="Consolas" w:hAnsi="Consolas"/>
+                <w:color w:val="B4235A"/>
+                <w:sz w:val="18"/>
+                <w:szCs w:val="18"/>
+              </w:rPr>
               <w:t xml:space="preserve">chk_ref_source</w:t>
             </w:r>
           </w:p>
         </w:tc>
         <w:tc>
           <w:tcPr>
-            <w:tcW w:type="dxa" w:w="4933"/>
+            <w:tcW w:type="dxa" w:w="4529"/>
             <w:tcBorders>
               <w:top w:val="single" w:color="BBBBBB" w:sz="4"/>
               <w:left w:val="single" w:color="BBBBBB" w:sz="4"/>
@@ -7136,8 +7607,8 @@
         <w:tblLayout w:type="fixed"/>
       </w:tblPr>
       <w:tblGrid>
-        <w:gridCol w:w="2670"/>
-        <w:gridCol w:w="6968"/>
+        <w:gridCol w:w="2410"/>
+        <w:gridCol w:w="7228"/>
       </w:tblGrid>
       <w:tr>
         <w:trPr>
@@ -7146,7 +7617,7 @@
         </w:trPr>
         <w:tc>
           <w:tcPr>
-            <w:tcW w:type="dxa" w:w="2670"/>
+            <w:tcW w:type="dxa" w:w="2410"/>
             <w:tcBorders>
               <w:top w:val="single" w:color="BBBBBB" w:sz="4"/>
               <w:left w:val="single" w:color="BBBBBB" w:sz="4"/>
@@ -7176,7 +7647,7 @@
         </w:tc>
         <w:tc>
           <w:tcPr>
-            <w:tcW w:type="dxa" w:w="6968"/>
+            <w:tcW w:type="dxa" w:w="7228"/>
             <w:tcBorders>
               <w:top w:val="single" w:color="BBBBBB" w:sz="4"/>
               <w:left w:val="single" w:color="BBBBBB" w:sz="4"/>
@@ -7212,7 +7683,7 @@
         </w:trPr>
         <w:tc>
           <w:tcPr>
-            <w:tcW w:type="dxa" w:w="2670"/>
+            <w:tcW w:type="dxa" w:w="2410"/>
             <w:tcBorders>
               <w:top w:val="single" w:color="BBBBBB" w:sz="4"/>
               <w:left w:val="single" w:color="BBBBBB" w:sz="4"/>
@@ -7239,28 +7710,28 @@
         </w:tc>
         <w:tc>
           <w:tcPr>
-            <w:tcW w:type="dxa" w:w="6968"/>
-            <w:tcBorders>
-              <w:top w:val="single" w:color="BBBBBB" w:sz="4"/>
-              <w:left w:val="single" w:color="BBBBBB" w:sz="4"/>
-              <w:bottom w:val="single" w:color="BBBBBB" w:sz="4"/>
-              <w:right w:val="single" w:color="BBBBBB" w:sz="4"/>
-            </w:tcBorders>
-            <w:tcMar>
-              <w:top w:type="dxa" w:w="50"/>
-              <w:left w:type="dxa" w:w="90"/>
-              <w:bottom w:type="dxa" w:w="50"/>
-              <w:right w:type="dxa" w:w="90"/>
-            </w:tcMar>
-          </w:tcPr>
-          <w:p>
-            <w:r>
-              <w:rPr>
-                <w:rFonts w:ascii="Malgun Gothic" w:cs="Malgun Gothic" w:eastAsia="Malgun Gothic" w:hAnsi="Malgun Gothic"/>
-                <w:sz w:val="18"/>
-                <w:szCs w:val="18"/>
-              </w:rPr>
-              <w:t xml:space="preserve">트랙·클립·패턴·노트·디바이스·오토메이션·씬·멤버·작업 세션·초대·이력·채팅·코멘트·스냅샷·출력이 함께 삭제 (CASCADE)</w:t>
+            <w:tcW w:type="dxa" w:w="7228"/>
+            <w:tcBorders>
+              <w:top w:val="single" w:color="BBBBBB" w:sz="4"/>
+              <w:left w:val="single" w:color="BBBBBB" w:sz="4"/>
+              <w:bottom w:val="single" w:color="BBBBBB" w:sz="4"/>
+              <w:right w:val="single" w:color="BBBBBB" w:sz="4"/>
+            </w:tcBorders>
+            <w:tcMar>
+              <w:top w:type="dxa" w:w="50"/>
+              <w:left w:type="dxa" w:w="90"/>
+              <w:bottom w:type="dxa" w:w="50"/>
+              <w:right w:type="dxa" w:w="90"/>
+            </w:tcMar>
+          </w:tcPr>
+          <w:p>
+            <w:r>
+              <w:rPr>
+                <w:rFonts w:ascii="Malgun Gothic" w:cs="Malgun Gothic" w:eastAsia="Malgun Gothic" w:hAnsi="Malgun Gothic"/>
+                <w:sz w:val="18"/>
+                <w:szCs w:val="18"/>
+              </w:rPr>
+              <w:t xml:space="preserve">트랙·클립·패턴·노트·디바이스·오토메이션·템포/박자 변경점·씬·멤버·작업 세션·초대·이력·채팅·코멘트·스냅샷·출력이 함께 삭제 (CASCADE)</w:t>
             </w:r>
           </w:p>
         </w:tc>
@@ -7272,7 +7743,7 @@
         </w:trPr>
         <w:tc>
           <w:tcPr>
-            <w:tcW w:type="dxa" w:w="2670"/>
+            <w:tcW w:type="dxa" w:w="2410"/>
             <w:tcBorders>
               <w:top w:val="single" w:color="BBBBBB" w:sz="4"/>
               <w:left w:val="single" w:color="BBBBBB" w:sz="4"/>
@@ -7299,7 +7770,7 @@
         </w:tc>
         <w:tc>
           <w:tcPr>
-            <w:tcW w:type="dxa" w:w="6968"/>
+            <w:tcW w:type="dxa" w:w="7228"/>
             <w:tcBorders>
               <w:top w:val="single" w:color="BBBBBB" w:sz="4"/>
               <w:left w:val="single" w:color="BBBBBB" w:sz="4"/>
@@ -7341,7 +7812,7 @@
         </w:trPr>
         <w:tc>
           <w:tcPr>
-            <w:tcW w:type="dxa" w:w="2670"/>
+            <w:tcW w:type="dxa" w:w="2410"/>
             <w:tcBorders>
               <w:top w:val="single" w:color="BBBBBB" w:sz="4"/>
               <w:left w:val="single" w:color="BBBBBB" w:sz="4"/>
@@ -7368,7 +7839,7 @@
         </w:tc>
         <w:tc>
           <w:tcPr>
-            <w:tcW w:type="dxa" w:w="6968"/>
+            <w:tcW w:type="dxa" w:w="7228"/>
             <w:tcBorders>
               <w:top w:val="single" w:color="BBBBBB" w:sz="4"/>
               <w:left w:val="single" w:color="BBBBBB" w:sz="4"/>
@@ -7401,7 +7872,7 @@
         </w:trPr>
         <w:tc>
           <w:tcPr>
-            <w:tcW w:type="dxa" w:w="2670"/>
+            <w:tcW w:type="dxa" w:w="2410"/>
             <w:tcBorders>
               <w:top w:val="single" w:color="BBBBBB" w:sz="4"/>
               <w:left w:val="single" w:color="BBBBBB" w:sz="4"/>
@@ -7428,7 +7899,7 @@
         </w:tc>
         <w:tc>
           <w:tcPr>
-            <w:tcW w:type="dxa" w:w="6968"/>
+            <w:tcW w:type="dxa" w:w="7228"/>
             <w:tcBorders>
               <w:top w:val="single" w:color="BBBBBB" w:sz="4"/>
               <w:left w:val="single" w:color="BBBBBB" w:sz="4"/>
@@ -8087,6 +8558,120 @@
                 <w:szCs w:val="18"/>
               </w:rPr>
               <w:t xml:space="preserve">2026-10-05 이전에 01을 실행한 DB (로컬 DB 실행 완료)</w:t>
+            </w:r>
+          </w:p>
+        </w:tc>
+      </w:tr>
+      <w:tr>
+        <w:trPr>
+          <w:cantSplit/>
+          <w:tblHeader w:val="off"/>
+        </w:trPr>
+        <w:tc>
+          <w:tcPr>
+            <w:tcW w:type="dxa" w:w="3589"/>
+            <w:tcBorders>
+              <w:top w:val="single" w:color="BBBBBB" w:sz="4"/>
+              <w:left w:val="single" w:color="BBBBBB" w:sz="4"/>
+              <w:bottom w:val="single" w:color="BBBBBB" w:sz="4"/>
+              <w:right w:val="single" w:color="BBBBBB" w:sz="4"/>
+            </w:tcBorders>
+            <w:tcMar>
+              <w:top w:type="dxa" w:w="50"/>
+              <w:left w:type="dxa" w:w="90"/>
+              <w:bottom w:type="dxa" w:w="50"/>
+              <w:right w:type="dxa" w:w="90"/>
+            </w:tcMar>
+          </w:tcPr>
+          <w:p>
+            <w:r>
+              <w:rPr>
+                <w:rFonts w:ascii="Consolas" w:cs="Consolas" w:eastAsia="Consolas" w:hAnsi="Consolas"/>
+                <w:color w:val="B4235A"/>
+                <w:sz w:val="18"/>
+                <w:szCs w:val="18"/>
+              </w:rPr>
+              <w:t xml:space="preserve">migrations/2026-10-05_tempo_meter_changes.sql</w:t>
+            </w:r>
+          </w:p>
+        </w:tc>
+        <w:tc>
+          <w:tcPr>
+            <w:tcW w:type="dxa" w:w="3589"/>
+            <w:tcBorders>
+              <w:top w:val="single" w:color="BBBBBB" w:sz="4"/>
+              <w:left w:val="single" w:color="BBBBBB" w:sz="4"/>
+              <w:bottom w:val="single" w:color="BBBBBB" w:sz="4"/>
+              <w:right w:val="single" w:color="BBBBBB" w:sz="4"/>
+            </w:tcBorders>
+            <w:tcMar>
+              <w:top w:type="dxa" w:w="50"/>
+              <w:left w:type="dxa" w:w="90"/>
+              <w:bottom w:type="dxa" w:w="50"/>
+              <w:right w:type="dxa" w:w="90"/>
+            </w:tcMar>
+          </w:tcPr>
+          <w:p>
+            <w:r>
+              <w:rPr>
+                <w:rFonts w:ascii="Consolas" w:cs="Consolas" w:eastAsia="Consolas" w:hAnsi="Consolas"/>
+                <w:color w:val="B4235A"/>
+                <w:sz w:val="18"/>
+                <w:szCs w:val="18"/>
+              </w:rPr>
+              <w:t xml:space="preserve">tempo_changes</w:t>
+            </w:r>
+            <w:r>
+              <w:rPr>
+                <w:rFonts w:ascii="Malgun Gothic" w:cs="Malgun Gothic" w:eastAsia="Malgun Gothic" w:hAnsi="Malgun Gothic"/>
+                <w:sz w:val="18"/>
+                <w:szCs w:val="18"/>
+              </w:rPr>
+              <w:t xml:space="preserve">·</w:t>
+            </w:r>
+            <w:r>
+              <w:rPr>
+                <w:rFonts w:ascii="Consolas" w:cs="Consolas" w:eastAsia="Consolas" w:hAnsi="Consolas"/>
+                <w:color w:val="B4235A"/>
+                <w:sz w:val="18"/>
+                <w:szCs w:val="18"/>
+              </w:rPr>
+              <w:t xml:space="preserve">meter_changes</w:t>
+            </w:r>
+            <w:r>
+              <w:rPr>
+                <w:rFonts w:ascii="Malgun Gothic" w:cs="Malgun Gothic" w:eastAsia="Malgun Gothic" w:hAnsi="Malgun Gothic"/>
+                <w:sz w:val="18"/>
+                <w:szCs w:val="18"/>
+              </w:rPr>
+              <w:t xml:space="preserve"> 생성 (곡 중간 BPM 변속·박자 변경)</w:t>
+            </w:r>
+          </w:p>
+        </w:tc>
+        <w:tc>
+          <w:tcPr>
+            <w:tcW w:type="dxa" w:w="2460"/>
+            <w:tcBorders>
+              <w:top w:val="single" w:color="BBBBBB" w:sz="4"/>
+              <w:left w:val="single" w:color="BBBBBB" w:sz="4"/>
+              <w:bottom w:val="single" w:color="BBBBBB" w:sz="4"/>
+              <w:right w:val="single" w:color="BBBBBB" w:sz="4"/>
+            </w:tcBorders>
+            <w:tcMar>
+              <w:top w:type="dxa" w:w="50"/>
+              <w:left w:type="dxa" w:w="90"/>
+              <w:bottom w:type="dxa" w:w="50"/>
+              <w:right w:type="dxa" w:w="90"/>
+            </w:tcMar>
+          </w:tcPr>
+          <w:p>
+            <w:r>
+              <w:rPr>
+                <w:rFonts w:ascii="Malgun Gothic" w:cs="Malgun Gothic" w:eastAsia="Malgun Gothic" w:hAnsi="Malgun Gothic"/>
+                <w:sz w:val="18"/>
+                <w:szCs w:val="18"/>
+              </w:rPr>
+              <w:t xml:space="preserve">2026-10-05 이전에 02를 실행한 DB</w:t>
             </w:r>
           </w:p>
         </w:tc>

</xml_diff>